<commit_message>
docs: greatly expand Strapi guide — beginner-friendly, 11 illustrations, full reference
- Step-by-step instructions and plain-language explanations for a first-time user
  (field types, Save vs Publish, per-collection how-to).
- 11 Strapi-style mockup illustrations incl. a 7-disciplines-to-12-cards ranking
  diagram and a site-area-to-collection map.
- Complete reference appendix: all 108 record discipline strings grouped by event,
  record type codes, and every dropdown's allowed values.

Co-Authored-By: Claude Opus 4.8 <noreply@anthropic.com>
</commit_message>
<xml_diff>
--- a/public/ESC-Strapi-Instrukciya.docx
+++ b/public/ESC-Strapi-Instrukciya.docx
@@ -3,9 +3,6 @@
 <w:document xmlns:wpc="http://schemas.microsoft.com/office/word/2010/wordprocessingCanvas" xmlns:mo="http://schemas.microsoft.com/office/mac/office/2008/main" xmlns:mc="http://schemas.openxmlformats.org/markup-compatibility/2006" xmlns:mv="urn:schemas-microsoft-com:mac:vml" xmlns:o="urn:schemas-microsoft-com:office:office" xmlns:r="http://schemas.openxmlformats.org/officeDocument/2006/relationships" xmlns:m="http://schemas.openxmlformats.org/officeDocument/2006/math" xmlns:v="urn:schemas-microsoft-com:vml" xmlns:wp14="http://schemas.microsoft.com/office/word/2010/wordprocessingDrawing" xmlns:wp="http://schemas.openxmlformats.org/drawingml/2006/wordprocessingDrawing" xmlns:w10="urn:schemas-microsoft-com:office:word" xmlns:w="http://schemas.openxmlformats.org/wordprocessingml/2006/main" xmlns:w14="http://schemas.microsoft.com/office/word/2010/wordml" xmlns:wpg="http://schemas.microsoft.com/office/word/2010/wordprocessingGroup" xmlns:wpi="http://schemas.microsoft.com/office/word/2010/wordprocessingInk" xmlns:wne="http://schemas.microsoft.com/office/word/2006/wordml" xmlns:wps="http://schemas.microsoft.com/office/word/2010/wordprocessingShape" mc:Ignorable="w14 wp14">
   <w:body>
     <w:p>
-      <w:pPr>
-        <w:jc w:val="left"/>
-      </w:pPr>
       <w:r>
         <w:rPr>
           <w:b/>
@@ -31,7 +28,7 @@
           <w:color w:val="555566"/>
           <w:sz w:val="28"/>
         </w:rPr>
-        <w:t>Заполнение и публикация данных в системе Strapi</w:t>
+        <w:t>Как добавлять и обновлять данные в системе Strapi</w:t>
       </w:r>
     </w:p>
     <w:p>
@@ -45,7 +42,7 @@
           <w:color w:val="555566"/>
           <w:sz w:val="22"/>
         </w:rPr>
-        <w:t>Документ описывает, как добавлять и обновлять материалы сайта: новости, события, результаты, рекорды, документы, федерации и разделы «О нас». Все действия выполняются в административной панели Strapi, в разделе Content Manager.</w:t>
+        <w:t>Это руководство написано так, чтобы им мог пользоваться человек, впервые открывший систему. Каждый раздел объясняет, что делает та или иная часть, какие поля заполнять и как результат выглядит на сайте. В конце — полный справочник со всеми допустимыми значениями.</w:t>
       </w:r>
     </w:p>
     <w:p>
@@ -58,7 +55,7 @@
           <w:color w:val="0B2A4A"/>
           <w:sz w:val="34"/>
         </w:rPr>
-        <w:t>1. Общие сведения</w:t>
+        <w:t>1. С чего начать</w:t>
       </w:r>
     </w:p>
     <w:p>
@@ -71,7 +68,65 @@
           <w:i w:val="0"/>
           <w:sz w:val="22"/>
         </w:rPr>
-        <w:t>Содержимое сайта хранится в системе управления контентом Strapi. Каждый тип материала (новость, событие, документ и т. д.) — это отдельная коллекция. Работа ведётся через раздел Content Manager: слева выбирается коллекция, открывается список записей, запись создаётся кнопкой «Create an entry» или редактируется по клику.</w:t>
+        <w:t>Весь текст, фотографии, документы и таблицы, которые видны на сайте, хранятся в отдельной системе — Strapi. Это «панель управления», где содержимое разложено по коллекциям.</w:t>
+      </w:r>
+    </w:p>
+    <w:p>
+      <w:pPr>
+        <w:pStyle w:val="ListBullet"/>
+        <w:spacing w:after="40"/>
+      </w:pPr>
+      <w:r>
+        <w:rPr>
+          <w:b/>
+        </w:rPr>
+        <w:t xml:space="preserve">Коллекция </w:t>
+      </w:r>
+      <w:r>
+        <w:t>— это тип материала: например, «News Item» (новости), «Event» (события), «Document» (документы). Каждая коллекция похожа на таблицу или папку однотипных карточек.</w:t>
+      </w:r>
+    </w:p>
+    <w:p>
+      <w:pPr>
+        <w:pStyle w:val="ListBullet"/>
+        <w:spacing w:after="40"/>
+      </w:pPr>
+      <w:r>
+        <w:rPr>
+          <w:b/>
+        </w:rPr>
+        <w:t xml:space="preserve">Запись </w:t>
+      </w:r>
+      <w:r>
+        <w:t>— это одна карточка внутри коллекции: одна новость, одно событие, один документ.</w:t>
+      </w:r>
+    </w:p>
+    <w:p>
+      <w:pPr>
+        <w:pStyle w:val="ListBullet"/>
+        <w:spacing w:after="40"/>
+      </w:pPr>
+      <w:r>
+        <w:rPr>
+          <w:b/>
+        </w:rPr>
+        <w:t xml:space="preserve">Поле </w:t>
+      </w:r>
+      <w:r>
+        <w:t>— это отдельная строка внутри записи: заголовок, дата, картинка и т. д.</w:t>
+      </w:r>
+    </w:p>
+    <w:p>
+      <w:pPr>
+        <w:spacing w:after="120"/>
+      </w:pPr>
+      <w:r>
+        <w:rPr>
+          <w:b w:val="0"/>
+          <w:i w:val="0"/>
+          <w:sz w:val="22"/>
+        </w:rPr>
+        <w:t>Работа всегда идёт в разделе Content Manager (в левом меню). Слева — список коллекций, справа — форма выбранной записи, сверху справа — кнопки Save и Publish и текущий статус записи.</w:t>
       </w:r>
     </w:p>
     <w:p>
@@ -125,7 +180,20 @@
           <w:color w:val="555566"/>
           <w:sz w:val="18"/>
         </w:rPr>
-        <w:t>Content Manager: слева — коллекции, справа — форма записи, вверху — статус и кнопки Save / Publish.</w:t>
+        <w:t>Раздел Content Manager: слева коллекции, в центре форма записи, вверху статус и кнопки Save / Publish.</w:t>
+      </w:r>
+    </w:p>
+    <w:p>
+      <w:pPr>
+        <w:pStyle w:val="Heading2"/>
+        <w:spacing w:before="200" w:after="40"/>
+      </w:pPr>
+      <w:r>
+        <w:rPr>
+          <w:color w:val="1D4E89"/>
+          <w:sz w:val="27"/>
+        </w:rPr>
+        <w:t>Что на какой странице сайта показывается</w:t>
       </w:r>
     </w:p>
     <w:p>
@@ -138,67 +206,164 @@
           <w:i w:val="0"/>
           <w:sz w:val="22"/>
         </w:rPr>
-        <w:t>Порядок работы с любой записью одинаков:</w:t>
+        <w:t>Каждая страница сайта собирается из одной или нескольких коллекций. Эта схема помогает понять, куда идти, если нужно что-то изменить.</w:t>
       </w:r>
     </w:p>
     <w:p>
       <w:pPr>
-        <w:pStyle w:val="ListBullet"/>
+        <w:jc w:val="center"/>
+      </w:pPr>
+      <w:r>
+        <w:drawing>
+          <wp:inline xmlns:a="http://schemas.openxmlformats.org/drawingml/2006/main" xmlns:pic="http://schemas.openxmlformats.org/drawingml/2006/picture">
+            <wp:extent cx="5760720" cy="2746629"/>
+            <wp:docPr id="2" name="Picture 2"/>
+            <wp:cNvGraphicFramePr>
+              <a:graphicFrameLocks noChangeAspect="1"/>
+            </wp:cNvGraphicFramePr>
+            <a:graphic>
+              <a:graphicData uri="http://schemas.openxmlformats.org/drawingml/2006/picture">
+                <pic:pic>
+                  <pic:nvPicPr>
+                    <pic:cNvPr id="0" name="img_m11.png"/>
+                    <pic:cNvPicPr/>
+                  </pic:nvPicPr>
+                  <pic:blipFill>
+                    <a:blip r:embed="rId10"/>
+                    <a:stretch>
+                      <a:fillRect/>
+                    </a:stretch>
+                  </pic:blipFill>
+                  <pic:spPr>
+                    <a:xfrm>
+                      <a:off x="0" y="0"/>
+                      <a:ext cx="5760720" cy="2746629"/>
+                    </a:xfrm>
+                    <a:prstGeom prst="rect"/>
+                  </pic:spPr>
+                </pic:pic>
+              </a:graphicData>
+            </a:graphic>
+          </wp:inline>
+        </w:drawing>
+      </w:r>
+    </w:p>
+    <w:p>
+      <w:pPr>
+        <w:spacing w:after="200"/>
+        <w:jc w:val="center"/>
+      </w:pPr>
+      <w:r>
+        <w:rPr>
+          <w:b w:val="0"/>
+          <w:i/>
+          <w:color w:val="555566"/>
+          <w:sz w:val="18"/>
+        </w:rPr>
+        <w:t>Соответствие: страница сайта → коллекции, из которых она берёт данные.</w:t>
+      </w:r>
+    </w:p>
+    <w:p>
+      <w:pPr>
+        <w:pStyle w:val="Heading2"/>
+        <w:spacing w:before="200" w:after="40"/>
+      </w:pPr>
+      <w:r>
+        <w:rPr>
+          <w:color w:val="1D4E89"/>
+          <w:sz w:val="27"/>
+        </w:rPr>
+        <w:t>Как создать или изменить любую запись — общий порядок</w:t>
+      </w:r>
+    </w:p>
+    <w:p>
+      <w:pPr>
+        <w:pStyle w:val="ListNumber"/>
         <w:spacing w:after="40"/>
       </w:pPr>
       <w:r>
         <w:rPr>
           <w:b/>
         </w:rPr>
-        <w:t xml:space="preserve">Открыть коллекцию </w:t>
+        <w:t xml:space="preserve">Откройте раздел Content Manager </w:t>
       </w:r>
       <w:r>
-        <w:t>в списке Content Manager слева.</w:t>
+        <w:t>в левом меню.</w:t>
       </w:r>
     </w:p>
     <w:p>
       <w:pPr>
-        <w:pStyle w:val="ListBullet"/>
+        <w:pStyle w:val="ListNumber"/>
         <w:spacing w:after="40"/>
       </w:pPr>
       <w:r>
         <w:rPr>
           <w:b/>
         </w:rPr>
-        <w:t xml:space="preserve">Создать или выбрать запись </w:t>
+        <w:t xml:space="preserve">Выберите нужную коллекцию </w:t>
       </w:r>
       <w:r>
-        <w:t>— «Create an entry» для новой, либо клик по существующей.</w:t>
+        <w:t>в списке слева (например, News Item).</w:t>
       </w:r>
     </w:p>
     <w:p>
       <w:pPr>
-        <w:pStyle w:val="ListBullet"/>
+        <w:pStyle w:val="ListNumber"/>
         <w:spacing w:after="40"/>
       </w:pPr>
       <w:r>
         <w:rPr>
           <w:b/>
         </w:rPr>
-        <w:t xml:space="preserve">Заполнить поля </w:t>
+        <w:t xml:space="preserve">Создайте новую запись </w:t>
       </w:r>
       <w:r>
-        <w:t>— обязательные помечены красной звёздочкой (∗).</w:t>
+        <w:t>кнопкой «Create an entry» вверху справа — или нажмите на существующую запись, чтобы её изменить.</w:t>
       </w:r>
     </w:p>
     <w:p>
       <w:pPr>
-        <w:pStyle w:val="ListBullet"/>
+        <w:pStyle w:val="ListNumber"/>
         <w:spacing w:after="40"/>
       </w:pPr>
       <w:r>
         <w:rPr>
           <w:b/>
         </w:rPr>
-        <w:t xml:space="preserve">Сохранить и опубликовать </w:t>
+        <w:t xml:space="preserve">Заполните поля. </w:t>
       </w:r>
       <w:r>
-        <w:t>— кнопка Save сохраняет черновик, Publish выкладывает на сайт.</w:t>
+        <w:t>Поля со звёздочкой (∗) обязательны — без них сохранить не получится.</w:t>
+      </w:r>
+    </w:p>
+    <w:p>
+      <w:pPr>
+        <w:pStyle w:val="ListNumber"/>
+        <w:spacing w:after="40"/>
+      </w:pPr>
+      <w:r>
+        <w:rPr>
+          <w:b/>
+        </w:rPr>
+        <w:t xml:space="preserve">Нажмите Save, </w:t>
+      </w:r>
+      <w:r>
+        <w:t>чтобы сохранить черновик.</w:t>
+      </w:r>
+    </w:p>
+    <w:p>
+      <w:pPr>
+        <w:pStyle w:val="ListNumber"/>
+        <w:spacing w:after="40"/>
+      </w:pPr>
+      <w:r>
+        <w:rPr>
+          <w:b/>
+        </w:rPr>
+        <w:t xml:space="preserve">Нажмите Publish, </w:t>
+      </w:r>
+      <w:r>
+        <w:t>чтобы запись появилась на сайте. Без этого шага её на сайте не будет.</w:t>
       </w:r>
     </w:p>
     <w:p>
@@ -211,20 +376,7 @@
           <w:color w:val="0B2A4A"/>
           <w:sz w:val="34"/>
         </w:rPr>
-        <w:t>2. Основные правила</w:t>
-      </w:r>
-    </w:p>
-    <w:p>
-      <w:pPr>
-        <w:pStyle w:val="Heading2"/>
-        <w:spacing w:before="200" w:after="40"/>
-      </w:pPr>
-      <w:r>
-        <w:rPr>
-          <w:color w:val="1D4E89"/>
-          <w:sz w:val="27"/>
-        </w:rPr>
-        <w:t>Черновик, публикация и статусы</w:t>
+        <w:t>2. Сохранение и публикация — самое важное</w:t>
       </w:r>
     </w:p>
     <w:p>
@@ -237,7 +389,7 @@
           <w:i w:val="0"/>
           <w:sz w:val="22"/>
         </w:rPr>
-        <w:t>Большинство коллекций поддерживают черновики. У записи есть один из трёх статусов:</w:t>
+        <w:t>Это самый частый источник недоразумений, поэтому прочитайте внимательно. У большинства записей есть черновик и опубликованная версия — это две разные вещи.</w:t>
       </w:r>
     </w:p>
     <w:p>
@@ -248,7 +400,7 @@
         <w:drawing>
           <wp:inline xmlns:a="http://schemas.openxmlformats.org/drawingml/2006/main" xmlns:pic="http://schemas.openxmlformats.org/drawingml/2006/picture">
             <wp:extent cx="5760720" cy="1512189"/>
-            <wp:docPr id="2" name="Picture 2"/>
+            <wp:docPr id="3" name="Picture 3"/>
             <wp:cNvGraphicFramePr>
               <a:graphicFrameLocks noChangeAspect="1"/>
             </wp:cNvGraphicFramePr>
@@ -260,7 +412,7 @@
                     <pic:cNvPicPr/>
                   </pic:nvPicPr>
                   <pic:blipFill>
-                    <a:blip r:embed="rId10"/>
+                    <a:blip r:embed="rId11"/>
                     <a:stretch>
                       <a:fillRect/>
                     </a:stretch>
@@ -291,7 +443,21 @@
           <w:color w:val="555566"/>
           <w:sz w:val="18"/>
         </w:rPr>
-        <w:t>Жизненный цикл записи: Draft → Published → Modified.</w:t>
+        <w:t>Три статуса записи: Draft (черновик), Published (опубликовано), Modified (есть неопубликованные правки).</w:t>
+      </w:r>
+    </w:p>
+    <w:p>
+      <w:pPr>
+        <w:pStyle w:val="Heading3"/>
+        <w:spacing w:before="160" w:after="20"/>
+      </w:pPr>
+      <w:r>
+        <w:rPr>
+          <w:b/>
+          <w:color w:val="2A2A44"/>
+          <w:sz w:val="23"/>
+        </w:rPr>
+        <w:t>Две кнопки</w:t>
       </w:r>
     </w:p>
     <w:p>
@@ -303,10 +469,10 @@
         <w:rPr>
           <w:b/>
         </w:rPr>
-        <w:t xml:space="preserve">Draft </w:t>
+        <w:t xml:space="preserve">Save </w:t>
       </w:r>
       <w:r>
-        <w:t>— запись создана, но на сайте её нет. Требуется нажать Publish.</w:t>
+        <w:t>— сохраняет черновик. На сайте после этого НИЧЕГО не меняется. Черновик нужен, чтобы не потерять работу.</w:t>
       </w:r>
     </w:p>
     <w:p>
@@ -318,10 +484,24 @@
         <w:rPr>
           <w:b/>
         </w:rPr>
-        <w:t xml:space="preserve">Published </w:t>
+        <w:t xml:space="preserve">Publish </w:t>
       </w:r>
       <w:r>
-        <w:t>— запись опубликована; черновик и опубликованная версия совпадают.</w:t>
+        <w:t>— публикует запись на сайт. Только после этого изменения видны посетителям.</w:t>
+      </w:r>
+    </w:p>
+    <w:p>
+      <w:pPr>
+        <w:pStyle w:val="Heading3"/>
+        <w:spacing w:before="160" w:after="20"/>
+      </w:pPr>
+      <w:r>
+        <w:rPr>
+          <w:b/>
+          <w:color w:val="2A2A44"/>
+          <w:sz w:val="23"/>
+        </w:rPr>
+        <w:t>Три статуса (цветная метка вверху записи)</w:t>
       </w:r>
     </w:p>
     <w:p>
@@ -333,10 +513,40 @@
         <w:rPr>
           <w:b/>
         </w:rPr>
-        <w:t xml:space="preserve">Modified </w:t>
+        <w:t xml:space="preserve">Draft (серый) </w:t>
       </w:r>
       <w:r>
-        <w:t>— запись опубликована, но после этого отредактирована. На сайте показывается прежняя версия, пока не нажать Publish повторно.</w:t>
+        <w:t>— запись создана, но на сайте её нет. Нажмите Publish.</w:t>
+      </w:r>
+    </w:p>
+    <w:p>
+      <w:pPr>
+        <w:pStyle w:val="ListBullet"/>
+        <w:spacing w:after="40"/>
+      </w:pPr>
+      <w:r>
+        <w:rPr>
+          <w:b/>
+        </w:rPr>
+        <w:t xml:space="preserve">Published (зелёный) </w:t>
+      </w:r>
+      <w:r>
+        <w:t>— запись на сайте, черновик и сайт совпадают.</w:t>
+      </w:r>
+    </w:p>
+    <w:p>
+      <w:pPr>
+        <w:pStyle w:val="ListBullet"/>
+        <w:spacing w:after="40"/>
+      </w:pPr>
+      <w:r>
+        <w:rPr>
+          <w:b/>
+        </w:rPr>
+        <w:t xml:space="preserve">Modified (фиолетовый) </w:t>
+      </w:r>
+      <w:r>
+        <w:t>— запись опубликована, но потом её отредактировали и НЕ опубликовали заново. На сайте пока показывается прежняя версия. Нажмите Publish ещё раз, чтобы выложить правки.</w:t>
       </w:r>
     </w:p>
     <w:p>
@@ -348,10 +558,10 @@
           <w:b/>
           <w:color w:val="0A7E8C"/>
         </w:rPr>
-        <w:t xml:space="preserve">Важно: </w:t>
+        <w:t xml:space="preserve">Запомните: </w:t>
       </w:r>
       <w:r>
-        <w:t>кнопка Save только сохраняет черновик и на сайт ничего не выкладывает. Чтобы изменения появились на сайте, всегда нажимайте Publish.</w:t>
+        <w:t>после любого изменения нажимайте Publish. Если видите статус «Modified» — значит, ваши правки ещё не на сайте.</w:t>
       </w:r>
     </w:p>
     <w:p>
@@ -365,7 +575,153 @@
           <w:color w:val="555566"/>
           <w:sz w:val="22"/>
         </w:rPr>
-        <w:t>Обновления появляются на сайте в течение примерно трёх минут (кэширование). Если правка не видна сразу — подождите и обновите страницу.</w:t>
+        <w:t>После публикации изменения появляются на сайте не мгновенно, а в течение примерно трёх минут (страницы кэшируются). Если правка не видна сразу — подождите пару минут и обновите страницу в браузере.</w:t>
+      </w:r>
+    </w:p>
+    <w:p>
+      <w:pPr>
+        <w:pStyle w:val="Heading1"/>
+        <w:spacing w:before="280" w:after="80"/>
+      </w:pPr>
+      <w:r>
+        <w:rPr>
+          <w:color w:val="0B2A4A"/>
+          <w:sz w:val="34"/>
+        </w:rPr>
+        <w:t>3. Как заполнять разные типы полей</w:t>
+      </w:r>
+    </w:p>
+    <w:p>
+      <w:pPr>
+        <w:spacing w:after="120"/>
+      </w:pPr>
+      <w:r>
+        <w:rPr>
+          <w:b w:val="0"/>
+          <w:i w:val="0"/>
+          <w:sz w:val="22"/>
+        </w:rPr>
+        <w:t>В формах встречаются поля разного типа. Понимание типов избавит от вопросов на любой форме.</w:t>
+      </w:r>
+    </w:p>
+    <w:p>
+      <w:pPr>
+        <w:pStyle w:val="ListBullet"/>
+        <w:spacing w:after="40"/>
+      </w:pPr>
+      <w:r>
+        <w:rPr>
+          <w:b/>
+        </w:rPr>
+        <w:t xml:space="preserve">Текстовое поле </w:t>
+      </w:r>
+      <w:r>
+        <w:t>— вводится текст (заголовок, имя, место).</w:t>
+      </w:r>
+    </w:p>
+    <w:p>
+      <w:pPr>
+        <w:pStyle w:val="ListBullet"/>
+        <w:spacing w:after="40"/>
+      </w:pPr>
+      <w:r>
+        <w:rPr>
+          <w:b/>
+        </w:rPr>
+        <w:t xml:space="preserve">Длинный текст / редактор </w:t>
+      </w:r>
+      <w:r>
+        <w:t>— абзацы текста (описание, содержание статьи).</w:t>
+      </w:r>
+    </w:p>
+    <w:p>
+      <w:pPr>
+        <w:pStyle w:val="ListBullet"/>
+        <w:spacing w:after="40"/>
+      </w:pPr>
+      <w:r>
+        <w:rPr>
+          <w:b/>
+        </w:rPr>
+        <w:t xml:space="preserve">Выпадающий список </w:t>
+      </w:r>
+      <w:r>
+        <w:t>— значение выбирается из готового набора (тема, категория, тип). Вручную вписать «своё» нельзя — только выбрать из списка.</w:t>
+      </w:r>
+    </w:p>
+    <w:p>
+      <w:pPr>
+        <w:pStyle w:val="ListBullet"/>
+        <w:spacing w:after="40"/>
+      </w:pPr>
+      <w:r>
+        <w:rPr>
+          <w:b/>
+        </w:rPr>
+        <w:t xml:space="preserve">Дата </w:t>
+      </w:r>
+      <w:r>
+        <w:t>— выбирается в календаре; формат ГГГГ-ММ-ДД (например, 2026-08-13).</w:t>
+      </w:r>
+    </w:p>
+    <w:p>
+      <w:pPr>
+        <w:pStyle w:val="ListBullet"/>
+        <w:spacing w:after="40"/>
+      </w:pPr>
+      <w:r>
+        <w:rPr>
+          <w:b/>
+        </w:rPr>
+        <w:t xml:space="preserve">Переключатель (true/false) </w:t>
+      </w:r>
+      <w:r>
+        <w:t>— «да/нет», например «показывать кнопку результатов».</w:t>
+      </w:r>
+    </w:p>
+    <w:p>
+      <w:pPr>
+        <w:pStyle w:val="ListBullet"/>
+        <w:spacing w:after="40"/>
+      </w:pPr>
+      <w:r>
+        <w:rPr>
+          <w:b/>
+        </w:rPr>
+        <w:t xml:space="preserve">Число </w:t>
+      </w:r>
+      <w:r>
+        <w:t>— только цифры (место в рейтинге, год рождения, порядок).</w:t>
+      </w:r>
+    </w:p>
+    <w:p>
+      <w:pPr>
+        <w:pStyle w:val="ListBullet"/>
+        <w:spacing w:after="40"/>
+      </w:pPr>
+      <w:r>
+        <w:rPr>
+          <w:b/>
+        </w:rPr>
+        <w:t xml:space="preserve">Изображение / файл </w:t>
+      </w:r>
+      <w:r>
+        <w:t>— загрузка картинки или документа перетаскиванием либо кнопкой.</w:t>
+      </w:r>
+    </w:p>
+    <w:p>
+      <w:pPr>
+        <w:pStyle w:val="ListBullet"/>
+        <w:spacing w:after="40"/>
+      </w:pPr>
+      <w:r>
+        <w:rPr>
+          <w:b/>
+        </w:rPr>
+        <w:t xml:space="preserve">Связь </w:t>
+      </w:r>
+      <w:r>
+        <w:t>— выбор другой записи (например, у «Must-See Action» — какое видео показать).</w:t>
       </w:r>
     </w:p>
     <w:p>
@@ -378,80 +734,7 @@
           <w:color w:val="1D4E89"/>
           <w:sz w:val="27"/>
         </w:rPr>
-        <w:t>Даты, обязательные поля и точные значения</w:t>
-      </w:r>
-    </w:p>
-    <w:p>
-      <w:pPr>
-        <w:pStyle w:val="ListBullet"/>
-        <w:spacing w:after="40"/>
-      </w:pPr>
-      <w:r>
-        <w:rPr>
-          <w:b/>
-        </w:rPr>
-        <w:t xml:space="preserve">Даты </w:t>
-      </w:r>
-      <w:r>
-        <w:t>— в формате ГГГГ-ММ-ДД (например, 2026-08-13).</w:t>
-      </w:r>
-    </w:p>
-    <w:p>
-      <w:pPr>
-        <w:pStyle w:val="ListBullet"/>
-        <w:spacing w:after="40"/>
-      </w:pPr>
-      <w:r>
-        <w:rPr>
-          <w:b/>
-        </w:rPr>
-        <w:t xml:space="preserve">Обязательные поля </w:t>
-      </w:r>
-      <w:r>
-        <w:t>— помечены звёздочкой; без них запись не сохранится.</w:t>
-      </w:r>
-    </w:p>
-    <w:p>
-      <w:pPr>
-        <w:pStyle w:val="ListBullet"/>
-        <w:spacing w:after="40"/>
-      </w:pPr>
-      <w:r>
-        <w:rPr>
-          <w:b/>
-        </w:rPr>
-        <w:t xml:space="preserve">Выпадающие списки </w:t>
-      </w:r>
-      <w:r>
-        <w:t>— поля с фиксированным набором значений (тип события, категория, тема) выбираются из списка, а не вводятся вручную.</w:t>
-      </w:r>
-    </w:p>
-    <w:p>
-      <w:pPr>
-        <w:pStyle w:val="ListBullet"/>
-        <w:spacing w:after="40"/>
-      </w:pPr>
-      <w:r>
-        <w:rPr>
-          <w:b/>
-        </w:rPr>
-        <w:t xml:space="preserve">Точные строки </w:t>
-      </w:r>
-      <w:r>
-        <w:t>— названия дисциплин и категории в результатах, рекордах и рейтинге сопоставляются буквально. Ошибка в написании приведёт к тому, что строка не отобразится. Сверяйтесь со справочником в конце документа.</w:t>
-      </w:r>
-    </w:p>
-    <w:p>
-      <w:pPr>
-        <w:pStyle w:val="Heading1"/>
-        <w:spacing w:before="280" w:after="80"/>
-      </w:pPr>
-      <w:r>
-        <w:rPr>
-          <w:color w:val="0B2A4A"/>
-          <w:sz w:val="34"/>
-        </w:rPr>
-        <w:t>3. Изображения и флаги</w:t>
+        <w:t>Изображения и флаги</w:t>
       </w:r>
     </w:p>
     <w:p>
@@ -462,7 +745,7 @@
         <w:drawing>
           <wp:inline xmlns:a="http://schemas.openxmlformats.org/drawingml/2006/main" xmlns:pic="http://schemas.openxmlformats.org/drawingml/2006/picture">
             <wp:extent cx="5760720" cy="1645920"/>
-            <wp:docPr id="3" name="Picture 3"/>
+            <wp:docPr id="4" name="Picture 4"/>
             <wp:cNvGraphicFramePr>
               <a:graphicFrameLocks noChangeAspect="1"/>
             </wp:cNvGraphicFramePr>
@@ -474,7 +757,7 @@
                     <pic:cNvPicPr/>
                   </pic:nvPicPr>
                   <pic:blipFill>
-                    <a:blip r:embed="rId11"/>
+                    <a:blip r:embed="rId12"/>
                     <a:stretch>
                       <a:fillRect/>
                     </a:stretch>
@@ -505,7 +788,7 @@
           <w:color w:val="555566"/>
           <w:sz w:val="18"/>
         </w:rPr>
-        <w:t>Загрузка изображений и работа с флагами.</w:t>
+        <w:t>Загрузка изображений и логика флагов.</w:t>
       </w:r>
     </w:p>
     <w:p>
@@ -517,10 +800,10 @@
         <w:rPr>
           <w:b/>
         </w:rPr>
-        <w:t xml:space="preserve">Загрузка </w:t>
+        <w:t xml:space="preserve">Загрузка картинок </w:t>
       </w:r>
       <w:r>
-        <w:t>— в полях изображений (image, thumbnail, logo, flag) файл перетаскивается в область загрузки или выбирается кнопкой. Загружайте оригинал хорошего качества — уменьшенные версии система создаёт сама.</w:t>
+        <w:t>— перетащите файл в поле или нажмите «Click to add an asset». Загружайте оригинал хорошего качества: уменьшенные версии для сетки система делает сама.</w:t>
       </w:r>
     </w:p>
     <w:p>
@@ -535,7 +818,7 @@
         <w:t xml:space="preserve">Флаги </w:t>
       </w:r>
       <w:r>
-        <w:t>— в результатах, рекордах и рейтинге флаг подгружается автоматически по трёхбуквенному коду страны (FRA, SUI, GER). Поле flag заполняется вручную только как запасной вариант, если автоматический флаг не отобразился.</w:t>
+        <w:t>— в результатах, рекордах и рейтинге флаг страны подгружается автоматически по её трёхбуквенному коду (FRA, SUI, GER). Отдельное поле flag заполняется вручную только как запасной вариант — если автоматический флаг вдруг не отобразился.</w:t>
       </w:r>
     </w:p>
     <w:p>
@@ -561,7 +844,7 @@
           <w:i w:val="0"/>
           <w:sz w:val="22"/>
         </w:rPr>
-        <w:t>Материалы раздела «Media» сайта: новости, видео, фотоальбомы и трансляции.</w:t>
+        <w:t>Материалы раздела «Media»: новости и статьи, видео, фотоальбомы и прямые трансляции.</w:t>
       </w:r>
     </w:p>
     <w:p>
@@ -587,7 +870,61 @@
           <w:i w:val="0"/>
           <w:sz w:val="22"/>
         </w:rPr>
-        <w:t>Статьи раздела «Media». Категория задаётся полем theme и определяет вкладку (News, Features, Interviews и т. д.).</w:t>
+        <w:t>Одна запись = одна новость или статья. Поле theme определяет вкладку раздела «Media», куда она попадёт.</w:t>
+      </w:r>
+    </w:p>
+    <w:p>
+      <w:pPr>
+        <w:jc w:val="center"/>
+      </w:pPr>
+      <w:r>
+        <w:drawing>
+          <wp:inline xmlns:a="http://schemas.openxmlformats.org/drawingml/2006/main" xmlns:pic="http://schemas.openxmlformats.org/drawingml/2006/picture">
+            <wp:extent cx="5760720" cy="2818638"/>
+            <wp:docPr id="5" name="Picture 5"/>
+            <wp:cNvGraphicFramePr>
+              <a:graphicFrameLocks noChangeAspect="1"/>
+            </wp:cNvGraphicFramePr>
+            <a:graphic>
+              <a:graphicData uri="http://schemas.openxmlformats.org/drawingml/2006/picture">
+                <pic:pic>
+                  <pic:nvPicPr>
+                    <pic:cNvPr id="0" name="img_m5.png"/>
+                    <pic:cNvPicPr/>
+                  </pic:nvPicPr>
+                  <pic:blipFill>
+                    <a:blip r:embed="rId13"/>
+                    <a:stretch>
+                      <a:fillRect/>
+                    </a:stretch>
+                  </pic:blipFill>
+                  <pic:spPr>
+                    <a:xfrm>
+                      <a:off x="0" y="0"/>
+                      <a:ext cx="5760720" cy="2818638"/>
+                    </a:xfrm>
+                    <a:prstGeom prst="rect"/>
+                  </pic:spPr>
+                </pic:pic>
+              </a:graphicData>
+            </a:graphic>
+          </wp:inline>
+        </w:drawing>
+      </w:r>
+    </w:p>
+    <w:p>
+      <w:pPr>
+        <w:spacing w:after="200"/>
+        <w:jc w:val="center"/>
+      </w:pPr>
+      <w:r>
+        <w:rPr>
+          <w:b w:val="0"/>
+          <w:i/>
+          <w:color w:val="555566"/>
+          <w:sz w:val="18"/>
+        </w:rPr>
+        <w:t>News Item: пример заполнения.</w:t>
       </w:r>
     </w:p>
     <w:tbl>
@@ -678,7 +1015,7 @@
               <w:rPr>
                 <w:sz w:val="20"/>
               </w:rPr>
-              <w:t>Заголовок статьи. Обязательно.</w:t>
+              <w:t>Заголовок статьи.</w:t>
             </w:r>
           </w:p>
         </w:tc>
@@ -727,7 +1064,7 @@
               <w:rPr>
                 <w:sz w:val="20"/>
               </w:rPr>
-              <w:t>Адрес статьи. Генерируется из заголовка автоматически; можно не трогать.</w:t>
+              <w:t>Адрес статьи в интернете. Создаётся из заголовка автоматически — обычно не трогают.</w:t>
             </w:r>
           </w:p>
         </w:tc>
@@ -775,7 +1112,7 @@
               <w:rPr>
                 <w:sz w:val="20"/>
               </w:rPr>
-              <w:t>Категория: NEWS, FEATURES, INTERVIEWS, PRESS, RELEASES, CHAMPIONSHIP, EDUCATION.</w:t>
+              <w:t>Категория (вкладка). Выбор из списка: NEWS, FEATURES, INTERVIEWS, PRESS, RELEASES, CHAMPIONSHIP, EDUCATION.</w:t>
             </w:r>
           </w:p>
         </w:tc>
@@ -809,7 +1146,7 @@
                 <w:b/>
                 <w:sz w:val="20"/>
               </w:rPr>
-              <w:t>subtitle</w:t>
+              <w:t>date</w:t>
             </w:r>
           </w:p>
         </w:tc>
@@ -824,7 +1161,102 @@
               <w:rPr>
                 <w:sz w:val="20"/>
               </w:rPr>
+              <w:t>Дата публикации, ГГГГ-ММ-ДД.</w:t>
+            </w:r>
+          </w:p>
+        </w:tc>
+        <w:tc>
+          <w:tcPr>
+            <w:tcW w:type="dxa" w:w="1008"/>
+            <w:shd w:val="clear" w:fill="F3F5F8"/>
+          </w:tcPr>
+          <w:p>
+            <w:r/>
+            <w:r>
+              <w:rPr>
+                <w:b/>
+                <w:color w:val="C02B20"/>
+                <w:sz w:val="20"/>
+              </w:rPr>
+              <w:t>да</w:t>
+            </w:r>
+          </w:p>
+        </w:tc>
+      </w:tr>
+      <w:tr>
+        <w:tc>
+          <w:tcPr>
+            <w:tcW w:type="dxa" w:w="2160"/>
+          </w:tcPr>
+          <w:p>
+            <w:r/>
+            <w:r>
+              <w:rPr>
+                <w:b/>
+                <w:sz w:val="20"/>
+              </w:rPr>
+              <w:t>subtitle</w:t>
+            </w:r>
+          </w:p>
+        </w:tc>
+        <w:tc>
+          <w:tcPr>
+            <w:tcW w:type="dxa" w:w="6336"/>
+          </w:tcPr>
+          <w:p>
+            <w:r/>
+            <w:r>
+              <w:rPr>
+                <w:sz w:val="20"/>
+              </w:rPr>
               <w:t>Подзаголовок (необязательно).</w:t>
+            </w:r>
+          </w:p>
+        </w:tc>
+        <w:tc>
+          <w:tcPr>
+            <w:tcW w:type="dxa" w:w="1008"/>
+          </w:tcPr>
+          <w:p>
+            <w:r/>
+            <w:r>
+              <w:rPr>
+                <w:sz w:val="20"/>
+              </w:rPr>
+              <w:t>—</w:t>
+            </w:r>
+          </w:p>
+        </w:tc>
+      </w:tr>
+      <w:tr>
+        <w:tc>
+          <w:tcPr>
+            <w:tcW w:type="dxa" w:w="2160"/>
+            <w:shd w:val="clear" w:fill="F3F5F8"/>
+          </w:tcPr>
+          <w:p>
+            <w:r/>
+            <w:r>
+              <w:rPr>
+                <w:b/>
+                <w:sz w:val="20"/>
+              </w:rPr>
+              <w:t>description</w:t>
+            </w:r>
+          </w:p>
+        </w:tc>
+        <w:tc>
+          <w:tcPr>
+            <w:tcW w:type="dxa" w:w="6336"/>
+            <w:shd w:val="clear" w:fill="F3F5F8"/>
+          </w:tcPr>
+          <w:p>
+            <w:r/>
+            <w:r>
+              <w:rPr>
+                <w:sz w:val="20"/>
+              </w:rPr>
+              <w:t>Короткое описание — показывается в карточке и превью.</w:t>
             </w:r>
           </w:p>
         </w:tc>
@@ -856,7 +1288,7 @@
                 <w:b/>
                 <w:sz w:val="20"/>
               </w:rPr>
-              <w:t>description</w:t>
+              <w:t>content</w:t>
             </w:r>
           </w:p>
         </w:tc>
@@ -870,7 +1302,7 @@
               <w:rPr>
                 <w:sz w:val="20"/>
               </w:rPr>
-              <w:t>Краткое описание для карточки и превью.</w:t>
+              <w:t>Полный текст статьи (форматируемый редактор).</w:t>
             </w:r>
           </w:p>
         </w:tc>
@@ -885,101 +1317,6 @@
                 <w:sz w:val="20"/>
               </w:rPr>
               <w:t>—</w:t>
-            </w:r>
-          </w:p>
-        </w:tc>
-      </w:tr>
-      <w:tr>
-        <w:tc>
-          <w:tcPr>
-            <w:tcW w:type="dxa" w:w="2160"/>
-            <w:shd w:val="clear" w:fill="F3F5F8"/>
-          </w:tcPr>
-          <w:p>
-            <w:r/>
-            <w:r>
-              <w:rPr>
-                <w:b/>
-                <w:sz w:val="20"/>
-              </w:rPr>
-              <w:t>content</w:t>
-            </w:r>
-          </w:p>
-        </w:tc>
-        <w:tc>
-          <w:tcPr>
-            <w:tcW w:type="dxa" w:w="6336"/>
-            <w:shd w:val="clear" w:fill="F3F5F8"/>
-          </w:tcPr>
-          <w:p>
-            <w:r/>
-            <w:r>
-              <w:rPr>
-                <w:sz w:val="20"/>
-              </w:rPr>
-              <w:t>Полный текст статьи (форматируемый редактор).</w:t>
-            </w:r>
-          </w:p>
-        </w:tc>
-        <w:tc>
-          <w:tcPr>
-            <w:tcW w:type="dxa" w:w="1008"/>
-            <w:shd w:val="clear" w:fill="F3F5F8"/>
-          </w:tcPr>
-          <w:p>
-            <w:r/>
-            <w:r>
-              <w:rPr>
-                <w:sz w:val="20"/>
-              </w:rPr>
-              <w:t>—</w:t>
-            </w:r>
-          </w:p>
-        </w:tc>
-      </w:tr>
-      <w:tr>
-        <w:tc>
-          <w:tcPr>
-            <w:tcW w:type="dxa" w:w="2160"/>
-          </w:tcPr>
-          <w:p>
-            <w:r/>
-            <w:r>
-              <w:rPr>
-                <w:b/>
-                <w:sz w:val="20"/>
-              </w:rPr>
-              <w:t>date</w:t>
-            </w:r>
-          </w:p>
-        </w:tc>
-        <w:tc>
-          <w:tcPr>
-            <w:tcW w:type="dxa" w:w="6336"/>
-          </w:tcPr>
-          <w:p>
-            <w:r/>
-            <w:r>
-              <w:rPr>
-                <w:sz w:val="20"/>
-              </w:rPr>
-              <w:t>Дата публикации, ГГГГ-ММ-ДД.</w:t>
-            </w:r>
-          </w:p>
-        </w:tc>
-        <w:tc>
-          <w:tcPr>
-            <w:tcW w:type="dxa" w:w="1008"/>
-          </w:tcPr>
-          <w:p>
-            <w:r/>
-            <w:r>
-              <w:rPr>
-                <w:b/>
-                <w:color w:val="C02B20"/>
-                <w:sz w:val="20"/>
-              </w:rPr>
-              <w:t>да</w:t>
             </w:r>
           </w:p>
         </w:tc>
@@ -1012,7 +1349,7 @@
               <w:rPr>
                 <w:sz w:val="20"/>
               </w:rPr>
-              <w:t>Автор (необязательно).</w:t>
+              <w:t>Автор.</w:t>
             </w:r>
           </w:p>
         </w:tc>
@@ -1085,6 +1422,76 @@
     </w:p>
     <w:p>
       <w:pPr>
+        <w:pStyle w:val="Heading3"/>
+        <w:spacing w:before="160" w:after="20"/>
+      </w:pPr>
+      <w:r>
+        <w:rPr>
+          <w:b/>
+          <w:color w:val="2A2A44"/>
+          <w:sz w:val="23"/>
+        </w:rPr>
+        <w:t>Как добавить новость</w:t>
+      </w:r>
+    </w:p>
+    <w:p>
+      <w:pPr>
+        <w:pStyle w:val="ListNumber"/>
+        <w:spacing w:after="40"/>
+      </w:pPr>
+      <w:r>
+        <w:rPr>
+          <w:b/>
+        </w:rPr>
+        <w:t>News Item → Create an entry.</w:t>
+      </w:r>
+      <w:r/>
+    </w:p>
+    <w:p>
+      <w:pPr>
+        <w:pStyle w:val="ListNumber"/>
+        <w:spacing w:after="40"/>
+      </w:pPr>
+      <w:r>
+        <w:rPr>
+          <w:b/>
+        </w:rPr>
+        <w:t xml:space="preserve">Впишите title, </w:t>
+      </w:r>
+      <w:r>
+        <w:t>выберите theme, укажите date.</w:t>
+      </w:r>
+    </w:p>
+    <w:p>
+      <w:pPr>
+        <w:pStyle w:val="ListNumber"/>
+        <w:spacing w:after="40"/>
+      </w:pPr>
+      <w:r>
+        <w:rPr>
+          <w:b/>
+        </w:rPr>
+        <w:t xml:space="preserve">Добавьте description и content, </w:t>
+      </w:r>
+      <w:r>
+        <w:t>загрузите image.</w:t>
+      </w:r>
+    </w:p>
+    <w:p>
+      <w:pPr>
+        <w:pStyle w:val="ListNumber"/>
+        <w:spacing w:after="40"/>
+      </w:pPr>
+      <w:r>
+        <w:rPr>
+          <w:b/>
+        </w:rPr>
+        <w:t>Save, затем Publish.</w:t>
+      </w:r>
+      <w:r/>
+    </w:p>
+    <w:p>
+      <w:pPr>
         <w:pStyle w:val="Heading2"/>
         <w:spacing w:before="200" w:after="40"/>
       </w:pPr>
@@ -1106,7 +1513,7 @@
           <w:i w:val="0"/>
           <w:sz w:val="22"/>
         </w:rPr>
-        <w:t>Видео раздела «Media». Источник — ссылка (YouTube и т. п.) либо загруженный файл.</w:t>
+        <w:t>Видео раздела «Media». Источник — либо ссылка (YouTube и т. п.), либо загруженный файл.</w:t>
       </w:r>
     </w:p>
     <w:tbl>
@@ -1197,7 +1604,7 @@
               <w:rPr>
                 <w:sz w:val="20"/>
               </w:rPr>
-              <w:t>Название видео. Обязательно.</w:t>
+              <w:t>Название видео.</w:t>
             </w:r>
           </w:p>
         </w:tc>
@@ -1292,7 +1699,7 @@
               <w:rPr>
                 <w:sz w:val="20"/>
               </w:rPr>
-              <w:t>Ссылка на видео (например, YouTube). Либо videoUrl, либо videoFile.</w:t>
+              <w:t>Ссылка на видео (например, на YouTube).</w:t>
             </w:r>
           </w:p>
         </w:tc>
@@ -1339,7 +1746,7 @@
               <w:rPr>
                 <w:sz w:val="20"/>
               </w:rPr>
-              <w:t>Загруженный видеофайл (если нет ссылки).</w:t>
+              <w:t>Загруженный видеофайл — если нет ссылки.</w:t>
             </w:r>
           </w:p>
         </w:tc>
@@ -1385,7 +1792,7 @@
               <w:rPr>
                 <w:sz w:val="20"/>
               </w:rPr>
-              <w:t>Дата видео, ГГГГ-ММ-ДД.</w:t>
+              <w:t>Дата видео.</w:t>
             </w:r>
           </w:p>
         </w:tc>
@@ -1432,7 +1839,7 @@
               <w:rPr>
                 <w:sz w:val="20"/>
               </w:rPr>
-              <w:t>Длительность (например, 3:45). Необязательно.</w:t>
+              <w:t>Длительность, например 3:45.</w:t>
             </w:r>
           </w:p>
         </w:tc>
@@ -1478,7 +1885,7 @@
               <w:rPr>
                 <w:sz w:val="20"/>
               </w:rPr>
-              <w:t>Категория/тег (необязательно).</w:t>
+              <w:t>Категория/тег.</w:t>
             </w:r>
           </w:p>
         </w:tc>
@@ -1512,7 +1919,7 @@
           <w:b/>
           <w:color w:val="0A7E8C"/>
         </w:rPr>
-        <w:t xml:space="preserve">Совет: </w:t>
+        <w:t xml:space="preserve">Обратите внимание: </w:t>
       </w:r>
       <w:r>
         <w:t>если у видео нет ни обложки, ни файла, на сайте оно не показывается — источник считается недоступным.</w:t>
@@ -1541,7 +1948,61 @@
           <w:i w:val="0"/>
           <w:sz w:val="22"/>
         </w:rPr>
-        <w:t>Фотоальбомы раздела «Media». В сетке показывается обложка (image), при открытии — все фото (images).</w:t>
+        <w:t>Фотоальбом состоит из обложки и набора фотографий. В сетке раздела «Media» видна обложка; при открытии альбома — все фото.</w:t>
+      </w:r>
+    </w:p>
+    <w:p>
+      <w:pPr>
+        <w:jc w:val="center"/>
+      </w:pPr>
+      <w:r>
+        <w:drawing>
+          <wp:inline xmlns:a="http://schemas.openxmlformats.org/drawingml/2006/main" xmlns:pic="http://schemas.openxmlformats.org/drawingml/2006/picture">
+            <wp:extent cx="5760720" cy="2124266"/>
+            <wp:docPr id="6" name="Picture 6"/>
+            <wp:cNvGraphicFramePr>
+              <a:graphicFrameLocks noChangeAspect="1"/>
+            </wp:cNvGraphicFramePr>
+            <a:graphic>
+              <a:graphicData uri="http://schemas.openxmlformats.org/drawingml/2006/picture">
+                <pic:pic>
+                  <pic:nvPicPr>
+                    <pic:cNvPr id="0" name="img_m8.png"/>
+                    <pic:cNvPicPr/>
+                  </pic:nvPicPr>
+                  <pic:blipFill>
+                    <a:blip r:embed="rId14"/>
+                    <a:stretch>
+                      <a:fillRect/>
+                    </a:stretch>
+                  </pic:blipFill>
+                  <pic:spPr>
+                    <a:xfrm>
+                      <a:off x="0" y="0"/>
+                      <a:ext cx="5760720" cy="2124266"/>
+                    </a:xfrm>
+                    <a:prstGeom prst="rect"/>
+                  </pic:spPr>
+                </pic:pic>
+              </a:graphicData>
+            </a:graphic>
+          </wp:inline>
+        </w:drawing>
+      </w:r>
+    </w:p>
+    <w:p>
+      <w:pPr>
+        <w:spacing w:after="200"/>
+        <w:jc w:val="center"/>
+      </w:pPr>
+      <w:r>
+        <w:rPr>
+          <w:b w:val="0"/>
+          <w:i/>
+          <w:color w:val="555566"/>
+          <w:sz w:val="18"/>
+        </w:rPr>
+        <w:t>Photo: обложка (image) и все фотографии (images) — это разные поля.</w:t>
       </w:r>
     </w:p>
     <w:tbl>
@@ -1632,7 +2093,7 @@
               <w:rPr>
                 <w:sz w:val="20"/>
               </w:rPr>
-              <w:t>Название альбома. Обязательно.</w:t>
+              <w:t>Название альбома.</w:t>
             </w:r>
           </w:p>
         </w:tc>
@@ -1681,7 +2142,7 @@
               <w:rPr>
                 <w:sz w:val="20"/>
               </w:rPr>
-              <w:t>Обложка альбома (одно фото). Обязательно.</w:t>
+              <w:t>Обложка альбома — ОДНО фото.</w:t>
             </w:r>
           </w:p>
         </w:tc>
@@ -1729,7 +2190,7 @@
               <w:rPr>
                 <w:sz w:val="20"/>
               </w:rPr>
-              <w:t>Все фотографии альбома (множественная загрузка).</w:t>
+              <w:t>Все фотографии альбома — можно выбрать сразу много файлов.</w:t>
             </w:r>
           </w:p>
         </w:tc>
@@ -1776,7 +2237,7 @@
               <w:rPr>
                 <w:sz w:val="20"/>
               </w:rPr>
-              <w:t>Дата альбома/события, ГГГГ-ММ-ДД.</w:t>
+              <w:t>Дата альбома/события.</w:t>
             </w:r>
           </w:p>
         </w:tc>
@@ -1822,7 +2283,7 @@
               <w:rPr>
                 <w:sz w:val="20"/>
               </w:rPr>
-              <w:t>Адрес альбома; генерируется автоматически.</w:t>
+              <w:t>Адрес альбома; создаётся автоматически.</w:t>
             </w:r>
           </w:p>
         </w:tc>
@@ -1869,7 +2330,7 @@
               <w:rPr>
                 <w:sz w:val="20"/>
               </w:rPr>
-              <w:t>Заполняется, если альбом относится к конкретному событию (тогда он показывается на странице этого события).</w:t>
+              <w:t>Если альбом относится к конкретному событию — впишите адрес (slug) этого события; тогда альбом появится и на странице события.</w:t>
             </w:r>
           </w:p>
         </w:tc>
@@ -1918,7 +2379,7 @@
           <w:i w:val="0"/>
           <w:sz w:val="22"/>
         </w:rPr>
-        <w:t>Блок «WATCH» на странице «Media». Показывается, только когда трансляция активна.</w:t>
+        <w:t>Блок «WATCH» на странице «Media». Показывается только когда трансляция активна.</w:t>
       </w:r>
     </w:p>
     <w:tbl>
@@ -2199,7 +2660,7 @@
               <w:rPr>
                 <w:sz w:val="20"/>
               </w:rPr>
-              <w:t>Обложка (если нет — берётся стоп-кадр).</w:t>
+              <w:t>Обложка (если нет — берётся стоп-кадр трансляции).</w:t>
             </w:r>
           </w:p>
         </w:tc>
@@ -2235,6 +2696,19 @@
           <w:sz w:val="27"/>
         </w:rPr>
         <w:t>Must-See Action — подборка видео на главной</w:t>
+      </w:r>
+    </w:p>
+    <w:p>
+      <w:pPr>
+        <w:spacing w:after="120"/>
+      </w:pPr>
+      <w:r>
+        <w:rPr>
+          <w:b w:val="0"/>
+          <w:i w:val="0"/>
+          <w:sz w:val="22"/>
+        </w:rPr>
+        <w:t>Небольшой блок избранных видео на главной странице.</w:t>
       </w:r>
     </w:p>
     <w:tbl>
@@ -2325,7 +2799,7 @@
               <w:rPr>
                 <w:sz w:val="20"/>
               </w:rPr>
-              <w:t>Ссылка на запись из коллекции Video.</w:t>
+              <w:t>Выбор записи из коллекции Video.</w:t>
             </w:r>
           </w:p>
         </w:tc>
@@ -2372,7 +2846,7 @@
               <w:rPr>
                 <w:sz w:val="20"/>
               </w:rPr>
-              <w:t>Порядок отображения (число).</w:t>
+              <w:t>Порядок отображения (число: меньше — раньше).</w:t>
             </w:r>
           </w:p>
         </w:tc>
@@ -2445,7 +2919,7 @@
         <w:drawing>
           <wp:inline xmlns:a="http://schemas.openxmlformats.org/drawingml/2006/main" xmlns:pic="http://schemas.openxmlformats.org/drawingml/2006/picture">
             <wp:extent cx="5760720" cy="3533584"/>
-            <wp:docPr id="4" name="Picture 4"/>
+            <wp:docPr id="7" name="Picture 7"/>
             <wp:cNvGraphicFramePr>
               <a:graphicFrameLocks noChangeAspect="1"/>
             </wp:cNvGraphicFramePr>
@@ -2457,7 +2931,7 @@
                     <pic:cNvPicPr/>
                   </pic:nvPicPr>
                   <pic:blipFill>
-                    <a:blip r:embed="rId12"/>
+                    <a:blip r:embed="rId15"/>
                     <a:stretch>
                       <a:fillRect/>
                     </a:stretch>
@@ -2488,7 +2962,7 @@
           <w:color w:val="555566"/>
           <w:sz w:val="18"/>
         </w:rPr>
-        <w:t>Event: пример заполнения полей.</w:t>
+        <w:t>Event: пример заполнения ключевых полей.</w:t>
       </w:r>
     </w:p>
     <w:tbl>
@@ -2579,7 +3053,7 @@
               <w:rPr>
                 <w:sz w:val="20"/>
               </w:rPr>
-              <w:t>Название события. Обязательно.</w:t>
+              <w:t>Название события.</w:t>
             </w:r>
           </w:p>
         </w:tc>
@@ -2628,7 +3102,7 @@
               <w:rPr>
                 <w:sz w:val="20"/>
               </w:rPr>
-              <w:t>Адрес события; генерируется автоматически.</w:t>
+              <w:t>Адрес события; создаётся автоматически.</w:t>
             </w:r>
           </w:p>
         </w:tc>
@@ -2676,7 +3150,7 @@
               <w:rPr>
                 <w:sz w:val="20"/>
               </w:rPr>
-              <w:t>Тип: competition, education или meeting.</w:t>
+              <w:t>Тип: competition (соревнование), education (обучение), meeting (собрание).</w:t>
             </w:r>
           </w:p>
         </w:tc>
@@ -2725,7 +3199,7 @@
               <w:rPr>
                 <w:sz w:val="20"/>
               </w:rPr>
-              <w:t>UPCOMING (в календаре) или FINISHED (в результатах).</w:t>
+              <w:t>UPCOMING — будущее (в календаре); FINISHED — завершённое (в результатах).</w:t>
             </w:r>
           </w:p>
         </w:tc>
@@ -2759,7 +3233,7 @@
                 <w:b/>
                 <w:sz w:val="20"/>
               </w:rPr>
-              <w:t>date / endDate</w:t>
+              <w:t>date</w:t>
             </w:r>
           </w:p>
         </w:tc>
@@ -2773,7 +3247,7 @@
               <w:rPr>
                 <w:sz w:val="20"/>
               </w:rPr>
-              <w:t>Даты начала и окончания, ГГГГ-ММ-ДД.</w:t>
+              <w:t>Дата начала.</w:t>
             </w:r>
           </w:p>
         </w:tc>
@@ -2807,7 +3281,7 @@
                 <w:b/>
                 <w:sz w:val="20"/>
               </w:rPr>
-              <w:t>location</w:t>
+              <w:t>endDate</w:t>
             </w:r>
           </w:p>
         </w:tc>
@@ -2822,7 +3296,7 @@
               <w:rPr>
                 <w:sz w:val="20"/>
               </w:rPr>
-              <w:t>Место проведения (город, страна).</w:t>
+              <w:t>Дата окончания.</w:t>
             </w:r>
           </w:p>
         </w:tc>
@@ -2856,7 +3330,7 @@
                 <w:b/>
                 <w:sz w:val="20"/>
               </w:rPr>
-              <w:t>category</w:t>
+              <w:t>location</w:t>
             </w:r>
           </w:p>
         </w:tc>
@@ -2870,7 +3344,102 @@
               <w:rPr>
                 <w:sz w:val="20"/>
               </w:rPr>
-              <w:t>Категория-тег (например, SENIOR, JUNIOR).</w:t>
+              <w:t>Место проведения (город, страна).</w:t>
+            </w:r>
+          </w:p>
+        </w:tc>
+        <w:tc>
+          <w:tcPr>
+            <w:tcW w:type="dxa" w:w="1008"/>
+          </w:tcPr>
+          <w:p>
+            <w:r/>
+            <w:r>
+              <w:rPr>
+                <w:b/>
+                <w:color w:val="C02B20"/>
+                <w:sz w:val="20"/>
+              </w:rPr>
+              <w:t>да</w:t>
+            </w:r>
+          </w:p>
+        </w:tc>
+      </w:tr>
+      <w:tr>
+        <w:tc>
+          <w:tcPr>
+            <w:tcW w:type="dxa" w:w="2160"/>
+            <w:shd w:val="clear" w:fill="F3F5F8"/>
+          </w:tcPr>
+          <w:p>
+            <w:r/>
+            <w:r>
+              <w:rPr>
+                <w:b/>
+                <w:sz w:val="20"/>
+              </w:rPr>
+              <w:t>category</w:t>
+            </w:r>
+          </w:p>
+        </w:tc>
+        <w:tc>
+          <w:tcPr>
+            <w:tcW w:type="dxa" w:w="6336"/>
+            <w:shd w:val="clear" w:fill="F3F5F8"/>
+          </w:tcPr>
+          <w:p>
+            <w:r/>
+            <w:r>
+              <w:rPr>
+                <w:sz w:val="20"/>
+              </w:rPr>
+              <w:t>Категория-тег, например SENIOR или JUNIOR.</w:t>
+            </w:r>
+          </w:p>
+        </w:tc>
+        <w:tc>
+          <w:tcPr>
+            <w:tcW w:type="dxa" w:w="1008"/>
+            <w:shd w:val="clear" w:fill="F3F5F8"/>
+          </w:tcPr>
+          <w:p>
+            <w:r/>
+            <w:r>
+              <w:rPr>
+                <w:sz w:val="20"/>
+              </w:rPr>
+              <w:t>—</w:t>
+            </w:r>
+          </w:p>
+        </w:tc>
+      </w:tr>
+      <w:tr>
+        <w:tc>
+          <w:tcPr>
+            <w:tcW w:type="dxa" w:w="2160"/>
+          </w:tcPr>
+          <w:p>
+            <w:r/>
+            <w:r>
+              <w:rPr>
+                <w:b/>
+                <w:sz w:val="20"/>
+              </w:rPr>
+              <w:t>disciplines</w:t>
+            </w:r>
+          </w:p>
+        </w:tc>
+        <w:tc>
+          <w:tcPr>
+            <w:tcW w:type="dxa" w:w="6336"/>
+          </w:tcPr>
+          <w:p>
+            <w:r/>
+            <w:r>
+              <w:rPr>
+                <w:sz w:val="20"/>
+              </w:rPr>
+              <w:t>Список дисциплин события через запятую.</w:t>
             </w:r>
           </w:p>
         </w:tc>
@@ -2902,7 +3471,7 @@
                 <w:b/>
                 <w:sz w:val="20"/>
               </w:rPr>
-              <w:t>disciplines</w:t>
+              <w:t>hasResults</w:t>
             </w:r>
           </w:p>
         </w:tc>
@@ -2917,7 +3486,7 @@
               <w:rPr>
                 <w:sz w:val="20"/>
               </w:rPr>
-              <w:t>Список дисциплин события (через запятую).</w:t>
+              <w:t>Переключатель: включите, если у события есть таблицы результатов.</w:t>
             </w:r>
           </w:p>
         </w:tc>
@@ -2949,7 +3518,7 @@
                 <w:b/>
                 <w:sz w:val="20"/>
               </w:rPr>
-              <w:t>hasResults</w:t>
+              <w:t>hasResultBook</w:t>
             </w:r>
           </w:p>
         </w:tc>
@@ -2963,7 +3532,7 @@
               <w:rPr>
                 <w:sz w:val="20"/>
               </w:rPr>
-              <w:t>Включить, если у события есть таблицы результатов.</w:t>
+              <w:t>Переключатель: включите, чтобы показать кнопку result-book (PDF).</w:t>
             </w:r>
           </w:p>
         </w:tc>
@@ -2995,7 +3564,7 @@
                 <w:b/>
                 <w:sz w:val="20"/>
               </w:rPr>
-              <w:t>hasResultBook</w:t>
+              <w:t>image</w:t>
             </w:r>
           </w:p>
         </w:tc>
@@ -3010,100 +3579,7 @@
               <w:rPr>
                 <w:sz w:val="20"/>
               </w:rPr>
-              <w:t>Включить, чтобы показать кнопку result-book (PDF).</w:t>
-            </w:r>
-          </w:p>
-        </w:tc>
-        <w:tc>
-          <w:tcPr>
-            <w:tcW w:type="dxa" w:w="1008"/>
-            <w:shd w:val="clear" w:fill="F3F5F8"/>
-          </w:tcPr>
-          <w:p>
-            <w:r/>
-            <w:r>
-              <w:rPr>
-                <w:sz w:val="20"/>
-              </w:rPr>
-              <w:t>—</w:t>
-            </w:r>
-          </w:p>
-        </w:tc>
-      </w:tr>
-      <w:tr>
-        <w:tc>
-          <w:tcPr>
-            <w:tcW w:type="dxa" w:w="2160"/>
-          </w:tcPr>
-          <w:p>
-            <w:r/>
-            <w:r>
-              <w:rPr>
-                <w:b/>
-                <w:sz w:val="20"/>
-              </w:rPr>
-              <w:t>image</w:t>
-            </w:r>
-          </w:p>
-        </w:tc>
-        <w:tc>
-          <w:tcPr>
-            <w:tcW w:type="dxa" w:w="6336"/>
-          </w:tcPr>
-          <w:p>
-            <w:r/>
-            <w:r>
-              <w:rPr>
-                <w:sz w:val="20"/>
-              </w:rPr>
               <w:t>Обложка события.</w:t>
-            </w:r>
-          </w:p>
-        </w:tc>
-        <w:tc>
-          <w:tcPr>
-            <w:tcW w:type="dxa" w:w="1008"/>
-          </w:tcPr>
-          <w:p>
-            <w:r/>
-            <w:r>
-              <w:rPr>
-                <w:sz w:val="20"/>
-              </w:rPr>
-              <w:t>—</w:t>
-            </w:r>
-          </w:p>
-        </w:tc>
-      </w:tr>
-      <w:tr>
-        <w:tc>
-          <w:tcPr>
-            <w:tcW w:type="dxa" w:w="2160"/>
-            <w:shd w:val="clear" w:fill="F3F5F8"/>
-          </w:tcPr>
-          <w:p>
-            <w:r/>
-            <w:r>
-              <w:rPr>
-                <w:b/>
-                <w:sz w:val="20"/>
-              </w:rPr>
-              <w:t>schedule</w:t>
-            </w:r>
-          </w:p>
-        </w:tc>
-        <w:tc>
-          <w:tcPr>
-            <w:tcW w:type="dxa" w:w="6336"/>
-            <w:shd w:val="clear" w:fill="F3F5F8"/>
-          </w:tcPr>
-          <w:p>
-            <w:r/>
-            <w:r>
-              <w:rPr>
-                <w:sz w:val="20"/>
-              </w:rPr>
-              <w:t>Расписание (по строкам) — необязательно.</w:t>
             </w:r>
           </w:p>
         </w:tc>
@@ -3168,6 +3644,54 @@
           </w:p>
         </w:tc>
       </w:tr>
+      <w:tr>
+        <w:tc>
+          <w:tcPr>
+            <w:tcW w:type="dxa" w:w="2160"/>
+            <w:shd w:val="clear" w:fill="F3F5F8"/>
+          </w:tcPr>
+          <w:p>
+            <w:r/>
+            <w:r>
+              <w:rPr>
+                <w:b/>
+                <w:sz w:val="20"/>
+              </w:rPr>
+              <w:t>schedule</w:t>
+            </w:r>
+          </w:p>
+        </w:tc>
+        <w:tc>
+          <w:tcPr>
+            <w:tcW w:type="dxa" w:w="6336"/>
+            <w:shd w:val="clear" w:fill="F3F5F8"/>
+          </w:tcPr>
+          <w:p>
+            <w:r/>
+            <w:r>
+              <w:rPr>
+                <w:sz w:val="20"/>
+              </w:rPr>
+              <w:t>Расписание по строкам (необязательно).</w:t>
+            </w:r>
+          </w:p>
+        </w:tc>
+        <w:tc>
+          <w:tcPr>
+            <w:tcW w:type="dxa" w:w="1008"/>
+            <w:shd w:val="clear" w:fill="F3F5F8"/>
+          </w:tcPr>
+          <w:p>
+            <w:r/>
+            <w:r>
+              <w:rPr>
+                <w:sz w:val="20"/>
+              </w:rPr>
+              <w:t>—</w:t>
+            </w:r>
+          </w:p>
+        </w:tc>
+      </w:tr>
     </w:tbl>
     <w:p>
       <w:pPr>
@@ -3197,7 +3721,7 @@
           <w:i w:val="0"/>
           <w:sz w:val="22"/>
         </w:rPr>
-        <w:t>Строки таблиц результатов по дисциплинам. Как правило, заполняются автоматически импортом из системы хронометража SIUS, а не вручную (поля shots / shotDetail — служебные).</w:t>
+        <w:t>Строки таблиц результатов по дисциплинам. Как правило, они заполняются автоматически при импорте из системы хронометража SIUS, а не вручную (поля shots и shotDetail — служебные).</w:t>
       </w:r>
     </w:p>
     <w:p>
@@ -3209,7 +3733,7 @@
           <w:b/>
           <w:color w:val="0A7E8C"/>
         </w:rPr>
-        <w:t xml:space="preserve">При ручном вводе: </w:t>
+        <w:t xml:space="preserve">Если всё же вручную: </w:t>
       </w:r>
       <w:r>
         <w:t>заполните eventSlug (точно как адрес события), position, athleteName, federationCode, total, discipline (ЗАГЛАВНЫМИ буквами, например 10M AIR RIFLE) и category (ALL / MEN / WOMEN).</w:t>
@@ -3252,6 +3776,60 @@
           <w:sz w:val="22"/>
         </w:rPr>
         <w:t>Строки таблицы рекордов на вкладке «Records».</w:t>
+      </w:r>
+    </w:p>
+    <w:p>
+      <w:pPr>
+        <w:jc w:val="center"/>
+      </w:pPr>
+      <w:r>
+        <w:drawing>
+          <wp:inline xmlns:a="http://schemas.openxmlformats.org/drawingml/2006/main" xmlns:pic="http://schemas.openxmlformats.org/drawingml/2006/picture">
+            <wp:extent cx="5760720" cy="3327844"/>
+            <wp:docPr id="8" name="Picture 8"/>
+            <wp:cNvGraphicFramePr>
+              <a:graphicFrameLocks noChangeAspect="1"/>
+            </wp:cNvGraphicFramePr>
+            <a:graphic>
+              <a:graphicData uri="http://schemas.openxmlformats.org/drawingml/2006/picture">
+                <pic:pic>
+                  <pic:nvPicPr>
+                    <pic:cNvPr id="0" name="img_m6.png"/>
+                    <pic:cNvPicPr/>
+                  </pic:nvPicPr>
+                  <pic:blipFill>
+                    <a:blip r:embed="rId16"/>
+                    <a:stretch>
+                      <a:fillRect/>
+                    </a:stretch>
+                  </pic:blipFill>
+                  <pic:spPr>
+                    <a:xfrm>
+                      <a:off x="0" y="0"/>
+                      <a:ext cx="5760720" cy="3327844"/>
+                    </a:xfrm>
+                    <a:prstGeom prst="rect"/>
+                  </pic:spPr>
+                </pic:pic>
+              </a:graphicData>
+            </a:graphic>
+          </wp:inline>
+        </w:drawing>
+      </w:r>
+    </w:p>
+    <w:p>
+      <w:pPr>
+        <w:spacing w:after="200"/>
+        <w:jc w:val="center"/>
+      </w:pPr>
+      <w:r>
+        <w:rPr>
+          <w:b w:val="0"/>
+          <w:i/>
+          <w:color w:val="555566"/>
+          <w:sz w:val="18"/>
+        </w:rPr>
+        <w:t>Record: поле discipline (выделено) — точная строка из справочника.</w:t>
       </w:r>
     </w:p>
     <w:tbl>
@@ -3342,7 +3920,7 @@
               <w:rPr>
                 <w:sz w:val="20"/>
               </w:rPr>
-              <w:t>Дисциплина с полом/возрастом (например, Trap Women). См. справочник.</w:t>
+              <w:t>Дисциплина с указанием вида, пола/возраста — точная строка из справочника (раздел «Приложение»).</w:t>
             </w:r>
           </w:p>
         </w:tc>
@@ -3437,193 +4015,7 @@
               <w:rPr>
                 <w:sz w:val="20"/>
               </w:rPr>
-              <w:t>Результат/значение как текст (27; 361.7; 631.6).</w:t>
-            </w:r>
-          </w:p>
-        </w:tc>
-        <w:tc>
-          <w:tcPr>
-            <w:tcW w:type="dxa" w:w="1008"/>
-          </w:tcPr>
-          <w:p>
-            <w:r/>
-            <w:r>
-              <w:rPr>
-                <w:sz w:val="20"/>
-              </w:rPr>
-              <w:t>—</w:t>
-            </w:r>
-          </w:p>
-        </w:tc>
-      </w:tr>
-      <w:tr>
-        <w:tc>
-          <w:tcPr>
-            <w:tcW w:type="dxa" w:w="2160"/>
-            <w:shd w:val="clear" w:fill="F3F5F8"/>
-          </w:tcPr>
-          <w:p>
-            <w:r/>
-            <w:r>
-              <w:rPr>
-                <w:b/>
-                <w:sz w:val="20"/>
-              </w:rPr>
-              <w:t>athleteName</w:t>
-            </w:r>
-          </w:p>
-        </w:tc>
-        <w:tc>
-          <w:tcPr>
-            <w:tcW w:type="dxa" w:w="6336"/>
-            <w:shd w:val="clear" w:fill="F3F5F8"/>
-          </w:tcPr>
-          <w:p>
-            <w:r/>
-            <w:r>
-              <w:rPr>
-                <w:sz w:val="20"/>
-              </w:rPr>
-              <w:t>Имя спортсмена (или состав команды).</w:t>
-            </w:r>
-          </w:p>
-        </w:tc>
-        <w:tc>
-          <w:tcPr>
-            <w:tcW w:type="dxa" w:w="1008"/>
-            <w:shd w:val="clear" w:fill="F3F5F8"/>
-          </w:tcPr>
-          <w:p>
-            <w:r/>
-            <w:r>
-              <w:rPr>
-                <w:sz w:val="20"/>
-              </w:rPr>
-              <w:t>—</w:t>
-            </w:r>
-          </w:p>
-        </w:tc>
-      </w:tr>
-      <w:tr>
-        <w:tc>
-          <w:tcPr>
-            <w:tcW w:type="dxa" w:w="2160"/>
-          </w:tcPr>
-          <w:p>
-            <w:r/>
-            <w:r>
-              <w:rPr>
-                <w:b/>
-                <w:sz w:val="20"/>
-              </w:rPr>
-              <w:t>federationCode</w:t>
-            </w:r>
-          </w:p>
-        </w:tc>
-        <w:tc>
-          <w:tcPr>
-            <w:tcW w:type="dxa" w:w="6336"/>
-          </w:tcPr>
-          <w:p>
-            <w:r/>
-            <w:r>
-              <w:rPr>
-                <w:sz w:val="20"/>
-              </w:rPr>
-              <w:t>Трёхбуквенный код страны (FRA) — флаг подгрузится сам.</w:t>
-            </w:r>
-          </w:p>
-        </w:tc>
-        <w:tc>
-          <w:tcPr>
-            <w:tcW w:type="dxa" w:w="1008"/>
-          </w:tcPr>
-          <w:p>
-            <w:r/>
-            <w:r>
-              <w:rPr>
-                <w:sz w:val="20"/>
-              </w:rPr>
-              <w:t>—</w:t>
-            </w:r>
-          </w:p>
-        </w:tc>
-      </w:tr>
-      <w:tr>
-        <w:tc>
-          <w:tcPr>
-            <w:tcW w:type="dxa" w:w="2160"/>
-            <w:shd w:val="clear" w:fill="F3F5F8"/>
-          </w:tcPr>
-          <w:p>
-            <w:r/>
-            <w:r>
-              <w:rPr>
-                <w:b/>
-                <w:sz w:val="20"/>
-              </w:rPr>
-              <w:t>location</w:t>
-            </w:r>
-          </w:p>
-        </w:tc>
-        <w:tc>
-          <w:tcPr>
-            <w:tcW w:type="dxa" w:w="6336"/>
-            <w:shd w:val="clear" w:fill="F3F5F8"/>
-          </w:tcPr>
-          <w:p>
-            <w:r/>
-            <w:r>
-              <w:rPr>
-                <w:sz w:val="20"/>
-              </w:rPr>
-              <w:t>Место установления (WC Hangzhou (CHN)).</w:t>
-            </w:r>
-          </w:p>
-        </w:tc>
-        <w:tc>
-          <w:tcPr>
-            <w:tcW w:type="dxa" w:w="1008"/>
-            <w:shd w:val="clear" w:fill="F3F5F8"/>
-          </w:tcPr>
-          <w:p>
-            <w:r/>
-            <w:r>
-              <w:rPr>
-                <w:sz w:val="20"/>
-              </w:rPr>
-              <w:t>—</w:t>
-            </w:r>
-          </w:p>
-        </w:tc>
-      </w:tr>
-      <w:tr>
-        <w:tc>
-          <w:tcPr>
-            <w:tcW w:type="dxa" w:w="2160"/>
-          </w:tcPr>
-          <w:p>
-            <w:r/>
-            <w:r>
-              <w:rPr>
-                <w:b/>
-                <w:sz w:val="20"/>
-              </w:rPr>
-              <w:t>date</w:t>
-            </w:r>
-          </w:p>
-        </w:tc>
-        <w:tc>
-          <w:tcPr>
-            <w:tcW w:type="dxa" w:w="6336"/>
-          </w:tcPr>
-          <w:p>
-            <w:r/>
-            <w:r>
-              <w:rPr>
-                <w:sz w:val="20"/>
-              </w:rPr>
-              <w:t>Дата, ГГГГ-ММ-ДД.</w:t>
+              <w:t>Результат как текст: 27; 361.7; 631.6.</w:t>
             </w:r>
           </w:p>
         </w:tc>
@@ -3670,7 +4062,193 @@
               <w:rPr>
                 <w:sz w:val="20"/>
               </w:rPr>
-              <w:t>Код рекорда: ER (European Record). Приставки/суффиксы: Q — Qualification, E — Equalled, J — Junior, T — Team.</w:t>
+              <w:t>Код рекорда (см. таблицу кодов в Приложении): ER, ERJ, QER и т. д.</w:t>
+            </w:r>
+          </w:p>
+        </w:tc>
+        <w:tc>
+          <w:tcPr>
+            <w:tcW w:type="dxa" w:w="1008"/>
+            <w:shd w:val="clear" w:fill="F3F5F8"/>
+          </w:tcPr>
+          <w:p>
+            <w:r/>
+            <w:r>
+              <w:rPr>
+                <w:sz w:val="20"/>
+              </w:rPr>
+              <w:t>—</w:t>
+            </w:r>
+          </w:p>
+        </w:tc>
+      </w:tr>
+      <w:tr>
+        <w:tc>
+          <w:tcPr>
+            <w:tcW w:type="dxa" w:w="2160"/>
+          </w:tcPr>
+          <w:p>
+            <w:r/>
+            <w:r>
+              <w:rPr>
+                <w:b/>
+                <w:sz w:val="20"/>
+              </w:rPr>
+              <w:t>athleteName</w:t>
+            </w:r>
+          </w:p>
+        </w:tc>
+        <w:tc>
+          <w:tcPr>
+            <w:tcW w:type="dxa" w:w="6336"/>
+          </w:tcPr>
+          <w:p>
+            <w:r/>
+            <w:r>
+              <w:rPr>
+                <w:sz w:val="20"/>
+              </w:rPr>
+              <w:t>Имя спортсмена или состав команды.</w:t>
+            </w:r>
+          </w:p>
+        </w:tc>
+        <w:tc>
+          <w:tcPr>
+            <w:tcW w:type="dxa" w:w="1008"/>
+          </w:tcPr>
+          <w:p>
+            <w:r/>
+            <w:r>
+              <w:rPr>
+                <w:sz w:val="20"/>
+              </w:rPr>
+              <w:t>—</w:t>
+            </w:r>
+          </w:p>
+        </w:tc>
+      </w:tr>
+      <w:tr>
+        <w:tc>
+          <w:tcPr>
+            <w:tcW w:type="dxa" w:w="2160"/>
+            <w:shd w:val="clear" w:fill="F3F5F8"/>
+          </w:tcPr>
+          <w:p>
+            <w:r/>
+            <w:r>
+              <w:rPr>
+                <w:b/>
+                <w:sz w:val="20"/>
+              </w:rPr>
+              <w:t>federationCode</w:t>
+            </w:r>
+          </w:p>
+        </w:tc>
+        <w:tc>
+          <w:tcPr>
+            <w:tcW w:type="dxa" w:w="6336"/>
+            <w:shd w:val="clear" w:fill="F3F5F8"/>
+          </w:tcPr>
+          <w:p>
+            <w:r/>
+            <w:r>
+              <w:rPr>
+                <w:sz w:val="20"/>
+              </w:rPr>
+              <w:t>Трёхбуквенный код страны (FRA) — флаг подгрузится сам.</w:t>
+            </w:r>
+          </w:p>
+        </w:tc>
+        <w:tc>
+          <w:tcPr>
+            <w:tcW w:type="dxa" w:w="1008"/>
+            <w:shd w:val="clear" w:fill="F3F5F8"/>
+          </w:tcPr>
+          <w:p>
+            <w:r/>
+            <w:r>
+              <w:rPr>
+                <w:sz w:val="20"/>
+              </w:rPr>
+              <w:t>—</w:t>
+            </w:r>
+          </w:p>
+        </w:tc>
+      </w:tr>
+      <w:tr>
+        <w:tc>
+          <w:tcPr>
+            <w:tcW w:type="dxa" w:w="2160"/>
+          </w:tcPr>
+          <w:p>
+            <w:r/>
+            <w:r>
+              <w:rPr>
+                <w:b/>
+                <w:sz w:val="20"/>
+              </w:rPr>
+              <w:t>location</w:t>
+            </w:r>
+          </w:p>
+        </w:tc>
+        <w:tc>
+          <w:tcPr>
+            <w:tcW w:type="dxa" w:w="6336"/>
+          </w:tcPr>
+          <w:p>
+            <w:r/>
+            <w:r>
+              <w:rPr>
+                <w:sz w:val="20"/>
+              </w:rPr>
+              <w:t>Место установления рекорда, например «WC Hangzhou (CHN)».</w:t>
+            </w:r>
+          </w:p>
+        </w:tc>
+        <w:tc>
+          <w:tcPr>
+            <w:tcW w:type="dxa" w:w="1008"/>
+          </w:tcPr>
+          <w:p>
+            <w:r/>
+            <w:r>
+              <w:rPr>
+                <w:sz w:val="20"/>
+              </w:rPr>
+              <w:t>—</w:t>
+            </w:r>
+          </w:p>
+        </w:tc>
+      </w:tr>
+      <w:tr>
+        <w:tc>
+          <w:tcPr>
+            <w:tcW w:type="dxa" w:w="2160"/>
+            <w:shd w:val="clear" w:fill="F3F5F8"/>
+          </w:tcPr>
+          <w:p>
+            <w:r/>
+            <w:r>
+              <w:rPr>
+                <w:b/>
+                <w:sz w:val="20"/>
+              </w:rPr>
+              <w:t>date</w:t>
+            </w:r>
+          </w:p>
+        </w:tc>
+        <w:tc>
+          <w:tcPr>
+            <w:tcW w:type="dxa" w:w="6336"/>
+            <w:shd w:val="clear" w:fill="F3F5F8"/>
+          </w:tcPr>
+          <w:p>
+            <w:r/>
+            <w:r>
+              <w:rPr>
+                <w:sz w:val="20"/>
+              </w:rPr>
+              <w:t>Дата.</w:t>
             </w:r>
           </w:p>
         </w:tc>
@@ -3705,10 +4283,10 @@
           <w:b/>
           <w:color w:val="0A7E8C"/>
         </w:rPr>
-        <w:t xml:space="preserve">Совет: </w:t>
+        <w:t xml:space="preserve">Самый надёжный способ: </w:t>
       </w:r>
       <w:r>
-        <w:t>проще всего скопировать написание discipline и код type из уже существующей записи той же дисциплины.</w:t>
+        <w:t>найдите уже существующий рекорд той же дисциплины, откройте его и скопируйте написание полей discipline и type — тогда точно не ошибётесь.</w:t>
       </w:r>
     </w:p>
     <w:p>
@@ -3735,6 +4313,73 @@
           <w:sz w:val="22"/>
         </w:rPr>
         <w:t>Строки рейтинга по дисциплине и полу на вкладке «Ranking».</w:t>
+      </w:r>
+    </w:p>
+    <w:p>
+      <w:pPr>
+        <w:spacing w:after="120"/>
+      </w:pPr>
+      <w:r>
+        <w:rPr>
+          <w:b w:val="0"/>
+          <w:i w:val="0"/>
+          <w:sz w:val="22"/>
+        </w:rPr>
+        <w:t>Здесь важно не путать два поля: discipline — это сам вид (без пола), а category — пол. Именно поэтому семь дисциплин дают двенадцать карточек на сайте.</w:t>
+      </w:r>
+    </w:p>
+    <w:p>
+      <w:pPr>
+        <w:jc w:val="center"/>
+      </w:pPr>
+      <w:r>
+        <w:drawing>
+          <wp:inline xmlns:a="http://schemas.openxmlformats.org/drawingml/2006/main" xmlns:pic="http://schemas.openxmlformats.org/drawingml/2006/picture">
+            <wp:extent cx="5760720" cy="2947226"/>
+            <wp:docPr id="9" name="Picture 9"/>
+            <wp:cNvGraphicFramePr>
+              <a:graphicFrameLocks noChangeAspect="1"/>
+            </wp:cNvGraphicFramePr>
+            <a:graphic>
+              <a:graphicData uri="http://schemas.openxmlformats.org/drawingml/2006/picture">
+                <pic:pic>
+                  <pic:nvPicPr>
+                    <pic:cNvPr id="0" name="img_m7.png"/>
+                    <pic:cNvPicPr/>
+                  </pic:nvPicPr>
+                  <pic:blipFill>
+                    <a:blip r:embed="rId17"/>
+                    <a:stretch>
+                      <a:fillRect/>
+                    </a:stretch>
+                  </pic:blipFill>
+                  <pic:spPr>
+                    <a:xfrm>
+                      <a:off x="0" y="0"/>
+                      <a:ext cx="5760720" cy="2947226"/>
+                    </a:xfrm>
+                    <a:prstGeom prst="rect"/>
+                  </pic:spPr>
+                </pic:pic>
+              </a:graphicData>
+            </a:graphic>
+          </wp:inline>
+        </w:drawing>
+      </w:r>
+    </w:p>
+    <w:p>
+      <w:pPr>
+        <w:spacing w:after="200"/>
+        <w:jc w:val="center"/>
+      </w:pPr>
+      <w:r>
+        <w:rPr>
+          <w:b w:val="0"/>
+          <w:i/>
+          <w:color w:val="555566"/>
+          <w:sz w:val="18"/>
+        </w:rPr>
+        <w:t>Семь значений поля discipline в сочетании с полом (category) дают 12 списков на сайте.</w:t>
       </w:r>
     </w:p>
     <w:tbl>
@@ -3825,7 +4470,7 @@
               <w:rPr>
                 <w:sz w:val="20"/>
               </w:rPr>
-              <w:t>Место в рейтинге (число). Обязательно.</w:t>
+              <w:t>Место в рейтинге (число).</w:t>
             </w:r>
           </w:p>
         </w:tc>
@@ -3874,7 +4519,7 @@
               <w:rPr>
                 <w:sz w:val="20"/>
               </w:rPr>
-              <w:t>Имя спортсмена. Обязательно.</w:t>
+              <w:t>Имя спортсмена.</w:t>
             </w:r>
           </w:p>
         </w:tc>
@@ -3971,7 +4616,7 @@
               <w:rPr>
                 <w:sz w:val="20"/>
               </w:rPr>
-              <w:t>Год рождения.</w:t>
+              <w:t>Год рождения (число).</w:t>
             </w:r>
           </w:p>
         </w:tc>
@@ -4017,7 +4662,7 @@
               <w:rPr>
                 <w:sz w:val="20"/>
               </w:rPr>
-              <w:t>Одна из семи дисциплин рейтинга (см. справочник). Важно.</w:t>
+              <w:t>Сам вид — одно из семи значений (см. справочник). Пол здесь НЕ указывается.</w:t>
             </w:r>
           </w:p>
         </w:tc>
@@ -4064,7 +4709,7 @@
               <w:rPr>
                 <w:sz w:val="20"/>
               </w:rPr>
-              <w:t>ALL, MEN или WOMEN.</w:t>
+              <w:t>Пол: MEN или WOMEN — именно он делит дисциплину на два списка.</w:t>
             </w:r>
           </w:p>
         </w:tc>
@@ -4094,6 +4739,74 @@
     </w:p>
     <w:p>
       <w:pPr>
+        <w:pStyle w:val="Heading3"/>
+        <w:spacing w:before="160" w:after="20"/>
+      </w:pPr>
+      <w:r>
+        <w:rPr>
+          <w:b/>
+          <w:color w:val="2A2A44"/>
+          <w:sz w:val="23"/>
+        </w:rPr>
+        <w:t>Как добавить строку рейтинга</w:t>
+      </w:r>
+    </w:p>
+    <w:p>
+      <w:pPr>
+        <w:pStyle w:val="ListNumber"/>
+        <w:spacing w:after="40"/>
+      </w:pPr>
+      <w:r>
+        <w:rPr>
+          <w:b/>
+        </w:rPr>
+        <w:t>Ranking Detail → Create an entry.</w:t>
+      </w:r>
+      <w:r/>
+    </w:p>
+    <w:p>
+      <w:pPr>
+        <w:pStyle w:val="ListNumber"/>
+        <w:spacing w:after="40"/>
+      </w:pPr>
+      <w:r>
+        <w:rPr>
+          <w:b/>
+        </w:rPr>
+        <w:t>Впишите position, athleteName, country.</w:t>
+      </w:r>
+      <w:r/>
+    </w:p>
+    <w:p>
+      <w:pPr>
+        <w:pStyle w:val="ListNumber"/>
+        <w:spacing w:after="40"/>
+      </w:pPr>
+      <w:r>
+        <w:rPr>
+          <w:b/>
+        </w:rPr>
+        <w:t xml:space="preserve">Выберите discipline </w:t>
+      </w:r>
+      <w:r>
+        <w:t>(одно из семи значений) и category (MEN или WOMEN).</w:t>
+      </w:r>
+    </w:p>
+    <w:p>
+      <w:pPr>
+        <w:pStyle w:val="ListNumber"/>
+        <w:spacing w:after="40"/>
+      </w:pPr>
+      <w:r>
+        <w:rPr>
+          <w:b/>
+        </w:rPr>
+        <w:t>Save, затем Publish.</w:t>
+      </w:r>
+      <w:r/>
+    </w:p>
+    <w:p>
+      <w:pPr>
         <w:pStyle w:val="Heading2"/>
         <w:spacing w:before="200" w:after="40"/>
       </w:pPr>
@@ -4115,7 +4828,7 @@
           <w:i w:val="0"/>
           <w:sz w:val="22"/>
         </w:rPr>
-        <w:t>Кнопки «OFFICIAL PDF» на вкладках «Records» и «Ranking» берут файлы из коллекции Document — заводить отдельные ссылки в коде не нужно.</w:t>
+        <w:t>Кнопки «OFFICIAL PDF» на вкладках «Records» и «Ranking» берут файлы из коллекции Document — отдельно прописывать ссылки не нужно.</w:t>
       </w:r>
     </w:p>
     <w:p>
@@ -4130,7 +4843,7 @@
         <w:t xml:space="preserve">Рекорды </w:t>
       </w:r>
       <w:r>
-        <w:t>— документ с темой Records; нужная кнопка (Senior / U16-U18) определяется по слову в поле description.</w:t>
+        <w:t>— документ с темой (theme) Records; нужная кнопка (Senior или U16/U18) определяется по слову в поле description.</w:t>
       </w:r>
     </w:p>
     <w:p>
@@ -4145,7 +4858,7 @@
         <w:t xml:space="preserve">Рейтинг </w:t>
       </w:r>
       <w:r>
-        <w:t>— документ с темой Ranking, в названии указаны дисциплина и пол (например, «European Ranking — Trap Women»). Чтобы такой документ не попадал в общую библиотеку «Documents», у него должно быть заполнено поле eventSlug значением results-ranking.</w:t>
+        <w:t>— документ с темой Ranking, в названии которого указаны дисциплина и пол, например «European Ranking — Trap Women». Чтобы такой документ не попадал в общую библиотеку «Documents», у него в поле eventSlug должно стоять значение results-ranking. Для двенадцати текущих дисциплин такие документы уже созданы — чтобы обновить PDF, откройте нужный и замените файл.</w:t>
       </w:r>
     </w:p>
     <w:p>
@@ -4163,19 +4876,6 @@
     </w:p>
     <w:p>
       <w:pPr>
-        <w:pStyle w:val="Heading2"/>
-        <w:spacing w:before="200" w:after="40"/>
-      </w:pPr>
-      <w:r>
-        <w:rPr>
-          <w:color w:val="1D4E89"/>
-          <w:sz w:val="27"/>
-        </w:rPr>
-        <w:t>Document — библиотека документов</w:t>
-      </w:r>
-    </w:p>
-    <w:p>
-      <w:pPr>
         <w:spacing w:after="120"/>
       </w:pPr>
       <w:r>
@@ -4184,7 +4884,61 @@
           <w:i w:val="0"/>
           <w:sz w:val="22"/>
         </w:rPr>
-        <w:t>Материалы раздела «Documents», а также PDF рекордов/рейтинга и исторические архивы.</w:t>
+        <w:t>Коллекция Document наполняет раздел «Documents», а также хранит PDF рекордов/рейтинга и исторические архивы.</w:t>
+      </w:r>
+    </w:p>
+    <w:p>
+      <w:pPr>
+        <w:jc w:val="center"/>
+      </w:pPr>
+      <w:r>
+        <w:drawing>
+          <wp:inline xmlns:a="http://schemas.openxmlformats.org/drawingml/2006/main" xmlns:pic="http://schemas.openxmlformats.org/drawingml/2006/picture">
+            <wp:extent cx="5760720" cy="2319718"/>
+            <wp:docPr id="10" name="Picture 10"/>
+            <wp:cNvGraphicFramePr>
+              <a:graphicFrameLocks noChangeAspect="1"/>
+            </wp:cNvGraphicFramePr>
+            <a:graphic>
+              <a:graphicData uri="http://schemas.openxmlformats.org/drawingml/2006/picture">
+                <pic:pic>
+                  <pic:nvPicPr>
+                    <pic:cNvPr id="0" name="img_m9.png"/>
+                    <pic:cNvPicPr/>
+                  </pic:nvPicPr>
+                  <pic:blipFill>
+                    <a:blip r:embed="rId18"/>
+                    <a:stretch>
+                      <a:fillRect/>
+                    </a:stretch>
+                  </pic:blipFill>
+                  <pic:spPr>
+                    <a:xfrm>
+                      <a:off x="0" y="0"/>
+                      <a:ext cx="5760720" cy="2319718"/>
+                    </a:xfrm>
+                    <a:prstGeom prst="rect"/>
+                  </pic:spPr>
+                </pic:pic>
+              </a:graphicData>
+            </a:graphic>
+          </wp:inline>
+        </w:drawing>
+      </w:r>
+    </w:p>
+    <w:p>
+      <w:pPr>
+        <w:spacing w:after="200"/>
+        <w:jc w:val="center"/>
+      </w:pPr>
+      <w:r>
+        <w:rPr>
+          <w:b w:val="0"/>
+          <w:i/>
+          <w:color w:val="555566"/>
+          <w:sz w:val="18"/>
+        </w:rPr>
+        <w:t>Document: название, тема (раздел) и файл.</w:t>
       </w:r>
     </w:p>
     <w:tbl>
@@ -4275,7 +5029,7 @@
               <w:rPr>
                 <w:sz w:val="20"/>
               </w:rPr>
-              <w:t>Название документа. Обязательно.</w:t>
+              <w:t>Название документа.</w:t>
             </w:r>
           </w:p>
         </w:tc>
@@ -4324,7 +5078,7 @@
               <w:rPr>
                 <w:sz w:val="20"/>
               </w:rPr>
-              <w:t>Раздел документа: Official Documents, Assemblies, Records, Ranking, Competitions, European Championships и др.</w:t>
+              <w:t>Раздел документа — выбор из списка (см. Приложение): Official Documents, Assemblies, Records, Ranking, Competitions и др.</w:t>
             </w:r>
           </w:p>
         </w:tc>
@@ -4372,7 +5126,7 @@
               <w:rPr>
                 <w:sz w:val="20"/>
               </w:rPr>
-              <w:t>Дата документа, ГГГГ-ММ-ДД.</w:t>
+              <w:t>Дата документа.</w:t>
             </w:r>
           </w:p>
         </w:tc>
@@ -4514,7 +5268,7 @@
               <w:rPr>
                 <w:sz w:val="20"/>
               </w:rPr>
-              <w:t>Версия (например, v1.0).</w:t>
+              <w:t>Версия, например v1.0.</w:t>
             </w:r>
           </w:p>
         </w:tc>
@@ -4560,7 +5314,7 @@
               <w:rPr>
                 <w:sz w:val="20"/>
               </w:rPr>
-              <w:t>Размер файла для подписи (например, 0.5 MB).</w:t>
+              <w:t>Размер файла для подписи, например 0.5 MB.</w:t>
             </w:r>
           </w:p>
         </w:tc>
@@ -4741,19 +5495,6 @@
     </w:p>
     <w:p>
       <w:pPr>
-        <w:pStyle w:val="Heading2"/>
-        <w:spacing w:before="200" w:after="40"/>
-      </w:pPr>
-      <w:r>
-        <w:rPr>
-          <w:color w:val="1D4E89"/>
-          <w:sz w:val="27"/>
-        </w:rPr>
-        <w:t>Federation — национальные федерации</w:t>
-      </w:r>
-    </w:p>
-    <w:p>
-      <w:pPr>
         <w:spacing w:after="120"/>
       </w:pPr>
       <w:r>
@@ -4762,7 +5503,61 @@
           <w:i w:val="0"/>
           <w:sz w:val="22"/>
         </w:rPr>
-        <w:t>Записи раздела «Member Federations».</w:t>
+        <w:t>Коллекция Federation наполняет раздел «Member Federations».</w:t>
+      </w:r>
+    </w:p>
+    <w:p>
+      <w:pPr>
+        <w:jc w:val="center"/>
+      </w:pPr>
+      <w:r>
+        <w:drawing>
+          <wp:inline xmlns:a="http://schemas.openxmlformats.org/drawingml/2006/main" xmlns:pic="http://schemas.openxmlformats.org/drawingml/2006/picture">
+            <wp:extent cx="5760720" cy="2319718"/>
+            <wp:docPr id="11" name="Picture 11"/>
+            <wp:cNvGraphicFramePr>
+              <a:graphicFrameLocks noChangeAspect="1"/>
+            </wp:cNvGraphicFramePr>
+            <a:graphic>
+              <a:graphicData uri="http://schemas.openxmlformats.org/drawingml/2006/picture">
+                <pic:pic>
+                  <pic:nvPicPr>
+                    <pic:cNvPr id="0" name="img_m10.png"/>
+                    <pic:cNvPicPr/>
+                  </pic:nvPicPr>
+                  <pic:blipFill>
+                    <a:blip r:embed="rId19"/>
+                    <a:stretch>
+                      <a:fillRect/>
+                    </a:stretch>
+                  </pic:blipFill>
+                  <pic:spPr>
+                    <a:xfrm>
+                      <a:off x="0" y="0"/>
+                      <a:ext cx="5760720" cy="2319718"/>
+                    </a:xfrm>
+                    <a:prstGeom prst="rect"/>
+                  </pic:spPr>
+                </pic:pic>
+              </a:graphicData>
+            </a:graphic>
+          </wp:inline>
+        </w:drawing>
+      </w:r>
+    </w:p>
+    <w:p>
+      <w:pPr>
+        <w:spacing w:after="200"/>
+        <w:jc w:val="center"/>
+      </w:pPr>
+      <w:r>
+        <w:rPr>
+          <w:b w:val="0"/>
+          <w:i/>
+          <w:color w:val="555566"/>
+          <w:sz w:val="18"/>
+        </w:rPr>
+        <w:t>Federation: коды и регион выбираются точно, флаг подгружается по коду.</w:t>
       </w:r>
     </w:p>
     <w:tbl>
@@ -4853,7 +5648,7 @@
               <w:rPr>
                 <w:sz w:val="20"/>
               </w:rPr>
-              <w:t>Название федерации/страны. Обязательно.</w:t>
+              <w:t>Название федерации/страны.</w:t>
             </w:r>
           </w:p>
         </w:tc>
@@ -4902,7 +5697,7 @@
               <w:rPr>
                 <w:sz w:val="20"/>
               </w:rPr>
-              <w:t>Трёхбуквенный код (FRA). Обязательно.</w:t>
+              <w:t>Трёхбуквенный код (FRA).</w:t>
             </w:r>
           </w:p>
         </w:tc>
@@ -4950,7 +5745,7 @@
               <w:rPr>
                 <w:sz w:val="20"/>
               </w:rPr>
-              <w:t>Название страны. Обязательно.</w:t>
+              <w:t>Название страны.</w:t>
             </w:r>
           </w:p>
         </w:tc>
@@ -4999,7 +5794,7 @@
               <w:rPr>
                 <w:sz w:val="20"/>
               </w:rPr>
-              <w:t>Двухбуквенный код страны (FR). Обязательно.</w:t>
+              <w:t>Двухбуквенный код страны (FR).</w:t>
             </w:r>
           </w:p>
         </w:tc>
@@ -5047,7 +5842,7 @@
               <w:rPr>
                 <w:sz w:val="20"/>
               </w:rPr>
-              <w:t>Регион: W.EUROPE, SCANDINAVIA, C.EUROPE, E.EUROPE, S.EUROPE, CAUCASUS.</w:t>
+              <w:t>Регион — выбор из списка (см. Приложение).</w:t>
             </w:r>
           </w:p>
         </w:tc>
@@ -5283,7 +6078,7 @@
           <w:i w:val="0"/>
           <w:sz w:val="22"/>
         </w:rPr>
-        <w:t>Содержимое страницы «About Us / Discover» складывается из нескольких коллекций.</w:t>
+        <w:t>Страница «About Us» собирается из нескольких коллекций. Почти у всех есть поле order — оно задаёт порядок отображения (чем меньше число, тем выше).</w:t>
       </w:r>
     </w:p>
     <w:p>
@@ -5296,7 +6091,7 @@
           <w:color w:val="1D4E89"/>
           <w:sz w:val="27"/>
         </w:rPr>
-        <w:t>About Page — главный блок страницы</w:t>
+        <w:t>About Page — главный блок</w:t>
       </w:r>
     </w:p>
     <w:p>
@@ -5309,7 +6104,7 @@
           <w:i w:val="0"/>
           <w:sz w:val="22"/>
         </w:rPr>
-        <w:t>Одиночная запись: заголовки, текст миссии, статистика и изображение.</w:t>
+        <w:t>Одна запись с заголовками, текстом миссии, статистикой и изображением.</w:t>
       </w:r>
     </w:p>
     <w:tbl>
@@ -5400,7 +6195,7 @@
               <w:rPr>
                 <w:sz w:val="20"/>
               </w:rPr>
-              <w:t>Заголовок первого экрана (две строки). Обязательно.</w:t>
+              <w:t>Заголовок первого экрана (две строки).</w:t>
             </w:r>
           </w:p>
         </w:tc>
@@ -5686,7 +6481,7 @@
         <w:t xml:space="preserve">Leader </w:t>
       </w:r>
       <w:r>
-        <w:t>— руководители (name, role, image, order).</w:t>
+        <w:t>— руководители: name, role, image, order.</w:t>
       </w:r>
     </w:p>
     <w:p>
@@ -5701,7 +6496,7 @@
         <w:t xml:space="preserve">Presidium Member </w:t>
       </w:r>
       <w:r>
-        <w:t>— члены президиума (name, role, email, phone, image, order).</w:t>
+        <w:t>— члены президиума: name, role, email, phone, image, order.</w:t>
       </w:r>
     </w:p>
     <w:p>
@@ -5716,7 +6511,7 @@
         <w:t xml:space="preserve">Committee и Committee Member </w:t>
       </w:r>
       <w:r>
-        <w:t>— комитеты и их члены (у члена: name, role, country, image; привязка к комитету полем committee).</w:t>
+        <w:t>— комитеты и их члены. У члена: name, role, country, image; в поле committee выбирается, к какому комитету он относится.</w:t>
       </w:r>
     </w:p>
     <w:p>
@@ -5731,21 +6526,7 @@
         <w:t xml:space="preserve">Governance </w:t>
       </w:r>
       <w:r>
-        <w:t>— органы управления (type: legislative / executive; name; members; description).</w:t>
-      </w:r>
-    </w:p>
-    <w:p>
-      <w:pPr>
-        <w:spacing w:after="120"/>
-      </w:pPr>
-      <w:r>
-        <w:rPr>
-          <w:b w:val="0"/>
-          <w:i w:val="0"/>
-          <w:color w:val="555566"/>
-          <w:sz w:val="22"/>
-        </w:rPr>
-        <w:t>У всех перечисленных коллекций поле order задаёт порядок отображения (меньше — выше).</w:t>
+        <w:t>— органы управления: type (legislative или executive), name, members, description.</w:t>
       </w:r>
     </w:p>
     <w:p>
@@ -5758,7 +6539,7 @@
           <w:color w:val="1D4E89"/>
           <w:sz w:val="27"/>
         </w:rPr>
-        <w:t>Ценности, история и статистика</w:t>
+        <w:t>Ценности, история, показатели</w:t>
       </w:r>
     </w:p>
     <w:p>
@@ -5773,7 +6554,7 @@
         <w:t xml:space="preserve">Core Value </w:t>
       </w:r>
       <w:r>
-        <w:t>— ценности (title, text, iconKey: target / shield / globe, order).</w:t>
+        <w:t>— ценности: title, text, iconKey (target / shield / globe), order.</w:t>
       </w:r>
     </w:p>
     <w:p>
@@ -5788,7 +6569,7 @@
         <w:t xml:space="preserve">Heritage Milestone </w:t>
       </w:r>
       <w:r>
-        <w:t>— вехи истории (year, description, order).</w:t>
+        <w:t>— вехи истории: year, description, order.</w:t>
       </w:r>
     </w:p>
     <w:p>
@@ -5803,7 +6584,7 @@
         <w:t xml:space="preserve">Member Stat </w:t>
       </w:r>
       <w:r>
-        <w:t>— показатели (number, label, order).</w:t>
+        <w:t>— показатели: number, label, order.</w:t>
       </w:r>
     </w:p>
     <w:p>
@@ -5831,7 +6612,7 @@
         <w:t xml:space="preserve">Championship </w:t>
       </w:r>
       <w:r>
-        <w:t>— баннер чемпионата на главной (title, city, location, dateRange, startDate, image).</w:t>
+        <w:t>— баннер чемпионата на главной: title, city, location, dateRange, startDate, image.</w:t>
       </w:r>
     </w:p>
     <w:p>
@@ -5846,7 +6627,7 @@
         <w:t xml:space="preserve">ESC Platform </w:t>
       </w:r>
       <w:r>
-        <w:t>— блок платформы на главной (title, text, buttonLabel, buttonLink).</w:t>
+        <w:t>— блок платформы на главной: title, text, buttonLabel, buttonLink.</w:t>
       </w:r>
     </w:p>
     <w:p>
@@ -5861,7 +6642,7 @@
         <w:t xml:space="preserve">Partner </w:t>
       </w:r>
       <w:r>
-        <w:t>— партнёры и спонсоры (name, type: partner / sponsor, logo, url, order).</w:t>
+        <w:t>— партнёры и спонсоры: name, type (partner или sponsor), logo, url, order.</w:t>
       </w:r>
     </w:p>
     <w:p>
@@ -5876,7 +6657,7 @@
         <w:t xml:space="preserve">Social Link </w:t>
       </w:r>
       <w:r>
-        <w:t>— ссылки на соцсети в подвале (platform, icon, url, order).</w:t>
+        <w:t>— ссылки на соцсети в подвале сайта: platform, icon, url, order.</w:t>
       </w:r>
     </w:p>
     <w:p>
@@ -5894,19 +6675,6 @@
     </w:p>
     <w:p>
       <w:pPr>
-        <w:pStyle w:val="Heading2"/>
-        <w:spacing w:before="200" w:after="40"/>
-      </w:pPr>
-      <w:r>
-        <w:rPr>
-          <w:color w:val="1D4E89"/>
-          <w:sz w:val="27"/>
-        </w:rPr>
-        <w:t>Contact Message — сообщения с формы обратной связи</w:t>
-      </w:r>
-    </w:p>
-    <w:p>
-      <w:pPr>
         <w:spacing w:after="120"/>
       </w:pPr>
       <w:r>
@@ -5915,7 +6683,12 @@
           <w:i w:val="0"/>
           <w:sz w:val="22"/>
         </w:rPr>
-        <w:t>Сообщения, отправленные посетителями через форму «Contacts». Создаются автоматически; вручную не заполняются. Поле handled можно использовать как отметку об обработке.</w:t>
+        <w:t>Contact Message — сообщения, отправленные посетителями через форму «Contacts». Эти записи создаются автоматически и вручную не заполняются. Поле handled можно использовать как отметку «обработано».</w:t>
+      </w:r>
+    </w:p>
+    <w:p>
+      <w:r>
+        <w:br w:type="page"/>
       </w:r>
     </w:p>
     <w:p>
@@ -5928,7 +6701,20 @@
           <w:color w:val="0B2A4A"/>
           <w:sz w:val="34"/>
         </w:rPr>
-        <w:t>Приложение. Справочник дисциплин</w:t>
+        <w:t>Приложение A. Справочник дисциплин</w:t>
+      </w:r>
+    </w:p>
+    <w:p>
+      <w:pPr>
+        <w:spacing w:after="120"/>
+      </w:pPr>
+      <w:r>
+        <w:rPr>
+          <w:b w:val="0"/>
+          <w:i w:val="0"/>
+          <w:sz w:val="22"/>
+        </w:rPr>
+        <w:t>Названия дисциплин сопоставляются буквально — регистр, пробелы и написание должны точно совпадать. Ниже перечислены все допустимые значения.</w:t>
       </w:r>
     </w:p>
     <w:p>
@@ -5941,7 +6727,20 @@
           <w:color w:val="1D4E89"/>
           <w:sz w:val="27"/>
         </w:rPr>
-        <w:t>Рейтинг (Ranking Detail) — ровно семь значений</w:t>
+        <w:t>A.1. Рейтинг (Ranking Detail) — 7 значений поля discipline</w:t>
+      </w:r>
+    </w:p>
+    <w:p>
+      <w:pPr>
+        <w:spacing w:after="120"/>
+      </w:pPr>
+      <w:r>
+        <w:rPr>
+          <w:b w:val="0"/>
+          <w:i w:val="0"/>
+          <w:sz w:val="22"/>
+        </w:rPr>
+        <w:t>В поле discipline пишется одно из семи значений. Пол задаётся отдельно полем category (MEN / WOMEN).</w:t>
       </w:r>
     </w:p>
     <w:p>
@@ -5952,6 +6751,7 @@
         <w:rPr>
           <w:b/>
           <w:i w:val="0"/>
+          <w:color w:val="0B2A4A"/>
           <w:sz w:val="22"/>
         </w:rPr>
         <w:t>10m Air Pistol · 10m Air Rifle · 25m Pistol · 25m Rapid Fire Pistol · 50m Rifle 3 Position · Skeet · Trap</w:t>
@@ -5965,10 +6765,69 @@
         <w:rPr>
           <w:b w:val="0"/>
           <w:i w:val="0"/>
-          <w:color w:val="555566"/>
           <w:sz w:val="22"/>
         </w:rPr>
-        <w:t>Для каждой дисциплины ведётся отдельный список для категории MEN и для WOMEN.</w:t>
+        <w:t>Двенадцать карточек на сайте получаются так:</w:t>
+      </w:r>
+    </w:p>
+    <w:p>
+      <w:pPr>
+        <w:pStyle w:val="ListBullet"/>
+        <w:spacing w:after="40"/>
+      </w:pPr>
+      <w:r>
+        <w:rPr>
+          <w:b/>
+        </w:rPr>
+        <w:t xml:space="preserve">С обоими полами (MEN и WOMEN) </w:t>
+      </w:r>
+      <w:r>
+        <w:t>— 10m Air Pistol, 10m Air Rifle, 50m Rifle 3 Position, Skeet, Trap.</w:t>
+      </w:r>
+    </w:p>
+    <w:p>
+      <w:pPr>
+        <w:pStyle w:val="ListBullet"/>
+        <w:spacing w:after="40"/>
+      </w:pPr>
+      <w:r>
+        <w:rPr>
+          <w:b/>
+        </w:rPr>
+        <w:t xml:space="preserve">Только MEN </w:t>
+      </w:r>
+      <w:r>
+        <w:t>— 25m Rapid Fire Pistol.</w:t>
+      </w:r>
+    </w:p>
+    <w:p>
+      <w:pPr>
+        <w:pStyle w:val="ListBullet"/>
+        <w:spacing w:after="40"/>
+      </w:pPr>
+      <w:r>
+        <w:rPr>
+          <w:b/>
+        </w:rPr>
+        <w:t xml:space="preserve">Только WOMEN </w:t>
+      </w:r>
+      <w:r>
+        <w:t>— 25m Pistol.</w:t>
+      </w:r>
+    </w:p>
+    <w:p>
+      <w:pPr>
+        <w:spacing w:after="120"/>
+      </w:pPr>
+      <w:r>
+        <w:rPr>
+          <w:b/>
+          <w:color w:val="0A7E8C"/>
+        </w:rPr>
+        <w:t xml:space="preserve">Не путать с рекордами: </w:t>
+      </w:r>
+      <w:r>
+        <w:t>здесь пишется «50m Rifle 3 Position» (в единственном числе — Position). В рекордах та же дисциплина называется «50m Rifle 3 Positions» (во множественном — Positions).</w:t>
       </w:r>
     </w:p>
     <w:p>
@@ -5981,95 +6840,7 @@
           <w:color w:val="1D4E89"/>
           <w:sz w:val="27"/>
         </w:rPr>
-        <w:t>Рекорды (Record) — по образцу существующих записей</w:t>
-      </w:r>
-    </w:p>
-    <w:p>
-      <w:pPr>
-        <w:pStyle w:val="ListBullet"/>
-        <w:spacing w:after="40"/>
-      </w:pPr>
-      <w:r>
-        <w:rPr>
-          <w:b/>
-        </w:rPr>
-        <w:t xml:space="preserve">Мужчины </w:t>
-      </w:r>
-      <w:r>
-        <w:t>— 50m Rifle 3 Positions Men, 10m Air Pistol Men, Trap Men.</w:t>
-      </w:r>
-    </w:p>
-    <w:p>
-      <w:pPr>
-        <w:pStyle w:val="ListBullet"/>
-        <w:spacing w:after="40"/>
-      </w:pPr>
-      <w:r>
-        <w:rPr>
-          <w:b/>
-        </w:rPr>
-        <w:t xml:space="preserve">Женщины </w:t>
-      </w:r>
-      <w:r>
-        <w:t>— Trap Women, 10m Air Rifle Women.</w:t>
-      </w:r>
-    </w:p>
-    <w:p>
-      <w:pPr>
-        <w:pStyle w:val="ListBullet"/>
-        <w:spacing w:after="40"/>
-      </w:pPr>
-      <w:r>
-        <w:rPr>
-          <w:b/>
-        </w:rPr>
-        <w:t xml:space="preserve">Юниоры </w:t>
-      </w:r>
-      <w:r>
-        <w:t>— 10m Air Pistol U16 Men, 10m Air Pistol U18 Women.</w:t>
-      </w:r>
-    </w:p>
-    <w:p>
-      <w:pPr>
-        <w:pStyle w:val="ListBullet"/>
-        <w:spacing w:after="40"/>
-      </w:pPr>
-      <w:r>
-        <w:rPr>
-          <w:b/>
-        </w:rPr>
-        <w:t xml:space="preserve">Команда / микст </w:t>
-      </w:r>
-      <w:r>
-        <w:t>— 10m Air Pistol Mixed Team.</w:t>
-      </w:r>
-    </w:p>
-    <w:p>
-      <w:pPr>
-        <w:spacing w:after="120"/>
-      </w:pPr>
-      <w:r>
-        <w:rPr>
-          <w:b/>
-          <w:color w:val="0A7E8C"/>
-        </w:rPr>
-        <w:t xml:space="preserve">Обратите внимание: </w:t>
-      </w:r>
-      <w:r>
-        <w:t>в рекордах пишется «3 Positions» (множественное число), в рейтинге — «3 Position» (единственное). Это разные коллекции; всегда сверяйтесь с уже существующей записью той же дисциплины.</w:t>
-      </w:r>
-    </w:p>
-    <w:p>
-      <w:pPr>
-        <w:pStyle w:val="Heading2"/>
-        <w:spacing w:before="200" w:after="40"/>
-      </w:pPr>
-      <w:r>
-        <w:rPr>
-          <w:color w:val="1D4E89"/>
-          <w:sz w:val="27"/>
-        </w:rPr>
-        <w:t>Результаты (Result Detail)</w:t>
+        <w:t>A.2. Рекорды (Record) — все 108 вариантов поля discipline</w:t>
       </w:r>
     </w:p>
     <w:p>
@@ -6082,7 +6853,663 @@
           <w:i w:val="0"/>
           <w:sz w:val="22"/>
         </w:rPr>
-        <w:t>Дисциплина указывается ЗАГЛАВНЫМИ буквами, например 10M AIR RIFLE.</w:t>
+        <w:t>В рекордах название включает вид, тип зачёта (Solo / Duet / Trio / Mixed Team), возраст (U16 / U18) и пол. Ниже — полный список, сгруппированный по виду. Проще всего скопировать нужную строку отсюда или из существующего рекорда.</w:t>
+      </w:r>
+    </w:p>
+    <w:p>
+      <w:pPr>
+        <w:spacing w:after="60"/>
+      </w:pPr>
+      <w:r>
+        <w:rPr>
+          <w:b/>
+          <w:color w:val="0B2A4A"/>
+        </w:rPr>
+        <w:t xml:space="preserve">10m Air Pistol (21): </w:t>
+      </w:r>
+      <w:r>
+        <w:rPr>
+          <w:sz w:val="21"/>
+        </w:rPr>
+        <w:t>10m Air Pistol Duet U16  ·  10m Air Pistol Duet U18  ·  10m Air Pistol Men  ·  10m Air Pistol Mixed Team  ·  10m Air Pistol Solo Men  ·  10m Air Pistol Solo U16 Men  ·  10m Air Pistol Solo U16 Women  ·  10m Air Pistol Solo U18 Men  ·  10m Air Pistol Solo U18 Women  ·  10m Air Pistol Solo Women  ·  10m Air Pistol Trio Men  ·  10m Air Pistol Trio U16 Men  ·  10m Air Pistol Trio U16 Women  ·  10m Air Pistol Trio U18 Men  ·  10m Air Pistol Trio U18 Women  ·  10m Air Pistol Trio Women  ·  10m Air Pistol U16 Men  ·  10m Air Pistol U16 Women  ·  10m Air Pistol U18 Men  ·  10m Air Pistol U18 Women  ·  10m Air Pistol Women</w:t>
+      </w:r>
+    </w:p>
+    <w:p>
+      <w:pPr>
+        <w:spacing w:after="60"/>
+      </w:pPr>
+      <w:r>
+        <w:rPr>
+          <w:b/>
+          <w:color w:val="0B2A4A"/>
+        </w:rPr>
+        <w:t xml:space="preserve">10m Air Rifle (21): </w:t>
+      </w:r>
+      <w:r>
+        <w:rPr>
+          <w:sz w:val="21"/>
+        </w:rPr>
+        <w:t>10m Air Rifle Duet U16  ·  10m Air Rifle Duet U18  ·  10m Air Rifle Men  ·  10m Air Rifle Mixed Team  ·  10m Air Rifle Solo Men  ·  10m Air Rifle Solo U16 Men  ·  10m Air Rifle Solo U16 Women  ·  10m Air Rifle Solo U18 Men  ·  10m Air Rifle Solo U18 Women  ·  10m Air Rifle Solo Women  ·  10m Air Rifle Trio Men  ·  10m Air Rifle Trio U16 Men  ·  10m Air Rifle Trio U16 Women  ·  10m Air Rifle Trio U18 Men  ·  10m Air Rifle Trio U18 Women  ·  10m Air Rifle Trio Women  ·  10m Air Rifle U16 Men  ·  10m Air Rifle U16 Women  ·  10m Air Rifle U18 Men  ·  10m Air Rifle U18 Women  ·  10m Air Rifle Women</w:t>
+      </w:r>
+    </w:p>
+    <w:p>
+      <w:pPr>
+        <w:spacing w:after="60"/>
+      </w:pPr>
+      <w:r>
+        <w:rPr>
+          <w:b/>
+          <w:color w:val="0B2A4A"/>
+        </w:rPr>
+        <w:t xml:space="preserve">10m Moving Target (5): </w:t>
+      </w:r>
+      <w:r>
+        <w:rPr>
+          <w:sz w:val="21"/>
+        </w:rPr>
+        <w:t>10m Moving Target Men  ·  10m Moving Target Mixed Men  ·  10m Moving Target Mixed Team  ·  10m Moving Target Mixed Women  ·  10m Moving Target Women</w:t>
+      </w:r>
+    </w:p>
+    <w:p>
+      <w:pPr>
+        <w:spacing w:after="60"/>
+      </w:pPr>
+      <w:r>
+        <w:rPr>
+          <w:b/>
+          <w:color w:val="0B2A4A"/>
+        </w:rPr>
+        <w:t xml:space="preserve">25m Center Fire Pistol (2): </w:t>
+      </w:r>
+      <w:r>
+        <w:rPr>
+          <w:sz w:val="21"/>
+        </w:rPr>
+        <w:t>25m Center Fire Pistol Men  ·  25m Center Fire Pistol Open</w:t>
+      </w:r>
+    </w:p>
+    <w:p>
+      <w:pPr>
+        <w:spacing w:after="60"/>
+      </w:pPr>
+      <w:r>
+        <w:rPr>
+          <w:b/>
+          <w:color w:val="0B2A4A"/>
+        </w:rPr>
+        <w:t xml:space="preserve">25m Rapid Fire Pistol (3): </w:t>
+      </w:r>
+      <w:r>
+        <w:rPr>
+          <w:sz w:val="21"/>
+        </w:rPr>
+        <w:t>25m Rapid Fire Pistol Men  ·  25m Rapid Fire Pistol Mixed Team  ·  25m Rapid Fire Pistol Trio Men</w:t>
+      </w:r>
+    </w:p>
+    <w:p>
+      <w:pPr>
+        <w:spacing w:after="60"/>
+      </w:pPr>
+      <w:r>
+        <w:rPr>
+          <w:b/>
+          <w:color w:val="0B2A4A"/>
+        </w:rPr>
+        <w:t xml:space="preserve">25m Standard Pistol (4): </w:t>
+      </w:r>
+      <w:r>
+        <w:rPr>
+          <w:sz w:val="21"/>
+        </w:rPr>
+        <w:t>25m Standard Pistol Men  ·  25m Standard Pistol Mixed Team  ·  25m Standard Pistol Open  ·  25m Standard Pistol Women</w:t>
+      </w:r>
+    </w:p>
+    <w:p>
+      <w:pPr>
+        <w:spacing w:after="60"/>
+      </w:pPr>
+      <w:r>
+        <w:rPr>
+          <w:b/>
+          <w:color w:val="0B2A4A"/>
+        </w:rPr>
+        <w:t xml:space="preserve">25m Pistol (4): </w:t>
+      </w:r>
+      <w:r>
+        <w:rPr>
+          <w:sz w:val="21"/>
+        </w:rPr>
+        <w:t>25m Pistol Duet  ·  25m Pistol Men Junior  ·  25m Pistol Trio Women  ·  25m Pistol Women</w:t>
+      </w:r>
+    </w:p>
+    <w:p>
+      <w:pPr>
+        <w:spacing w:after="60"/>
+      </w:pPr>
+      <w:r>
+        <w:rPr>
+          <w:b/>
+          <w:color w:val="0B2A4A"/>
+        </w:rPr>
+        <w:t xml:space="preserve">300m Rifle 3 Positions (4): </w:t>
+      </w:r>
+      <w:r>
+        <w:rPr>
+          <w:sz w:val="21"/>
+        </w:rPr>
+        <w:t>300m Rifle 3 Positions Men  ·  300m Rifle 3 Positions Trio Men  ·  300m Rifle 3 Positions Trio Women  ·  300m Rifle 3 Positions Women</w:t>
+      </w:r>
+    </w:p>
+    <w:p>
+      <w:pPr>
+        <w:spacing w:after="60"/>
+      </w:pPr>
+      <w:r>
+        <w:rPr>
+          <w:b/>
+          <w:color w:val="0B2A4A"/>
+        </w:rPr>
+        <w:t xml:space="preserve">300m Rifle Prone (2): </w:t>
+      </w:r>
+      <w:r>
+        <w:rPr>
+          <w:sz w:val="21"/>
+        </w:rPr>
+        <w:t>300m Rifle Prone Men  ·  300m Rifle Prone Women</w:t>
+      </w:r>
+    </w:p>
+    <w:p>
+      <w:pPr>
+        <w:spacing w:after="60"/>
+      </w:pPr>
+      <w:r>
+        <w:rPr>
+          <w:b/>
+          <w:color w:val="0B2A4A"/>
+        </w:rPr>
+        <w:t xml:space="preserve">300m Rifle Mixed Team (1): </w:t>
+      </w:r>
+      <w:r>
+        <w:rPr>
+          <w:sz w:val="21"/>
+        </w:rPr>
+        <w:t>300m Rifle Mixed Team</w:t>
+      </w:r>
+    </w:p>
+    <w:p>
+      <w:pPr>
+        <w:spacing w:after="60"/>
+      </w:pPr>
+      <w:r>
+        <w:rPr>
+          <w:b/>
+          <w:color w:val="0B2A4A"/>
+        </w:rPr>
+        <w:t xml:space="preserve">300m Standard Rifle (3): </w:t>
+      </w:r>
+      <w:r>
+        <w:rPr>
+          <w:sz w:val="21"/>
+        </w:rPr>
+        <w:t>300m Standard Rifle Men  ·  300m Standard Rifle Open  ·  300m Standard Rifle Women</w:t>
+      </w:r>
+    </w:p>
+    <w:p>
+      <w:pPr>
+        <w:spacing w:after="60"/>
+      </w:pPr>
+      <w:r>
+        <w:rPr>
+          <w:b/>
+          <w:color w:val="0B2A4A"/>
+        </w:rPr>
+        <w:t xml:space="preserve">50m Moving Target (5): </w:t>
+      </w:r>
+      <w:r>
+        <w:rPr>
+          <w:sz w:val="21"/>
+        </w:rPr>
+        <w:t>50m Moving Target Men  ·  50m Moving Target Mixed Men  ·  50m Moving Target Mixed Team  ·  50m Moving Target Mixed Women  ·  50m Moving Target Women</w:t>
+      </w:r>
+    </w:p>
+    <w:p>
+      <w:pPr>
+        <w:spacing w:after="60"/>
+      </w:pPr>
+      <w:r>
+        <w:rPr>
+          <w:b/>
+          <w:color w:val="0B2A4A"/>
+        </w:rPr>
+        <w:t xml:space="preserve">50m Rifle 3 Positions (6): </w:t>
+      </w:r>
+      <w:r>
+        <w:rPr>
+          <w:sz w:val="21"/>
+        </w:rPr>
+        <w:t>50m Rifle 3 Positions Duet  ·  50m Rifle 3 Positions Men  ·  50m Rifle 3 Positions Mixed Team  ·  50m Rifle 3 Positions Trio Men  ·  50m Rifle 3 Positions Trio Women  ·  50m Rifle 3 Positions Women</w:t>
+      </w:r>
+    </w:p>
+    <w:p>
+      <w:pPr>
+        <w:spacing w:after="60"/>
+      </w:pPr>
+      <w:r>
+        <w:rPr>
+          <w:b/>
+          <w:color w:val="0B2A4A"/>
+        </w:rPr>
+        <w:t xml:space="preserve">50m Rifle Prone (3): </w:t>
+      </w:r>
+      <w:r>
+        <w:rPr>
+          <w:sz w:val="21"/>
+        </w:rPr>
+        <w:t>50m Rifle Prone Men  ·  50m Rifle Prone Mixed Team  ·  50m Rifle Prone Women</w:t>
+      </w:r>
+    </w:p>
+    <w:p>
+      <w:pPr>
+        <w:spacing w:after="60"/>
+      </w:pPr>
+      <w:r>
+        <w:rPr>
+          <w:b/>
+          <w:color w:val="0B2A4A"/>
+        </w:rPr>
+        <w:t xml:space="preserve">50m Pistol (4): </w:t>
+      </w:r>
+      <w:r>
+        <w:rPr>
+          <w:sz w:val="21"/>
+        </w:rPr>
+        <w:t>50m Pistol Men  ·  50m Pistol Mixed Team  ·  50m Pistol Open  ·  50m Pistol Women</w:t>
+      </w:r>
+    </w:p>
+    <w:p>
+      <w:pPr>
+        <w:spacing w:after="60"/>
+      </w:pPr>
+      <w:r>
+        <w:rPr>
+          <w:b/>
+          <w:color w:val="0B2A4A"/>
+        </w:rPr>
+        <w:t xml:space="preserve">Skeet (11): </w:t>
+      </w:r>
+      <w:r>
+        <w:rPr>
+          <w:sz w:val="21"/>
+        </w:rPr>
+        <w:t>Skeet Duet  ·  Skeet Duet U18  ·  Skeet Men  ·  Skeet Men U18  ·  Skeet Mixed Team  ·  Skeet Trio Men  ·  Skeet Trio Men U18  ·  Skeet Trio Women  ·  Skeet Trio Women U18  ·  Skeet Women  ·  Skeet Women U18</w:t>
+      </w:r>
+    </w:p>
+    <w:p>
+      <w:pPr>
+        <w:spacing w:after="60"/>
+      </w:pPr>
+      <w:r>
+        <w:rPr>
+          <w:b/>
+          <w:color w:val="0B2A4A"/>
+        </w:rPr>
+        <w:t xml:space="preserve">Trap (9): </w:t>
+      </w:r>
+      <w:r>
+        <w:rPr>
+          <w:sz w:val="21"/>
+        </w:rPr>
+        <w:t>Trap Duet U18  ·  Trap Men  ·  Trap Men U18  ·  Trap Mixed Team  ·  Trap Trio Men  ·  Trap Trio Men U18  ·  Trap Trio Women  ·  Trap Women  ·  Trap Women U18</w:t>
+      </w:r>
+    </w:p>
+    <w:p>
+      <w:pPr>
+        <w:pStyle w:val="Heading2"/>
+        <w:spacing w:before="200" w:after="40"/>
+      </w:pPr>
+      <w:r>
+        <w:rPr>
+          <w:color w:val="1D4E89"/>
+          <w:sz w:val="27"/>
+        </w:rPr>
+        <w:t>A.3. Коды рекордов (поле type)</w:t>
+      </w:r>
+    </w:p>
+    <w:p>
+      <w:pPr>
+        <w:spacing w:after="120"/>
+      </w:pPr>
+      <w:r>
+        <w:rPr>
+          <w:b w:val="0"/>
+          <w:i w:val="0"/>
+          <w:sz w:val="22"/>
+        </w:rPr>
+        <w:t>Код строится из букв: ER — European Record. Приставки и суффиксы уточняют вид рекорда.</w:t>
+      </w:r>
+    </w:p>
+    <w:p>
+      <w:pPr>
+        <w:pStyle w:val="ListBullet"/>
+        <w:spacing w:after="40"/>
+      </w:pPr>
+      <w:r>
+        <w:rPr>
+          <w:b/>
+        </w:rPr>
+        <w:t xml:space="preserve">E… (в начале) </w:t>
+      </w:r>
+      <w:r>
+        <w:t>— Equalled: повторение (равенство) существующего рекорда.</w:t>
+      </w:r>
+    </w:p>
+    <w:p>
+      <w:pPr>
+        <w:pStyle w:val="ListBullet"/>
+        <w:spacing w:after="40"/>
+      </w:pPr>
+      <w:r>
+        <w:rPr>
+          <w:b/>
+        </w:rPr>
+        <w:t xml:space="preserve">Q… (в начале) </w:t>
+      </w:r>
+      <w:r>
+        <w:t>— Qualification: рекорд установлен в квалификации.</w:t>
+      </w:r>
+    </w:p>
+    <w:p>
+      <w:pPr>
+        <w:pStyle w:val="ListBullet"/>
+        <w:spacing w:after="40"/>
+      </w:pPr>
+      <w:r>
+        <w:rPr>
+          <w:b/>
+        </w:rPr>
+        <w:t xml:space="preserve">…J </w:t>
+      </w:r>
+      <w:r>
+        <w:t>— Junior: юниорский.</w:t>
+      </w:r>
+    </w:p>
+    <w:p>
+      <w:pPr>
+        <w:pStyle w:val="ListBullet"/>
+        <w:spacing w:after="40"/>
+      </w:pPr>
+      <w:r>
+        <w:rPr>
+          <w:b/>
+        </w:rPr>
+        <w:t xml:space="preserve">…T </w:t>
+      </w:r>
+      <w:r>
+        <w:t>— Team: командный.</w:t>
+      </w:r>
+    </w:p>
+    <w:p>
+      <w:pPr>
+        <w:spacing w:after="120"/>
+      </w:pPr>
+      <w:r>
+        <w:rPr>
+          <w:b/>
+          <w:i w:val="0"/>
+          <w:color w:val="0B2A4A"/>
+          <w:sz w:val="22"/>
+        </w:rPr>
+        <w:t>Все встречающиеся коды: ER, EER, QER, EQER, ERT, EERT, QERT, ERJ, EERJ, QERJ, EQERJ, ERJT, EERJT, QERJT.</w:t>
+      </w:r>
+    </w:p>
+    <w:p>
+      <w:pPr>
+        <w:pStyle w:val="Heading2"/>
+        <w:spacing w:before="200" w:after="40"/>
+      </w:pPr>
+      <w:r>
+        <w:rPr>
+          <w:color w:val="1D4E89"/>
+          <w:sz w:val="27"/>
+        </w:rPr>
+        <w:t>A.4. Результаты (Result Detail)</w:t>
+      </w:r>
+    </w:p>
+    <w:p>
+      <w:pPr>
+        <w:spacing w:after="120"/>
+      </w:pPr>
+      <w:r>
+        <w:rPr>
+          <w:b w:val="0"/>
+          <w:i w:val="0"/>
+          <w:sz w:val="22"/>
+        </w:rPr>
+        <w:t>Дисциплина указывается ЗАГЛАВНЫМИ буквами, например: 10M AIR RIFLE, 25M PISTOL, TRAP.</w:t>
+      </w:r>
+    </w:p>
+    <w:p>
+      <w:pPr>
+        <w:pStyle w:val="Heading1"/>
+        <w:spacing w:before="280" w:after="80"/>
+      </w:pPr>
+      <w:r>
+        <w:rPr>
+          <w:color w:val="0B2A4A"/>
+          <w:sz w:val="34"/>
+        </w:rPr>
+        <w:t>Приложение B. Списки значений (выпадающие поля)</w:t>
+      </w:r>
+    </w:p>
+    <w:p>
+      <w:pPr>
+        <w:spacing w:after="120"/>
+      </w:pPr>
+      <w:r>
+        <w:rPr>
+          <w:b w:val="0"/>
+          <w:i w:val="0"/>
+          <w:sz w:val="22"/>
+        </w:rPr>
+        <w:t>Поля-списки принимают только перечисленные значения.</w:t>
+      </w:r>
+    </w:p>
+    <w:p>
+      <w:pPr>
+        <w:spacing w:after="60"/>
+      </w:pPr>
+      <w:r>
+        <w:rPr>
+          <w:b/>
+          <w:color w:val="0B2A4A"/>
+        </w:rPr>
+        <w:t xml:space="preserve">News Item · theme: </w:t>
+      </w:r>
+      <w:r>
+        <w:rPr>
+          <w:sz w:val="21"/>
+        </w:rPr>
+        <w:t>NEWS · FEATURES · INTERVIEWS · PRESS · RELEASES · CHAMPIONSHIP · EDUCATION</w:t>
+      </w:r>
+    </w:p>
+    <w:p>
+      <w:pPr>
+        <w:spacing w:after="60"/>
+      </w:pPr>
+      <w:r>
+        <w:rPr>
+          <w:b/>
+          <w:color w:val="0B2A4A"/>
+        </w:rPr>
+        <w:t xml:space="preserve">Document · theme: </w:t>
+      </w:r>
+      <w:r>
+        <w:rPr>
+          <w:sz w:val="21"/>
+        </w:rPr>
+        <w:t>Official Documents · Assemblies · Sustainability · Courses · PRESS RELEASES · Records · Ranking · Competitions · European Championships · European Champions League · European Youth League · European Cup 25m · European Cup 300m · ESC Air Cup · European Games · European Youth Olympic Festival · Olympic Games</w:t>
+      </w:r>
+    </w:p>
+    <w:p>
+      <w:pPr>
+        <w:spacing w:after="60"/>
+      </w:pPr>
+      <w:r>
+        <w:rPr>
+          <w:b/>
+          <w:color w:val="0B2A4A"/>
+        </w:rPr>
+        <w:t xml:space="preserve">Event · type: </w:t>
+      </w:r>
+      <w:r>
+        <w:rPr>
+          <w:sz w:val="21"/>
+        </w:rPr>
+        <w:t>competition · education · meeting</w:t>
+      </w:r>
+    </w:p>
+    <w:p>
+      <w:pPr>
+        <w:spacing w:after="60"/>
+      </w:pPr>
+      <w:r>
+        <w:rPr>
+          <w:b/>
+          <w:color w:val="0B2A4A"/>
+        </w:rPr>
+        <w:t xml:space="preserve">Event · statusEvent: </w:t>
+      </w:r>
+      <w:r>
+        <w:rPr>
+          <w:sz w:val="21"/>
+        </w:rPr>
+        <w:t>UPCOMING · FINISHED</w:t>
+      </w:r>
+    </w:p>
+    <w:p>
+      <w:pPr>
+        <w:spacing w:after="60"/>
+      </w:pPr>
+      <w:r>
+        <w:rPr>
+          <w:b/>
+          <w:color w:val="0B2A4A"/>
+        </w:rPr>
+        <w:t xml:space="preserve">Record · category: </w:t>
+      </w:r>
+      <w:r>
+        <w:rPr>
+          <w:sz w:val="21"/>
+        </w:rPr>
+        <w:t>ALL · MEN · WOMEN · MIXED</w:t>
+      </w:r>
+    </w:p>
+    <w:p>
+      <w:pPr>
+        <w:spacing w:after="60"/>
+      </w:pPr>
+      <w:r>
+        <w:rPr>
+          <w:b/>
+          <w:color w:val="0B2A4A"/>
+        </w:rPr>
+        <w:t xml:space="preserve">Ranking Detail и Result Detail · category: </w:t>
+      </w:r>
+      <w:r>
+        <w:rPr>
+          <w:sz w:val="21"/>
+        </w:rPr>
+        <w:t>ALL · MEN · WOMEN</w:t>
+      </w:r>
+    </w:p>
+    <w:p>
+      <w:pPr>
+        <w:spacing w:after="60"/>
+      </w:pPr>
+      <w:r>
+        <w:rPr>
+          <w:b/>
+          <w:color w:val="0B2A4A"/>
+        </w:rPr>
+        <w:t xml:space="preserve">Federation · region: </w:t>
+      </w:r>
+      <w:r>
+        <w:rPr>
+          <w:sz w:val="21"/>
+        </w:rPr>
+        <w:t>W.EUROPE · SCANDINAVIA · C.EUROPE · E.EUROPE · S.EUROPE · CAUCASUS</w:t>
+      </w:r>
+    </w:p>
+    <w:p>
+      <w:pPr>
+        <w:spacing w:after="60"/>
+      </w:pPr>
+      <w:r>
+        <w:rPr>
+          <w:b/>
+          <w:color w:val="0B2A4A"/>
+        </w:rPr>
+        <w:t xml:space="preserve">Live Stream · platform: </w:t>
+      </w:r>
+      <w:r>
+        <w:rPr>
+          <w:sz w:val="21"/>
+        </w:rPr>
+        <w:t>youtube · facebook</w:t>
+      </w:r>
+    </w:p>
+    <w:p>
+      <w:pPr>
+        <w:spacing w:after="60"/>
+      </w:pPr>
+      <w:r>
+        <w:rPr>
+          <w:b/>
+          <w:color w:val="0B2A4A"/>
+        </w:rPr>
+        <w:t xml:space="preserve">Partner · type: </w:t>
+      </w:r>
+      <w:r>
+        <w:rPr>
+          <w:sz w:val="21"/>
+        </w:rPr>
+        <w:t>partner · sponsor</w:t>
+      </w:r>
+    </w:p>
+    <w:p>
+      <w:pPr>
+        <w:spacing w:after="60"/>
+      </w:pPr>
+      <w:r>
+        <w:rPr>
+          <w:b/>
+          <w:color w:val="0B2A4A"/>
+        </w:rPr>
+        <w:t xml:space="preserve">Core Value · iconKey: </w:t>
+      </w:r>
+      <w:r>
+        <w:rPr>
+          <w:sz w:val="21"/>
+        </w:rPr>
+        <w:t>target · shield · globe</w:t>
+      </w:r>
+    </w:p>
+    <w:p>
+      <w:pPr>
+        <w:spacing w:after="60"/>
+      </w:pPr>
+      <w:r>
+        <w:rPr>
+          <w:b/>
+          <w:color w:val="0B2A4A"/>
+        </w:rPr>
+        <w:t xml:space="preserve">Governance · type: </w:t>
+      </w:r>
+      <w:r>
+        <w:rPr>
+          <w:sz w:val="21"/>
+        </w:rPr>
+        <w:t>legislative · executive</w:t>
       </w:r>
     </w:p>
     <w:p>
@@ -6101,7 +7528,7 @@
           <w:color w:val="555566"/>
           <w:sz w:val="18"/>
         </w:rPr>
-        <w:t>European Shooting Confederation · внутреннее руководство для контент-менеджера. Значения в примерах приведены на основе реальных данных сайта.</w:t>
+        <w:t>European Shooting Confederation · внутреннее руководство для контент-менеджера. Значения в примерах и справочнике приведены на основе реальных данных сайта.</w:t>
       </w:r>
     </w:p>
     <w:sectPr>

</xml_diff>

<commit_message>
docs: finalize Strapi guide — add Hero Slide, 'how it looks on site' mockups per collection, sync schema
- New Hero Slide section (type/kicker/title/subtitle/dateText/image/link/order,
  two-button VIEW/ALL behaviour, no-dim rule, Championship fallback).
- 9 site-appearance mockups ('Как это выглядит на сайте') for news, video, photo,
  event, results, ranking, record, federation/people, document/partners.
- Synced with current schema: removed CAUCASUS region, added Hero Slide type enum.
Now 25 pages, 20 illustrations, 29 field tables.

Co-Authored-By: Claude Opus 4.8 <noreply@anthropic.com>
</commit_message>
<xml_diff>
--- a/public/ESC-Strapi-Instrukciya.docx
+++ b/public/ESC-Strapi-Instrukciya.docx
@@ -1633,6 +1633,60 @@
     </w:p>
     <w:p>
       <w:pPr>
+        <w:jc w:val="center"/>
+      </w:pPr>
+      <w:r>
+        <w:drawing>
+          <wp:inline xmlns:a="http://schemas.openxmlformats.org/drawingml/2006/main" xmlns:pic="http://schemas.openxmlformats.org/drawingml/2006/picture">
+            <wp:extent cx="5760720" cy="2060084"/>
+            <wp:docPr id="6" name="Picture 6"/>
+            <wp:cNvGraphicFramePr>
+              <a:graphicFrameLocks noChangeAspect="1"/>
+            </wp:cNvGraphicFramePr>
+            <a:graphic>
+              <a:graphicData uri="http://schemas.openxmlformats.org/drawingml/2006/picture">
+                <pic:pic>
+                  <pic:nvPicPr>
+                    <pic:cNvPr id="0" name="img_s2.png"/>
+                    <pic:cNvPicPr/>
+                  </pic:nvPicPr>
+                  <pic:blipFill>
+                    <a:blip r:embed="rId14"/>
+                    <a:stretch>
+                      <a:fillRect/>
+                    </a:stretch>
+                  </pic:blipFill>
+                  <pic:spPr>
+                    <a:xfrm>
+                      <a:off x="0" y="0"/>
+                      <a:ext cx="5760720" cy="2060084"/>
+                    </a:xfrm>
+                    <a:prstGeom prst="rect"/>
+                  </pic:spPr>
+                </pic:pic>
+              </a:graphicData>
+            </a:graphic>
+          </wp:inline>
+        </w:drawing>
+      </w:r>
+    </w:p>
+    <w:p>
+      <w:pPr>
+        <w:spacing w:after="200"/>
+        <w:jc w:val="center"/>
+      </w:pPr>
+      <w:r>
+        <w:rPr>
+          <w:b w:val="0"/>
+          <w:i/>
+          <w:color w:val="555566"/>
+          <w:sz w:val="18"/>
+        </w:rPr>
+        <w:t>Как это выглядит на сайте: карточки новостей в разделе «Media».</w:t>
+      </w:r>
+    </w:p>
+    <w:p>
+      <w:pPr>
         <w:pStyle w:val="Heading2"/>
         <w:spacing w:before="200" w:after="40"/>
       </w:pPr>
@@ -2193,7 +2247,7 @@
         <w:drawing>
           <wp:inline xmlns:a="http://schemas.openxmlformats.org/drawingml/2006/main" xmlns:pic="http://schemas.openxmlformats.org/drawingml/2006/picture">
             <wp:extent cx="5760720" cy="2124266"/>
-            <wp:docPr id="6" name="Picture 6"/>
+            <wp:docPr id="7" name="Picture 7"/>
             <wp:cNvGraphicFramePr>
               <a:graphicFrameLocks noChangeAspect="1"/>
             </wp:cNvGraphicFramePr>
@@ -2205,7 +2259,7 @@
                     <pic:cNvPicPr/>
                   </pic:nvPicPr>
                   <pic:blipFill>
-                    <a:blip r:embed="rId14"/>
+                    <a:blip r:embed="rId15"/>
                     <a:stretch>
                       <a:fillRect/>
                     </a:stretch>
@@ -2634,6 +2688,60 @@
       <w:pPr>
         <w:spacing w:after="80"/>
       </w:pPr>
+    </w:p>
+    <w:p>
+      <w:pPr>
+        <w:jc w:val="center"/>
+      </w:pPr>
+      <w:r>
+        <w:drawing>
+          <wp:inline xmlns:a="http://schemas.openxmlformats.org/drawingml/2006/main" xmlns:pic="http://schemas.openxmlformats.org/drawingml/2006/picture">
+            <wp:extent cx="5760720" cy="2060084"/>
+            <wp:docPr id="8" name="Picture 8"/>
+            <wp:cNvGraphicFramePr>
+              <a:graphicFrameLocks noChangeAspect="1"/>
+            </wp:cNvGraphicFramePr>
+            <a:graphic>
+              <a:graphicData uri="http://schemas.openxmlformats.org/drawingml/2006/picture">
+                <pic:pic>
+                  <pic:nvPicPr>
+                    <pic:cNvPr id="0" name="img_s3.png"/>
+                    <pic:cNvPicPr/>
+                  </pic:nvPicPr>
+                  <pic:blipFill>
+                    <a:blip r:embed="rId16"/>
+                    <a:stretch>
+                      <a:fillRect/>
+                    </a:stretch>
+                  </pic:blipFill>
+                  <pic:spPr>
+                    <a:xfrm>
+                      <a:off x="0" y="0"/>
+                      <a:ext cx="5760720" cy="2060084"/>
+                    </a:xfrm>
+                    <a:prstGeom prst="rect"/>
+                  </pic:spPr>
+                </pic:pic>
+              </a:graphicData>
+            </a:graphic>
+          </wp:inline>
+        </w:drawing>
+      </w:r>
+    </w:p>
+    <w:p>
+      <w:pPr>
+        <w:spacing w:after="200"/>
+        <w:jc w:val="center"/>
+      </w:pPr>
+      <w:r>
+        <w:rPr>
+          <w:b w:val="0"/>
+          <w:i/>
+          <w:color w:val="555566"/>
+          <w:sz w:val="18"/>
+        </w:rPr>
+        <w:t>Как это выглядит на сайте: карточка видео и карточка фотоальбома.</w:t>
+      </w:r>
     </w:p>
     <w:p>
       <w:pPr>
@@ -3198,7 +3306,7 @@
         <w:drawing>
           <wp:inline xmlns:a="http://schemas.openxmlformats.org/drawingml/2006/main" xmlns:pic="http://schemas.openxmlformats.org/drawingml/2006/picture">
             <wp:extent cx="5760720" cy="3533584"/>
-            <wp:docPr id="7" name="Picture 7"/>
+            <wp:docPr id="9" name="Picture 9"/>
             <wp:cNvGraphicFramePr>
               <a:graphicFrameLocks noChangeAspect="1"/>
             </wp:cNvGraphicFramePr>
@@ -3210,7 +3318,7 @@
                     <pic:cNvPicPr/>
                   </pic:nvPicPr>
                   <pic:blipFill>
-                    <a:blip r:embed="rId15"/>
+                    <a:blip r:embed="rId17"/>
                     <a:stretch>
                       <a:fillRect/>
                     </a:stretch>
@@ -4303,6 +4411,60 @@
     </w:p>
     <w:p>
       <w:pPr>
+        <w:jc w:val="center"/>
+      </w:pPr>
+      <w:r>
+        <w:drawing>
+          <wp:inline xmlns:a="http://schemas.openxmlformats.org/drawingml/2006/main" xmlns:pic="http://schemas.openxmlformats.org/drawingml/2006/picture">
+            <wp:extent cx="5760720" cy="1014388"/>
+            <wp:docPr id="10" name="Picture 10"/>
+            <wp:cNvGraphicFramePr>
+              <a:graphicFrameLocks noChangeAspect="1"/>
+            </wp:cNvGraphicFramePr>
+            <a:graphic>
+              <a:graphicData uri="http://schemas.openxmlformats.org/drawingml/2006/picture">
+                <pic:pic>
+                  <pic:nvPicPr>
+                    <pic:cNvPr id="0" name="img_s5.png"/>
+                    <pic:cNvPicPr/>
+                  </pic:nvPicPr>
+                  <pic:blipFill>
+                    <a:blip r:embed="rId18"/>
+                    <a:stretch>
+                      <a:fillRect/>
+                    </a:stretch>
+                  </pic:blipFill>
+                  <pic:spPr>
+                    <a:xfrm>
+                      <a:off x="0" y="0"/>
+                      <a:ext cx="5760720" cy="1014388"/>
+                    </a:xfrm>
+                    <a:prstGeom prst="rect"/>
+                  </pic:spPr>
+                </pic:pic>
+              </a:graphicData>
+            </a:graphic>
+          </wp:inline>
+        </w:drawing>
+      </w:r>
+    </w:p>
+    <w:p>
+      <w:pPr>
+        <w:spacing w:after="200"/>
+        <w:jc w:val="center"/>
+      </w:pPr>
+      <w:r>
+        <w:rPr>
+          <w:b w:val="0"/>
+          <w:i/>
+          <w:color w:val="555566"/>
+          <w:sz w:val="18"/>
+        </w:rPr>
+        <w:t>Как это выглядит на сайте: событие в календаре / списке соревнований (кнопки DETAILS и RESULTS).</w:t>
+      </w:r>
+    </w:p>
+    <w:p>
+      <w:pPr>
         <w:pStyle w:val="Heading2"/>
         <w:spacing w:before="200" w:after="40"/>
       </w:pPr>
@@ -5057,6 +5219,60 @@
       <w:pPr>
         <w:spacing w:after="80"/>
       </w:pPr>
+    </w:p>
+    <w:p>
+      <w:pPr>
+        <w:jc w:val="center"/>
+      </w:pPr>
+      <w:r>
+        <w:drawing>
+          <wp:inline xmlns:a="http://schemas.openxmlformats.org/drawingml/2006/main" xmlns:pic="http://schemas.openxmlformats.org/drawingml/2006/picture">
+            <wp:extent cx="5760720" cy="1972420"/>
+            <wp:docPr id="11" name="Picture 11"/>
+            <wp:cNvGraphicFramePr>
+              <a:graphicFrameLocks noChangeAspect="1"/>
+            </wp:cNvGraphicFramePr>
+            <a:graphic>
+              <a:graphicData uri="http://schemas.openxmlformats.org/drawingml/2006/picture">
+                <pic:pic>
+                  <pic:nvPicPr>
+                    <pic:cNvPr id="0" name="img_s6.png"/>
+                    <pic:cNvPicPr/>
+                  </pic:nvPicPr>
+                  <pic:blipFill>
+                    <a:blip r:embed="rId19"/>
+                    <a:stretch>
+                      <a:fillRect/>
+                    </a:stretch>
+                  </pic:blipFill>
+                  <pic:spPr>
+                    <a:xfrm>
+                      <a:off x="0" y="0"/>
+                      <a:ext cx="5760720" cy="1972420"/>
+                    </a:xfrm>
+                    <a:prstGeom prst="rect"/>
+                  </pic:spPr>
+                </pic:pic>
+              </a:graphicData>
+            </a:graphic>
+          </wp:inline>
+        </w:drawing>
+      </w:r>
+    </w:p>
+    <w:p>
+      <w:pPr>
+        <w:spacing w:after="200"/>
+        <w:jc w:val="center"/>
+      </w:pPr>
+      <w:r>
+        <w:rPr>
+          <w:b w:val="0"/>
+          <w:i/>
+          <w:color w:val="555566"/>
+          <w:sz w:val="18"/>
+        </w:rPr>
+        <w:t>Как это выглядит на сайте: таблица результатов события (вкладка RESULTS).</w:t>
+      </w:r>
     </w:p>
     <w:p>
       <w:pPr>
@@ -5105,7 +5321,7 @@
         <w:drawing>
           <wp:inline xmlns:a="http://schemas.openxmlformats.org/drawingml/2006/main" xmlns:pic="http://schemas.openxmlformats.org/drawingml/2006/picture">
             <wp:extent cx="5760720" cy="3327844"/>
-            <wp:docPr id="8" name="Picture 8"/>
+            <wp:docPr id="12" name="Picture 12"/>
             <wp:cNvGraphicFramePr>
               <a:graphicFrameLocks noChangeAspect="1"/>
             </wp:cNvGraphicFramePr>
@@ -5117,7 +5333,7 @@
                     <pic:cNvPicPr/>
                   </pic:nvPicPr>
                   <pic:blipFill>
-                    <a:blip r:embed="rId16"/>
+                    <a:blip r:embed="rId20"/>
                     <a:stretch>
                       <a:fillRect/>
                     </a:stretch>
@@ -5651,6 +5867,60 @@
       </w:r>
       <w:r>
         <w:t>найдите уже существующий рекорд той же дисциплины, откройте его и скопируйте написание полей discipline и type — тогда точно не ошибётесь.</w:t>
+      </w:r>
+    </w:p>
+    <w:p>
+      <w:pPr>
+        <w:jc w:val="center"/>
+      </w:pPr>
+      <w:r>
+        <w:drawing>
+          <wp:inline xmlns:a="http://schemas.openxmlformats.org/drawingml/2006/main" xmlns:pic="http://schemas.openxmlformats.org/drawingml/2006/picture">
+            <wp:extent cx="5760720" cy="970556"/>
+            <wp:docPr id="13" name="Picture 13"/>
+            <wp:cNvGraphicFramePr>
+              <a:graphicFrameLocks noChangeAspect="1"/>
+            </wp:cNvGraphicFramePr>
+            <a:graphic>
+              <a:graphicData uri="http://schemas.openxmlformats.org/drawingml/2006/picture">
+                <pic:pic>
+                  <pic:nvPicPr>
+                    <pic:cNvPr id="0" name="img_s8.png"/>
+                    <pic:cNvPicPr/>
+                  </pic:nvPicPr>
+                  <pic:blipFill>
+                    <a:blip r:embed="rId21"/>
+                    <a:stretch>
+                      <a:fillRect/>
+                    </a:stretch>
+                  </pic:blipFill>
+                  <pic:spPr>
+                    <a:xfrm>
+                      <a:off x="0" y="0"/>
+                      <a:ext cx="5760720" cy="970556"/>
+                    </a:xfrm>
+                    <a:prstGeom prst="rect"/>
+                  </pic:spPr>
+                </pic:pic>
+              </a:graphicData>
+            </a:graphic>
+          </wp:inline>
+        </w:drawing>
+      </w:r>
+    </w:p>
+    <w:p>
+      <w:pPr>
+        <w:spacing w:after="200"/>
+        <w:jc w:val="center"/>
+      </w:pPr>
+      <w:r>
+        <w:rPr>
+          <w:b w:val="0"/>
+          <w:i/>
+          <w:color w:val="555566"/>
+          <w:sz w:val="18"/>
+        </w:rPr>
+        <w:t>Как это выглядит на сайте: строка рекорда на вкладке RECORDS (значение, спортсмен, флаг, код рекорда).</w:t>
       </w:r>
     </w:p>
     <w:p>
@@ -5700,7 +5970,7 @@
         <w:drawing>
           <wp:inline xmlns:a="http://schemas.openxmlformats.org/drawingml/2006/main" xmlns:pic="http://schemas.openxmlformats.org/drawingml/2006/picture">
             <wp:extent cx="5760720" cy="2947226"/>
-            <wp:docPr id="9" name="Picture 9"/>
+            <wp:docPr id="14" name="Picture 14"/>
             <wp:cNvGraphicFramePr>
               <a:graphicFrameLocks noChangeAspect="1"/>
             </wp:cNvGraphicFramePr>
@@ -5712,7 +5982,7 @@
                     <pic:cNvPicPr/>
                   </pic:nvPicPr>
                   <pic:blipFill>
-                    <a:blip r:embed="rId17"/>
+                    <a:blip r:embed="rId22"/>
                     <a:stretch>
                       <a:fillRect/>
                     </a:stretch>
@@ -6213,6 +6483,60 @@
         <w:t>Save, затем Publish.</w:t>
       </w:r>
       <w:r/>
+    </w:p>
+    <w:p>
+      <w:pPr>
+        <w:jc w:val="center"/>
+      </w:pPr>
+      <w:r>
+        <w:drawing>
+          <wp:inline xmlns:a="http://schemas.openxmlformats.org/drawingml/2006/main" xmlns:pic="http://schemas.openxmlformats.org/drawingml/2006/picture">
+            <wp:extent cx="5760720" cy="1659338"/>
+            <wp:docPr id="15" name="Picture 15"/>
+            <wp:cNvGraphicFramePr>
+              <a:graphicFrameLocks noChangeAspect="1"/>
+            </wp:cNvGraphicFramePr>
+            <a:graphic>
+              <a:graphicData uri="http://schemas.openxmlformats.org/drawingml/2006/picture">
+                <pic:pic>
+                  <pic:nvPicPr>
+                    <pic:cNvPr id="0" name="img_s7.png"/>
+                    <pic:cNvPicPr/>
+                  </pic:nvPicPr>
+                  <pic:blipFill>
+                    <a:blip r:embed="rId23"/>
+                    <a:stretch>
+                      <a:fillRect/>
+                    </a:stretch>
+                  </pic:blipFill>
+                  <pic:spPr>
+                    <a:xfrm>
+                      <a:off x="0" y="0"/>
+                      <a:ext cx="5760720" cy="1659338"/>
+                    </a:xfrm>
+                    <a:prstGeom prst="rect"/>
+                  </pic:spPr>
+                </pic:pic>
+              </a:graphicData>
+            </a:graphic>
+          </wp:inline>
+        </w:drawing>
+      </w:r>
+    </w:p>
+    <w:p>
+      <w:pPr>
+        <w:spacing w:after="200"/>
+        <w:jc w:val="center"/>
+      </w:pPr>
+      <w:r>
+        <w:rPr>
+          <w:b w:val="0"/>
+          <w:i/>
+          <w:color w:val="555566"/>
+          <w:sz w:val="18"/>
+        </w:rPr>
+        <w:t>Как это выглядит на сайте: таблица рейтинга на вкладке RANKING (место, имя, страна, год рождения).</w:t>
+      </w:r>
     </w:p>
     <w:p>
       <w:pPr>
@@ -6304,7 +6628,7 @@
         <w:drawing>
           <wp:inline xmlns:a="http://schemas.openxmlformats.org/drawingml/2006/main" xmlns:pic="http://schemas.openxmlformats.org/drawingml/2006/picture">
             <wp:extent cx="5760720" cy="2319718"/>
-            <wp:docPr id="10" name="Picture 10"/>
+            <wp:docPr id="16" name="Picture 16"/>
             <wp:cNvGraphicFramePr>
               <a:graphicFrameLocks noChangeAspect="1"/>
             </wp:cNvGraphicFramePr>
@@ -6316,7 +6640,7 @@
                     <pic:cNvPicPr/>
                   </pic:nvPicPr>
                   <pic:blipFill>
-                    <a:blip r:embed="rId18"/>
+                    <a:blip r:embed="rId24"/>
                     <a:stretch>
                       <a:fillRect/>
                     </a:stretch>
@@ -7077,6 +7401,60 @@
     </w:p>
     <w:p>
       <w:pPr>
+        <w:jc w:val="center"/>
+      </w:pPr>
+      <w:r>
+        <w:drawing>
+          <wp:inline xmlns:a="http://schemas.openxmlformats.org/drawingml/2006/main" xmlns:pic="http://schemas.openxmlformats.org/drawingml/2006/picture">
+            <wp:extent cx="5760720" cy="1546628"/>
+            <wp:docPr id="17" name="Picture 17"/>
+            <wp:cNvGraphicFramePr>
+              <a:graphicFrameLocks noChangeAspect="1"/>
+            </wp:cNvGraphicFramePr>
+            <a:graphic>
+              <a:graphicData uri="http://schemas.openxmlformats.org/drawingml/2006/picture">
+                <pic:pic>
+                  <pic:nvPicPr>
+                    <pic:cNvPr id="0" name="img_s10.png"/>
+                    <pic:cNvPicPr/>
+                  </pic:nvPicPr>
+                  <pic:blipFill>
+                    <a:blip r:embed="rId25"/>
+                    <a:stretch>
+                      <a:fillRect/>
+                    </a:stretch>
+                  </pic:blipFill>
+                  <pic:spPr>
+                    <a:xfrm>
+                      <a:off x="0" y="0"/>
+                      <a:ext cx="5760720" cy="1546628"/>
+                    </a:xfrm>
+                    <a:prstGeom prst="rect"/>
+                  </pic:spPr>
+                </pic:pic>
+              </a:graphicData>
+            </a:graphic>
+          </wp:inline>
+        </w:drawing>
+      </w:r>
+    </w:p>
+    <w:p>
+      <w:pPr>
+        <w:spacing w:after="200"/>
+        <w:jc w:val="center"/>
+      </w:pPr>
+      <w:r>
+        <w:rPr>
+          <w:b w:val="0"/>
+          <w:i/>
+          <w:color w:val="555566"/>
+          <w:sz w:val="18"/>
+        </w:rPr>
+        <w:t>Как это выглядит на сайте: строка документа в библиотеке и лента логотипов партнёров.</w:t>
+      </w:r>
+    </w:p>
+    <w:p>
+      <w:pPr>
         <w:pStyle w:val="Heading1"/>
         <w:spacing w:before="280" w:after="80"/>
       </w:pPr>
@@ -7109,7 +7487,7 @@
         <w:drawing>
           <wp:inline xmlns:a="http://schemas.openxmlformats.org/drawingml/2006/main" xmlns:pic="http://schemas.openxmlformats.org/drawingml/2006/picture">
             <wp:extent cx="5760720" cy="2319718"/>
-            <wp:docPr id="11" name="Picture 11"/>
+            <wp:docPr id="18" name="Picture 18"/>
             <wp:cNvGraphicFramePr>
               <a:graphicFrameLocks noChangeAspect="1"/>
             </wp:cNvGraphicFramePr>
@@ -7121,7 +7499,7 @@
                     <pic:cNvPicPr/>
                   </pic:nvPicPr>
                   <pic:blipFill>
-                    <a:blip r:embed="rId19"/>
+                    <a:blip r:embed="rId26"/>
                     <a:stretch>
                       <a:fillRect/>
                     </a:stretch>
@@ -7790,6 +8168,60 @@
       <w:pPr>
         <w:spacing w:after="80"/>
       </w:pPr>
+    </w:p>
+    <w:p>
+      <w:pPr>
+        <w:jc w:val="center"/>
+      </w:pPr>
+      <w:r>
+        <w:drawing>
+          <wp:inline xmlns:a="http://schemas.openxmlformats.org/drawingml/2006/main" xmlns:pic="http://schemas.openxmlformats.org/drawingml/2006/picture">
+            <wp:extent cx="5760720" cy="1640553"/>
+            <wp:docPr id="19" name="Picture 19"/>
+            <wp:cNvGraphicFramePr>
+              <a:graphicFrameLocks noChangeAspect="1"/>
+            </wp:cNvGraphicFramePr>
+            <a:graphic>
+              <a:graphicData uri="http://schemas.openxmlformats.org/drawingml/2006/picture">
+                <pic:pic>
+                  <pic:nvPicPr>
+                    <pic:cNvPr id="0" name="img_s9.png"/>
+                    <pic:cNvPicPr/>
+                  </pic:nvPicPr>
+                  <pic:blipFill>
+                    <a:blip r:embed="rId27"/>
+                    <a:stretch>
+                      <a:fillRect/>
+                    </a:stretch>
+                  </pic:blipFill>
+                  <pic:spPr>
+                    <a:xfrm>
+                      <a:off x="0" y="0"/>
+                      <a:ext cx="5760720" cy="1640553"/>
+                    </a:xfrm>
+                    <a:prstGeom prst="rect"/>
+                  </pic:spPr>
+                </pic:pic>
+              </a:graphicData>
+            </a:graphic>
+          </wp:inline>
+        </w:drawing>
+      </w:r>
+    </w:p>
+    <w:p>
+      <w:pPr>
+        <w:spacing w:after="200"/>
+        <w:jc w:val="center"/>
+      </w:pPr>
+      <w:r>
+        <w:rPr>
+          <w:b w:val="0"/>
+          <w:i/>
+          <w:color w:val="555566"/>
+          <w:sz w:val="18"/>
+        </w:rPr>
+        <w:t>Как это выглядит на сайте: карточка федерации-члена и карточки людей (президиум/руководство).</w:t>
+      </w:r>
     </w:p>
     <w:p>
       <w:pPr>
@@ -11213,7 +11645,589 @@
           <w:color w:val="1D4E89"/>
           <w:sz w:val="27"/>
         </w:rPr>
-        <w:t>Championship — баннер чемпионата</w:t>
+        <w:t>Hero Slide — слайды главного баннера</w:t>
+      </w:r>
+    </w:p>
+    <w:p>
+      <w:pPr>
+        <w:spacing w:after="120"/>
+      </w:pPr>
+      <w:r>
+        <w:rPr>
+          <w:b w:val="0"/>
+          <w:i w:val="0"/>
+          <w:sz w:val="22"/>
+        </w:rPr>
+        <w:t>Главный баннер на первом экране — слайдер. Слайды берутся из коллекции Hero Slide и листаются автоматически; каждый слайд одного из трёх типов: событие, новость или видео.</w:t>
+      </w:r>
+    </w:p>
+    <w:p>
+      <w:pPr>
+        <w:jc w:val="center"/>
+      </w:pPr>
+      <w:r>
+        <w:drawing>
+          <wp:inline xmlns:a="http://schemas.openxmlformats.org/drawingml/2006/main" xmlns:pic="http://schemas.openxmlformats.org/drawingml/2006/picture">
+            <wp:extent cx="5760720" cy="2391951"/>
+            <wp:docPr id="20" name="Picture 20"/>
+            <wp:cNvGraphicFramePr>
+              <a:graphicFrameLocks noChangeAspect="1"/>
+            </wp:cNvGraphicFramePr>
+            <a:graphic>
+              <a:graphicData uri="http://schemas.openxmlformats.org/drawingml/2006/picture">
+                <pic:pic>
+                  <pic:nvPicPr>
+                    <pic:cNvPr id="0" name="img_s1.png"/>
+                    <pic:cNvPicPr/>
+                  </pic:nvPicPr>
+                  <pic:blipFill>
+                    <a:blip r:embed="rId28"/>
+                    <a:stretch>
+                      <a:fillRect/>
+                    </a:stretch>
+                  </pic:blipFill>
+                  <pic:spPr>
+                    <a:xfrm>
+                      <a:off x="0" y="0"/>
+                      <a:ext cx="5760720" cy="2391951"/>
+                    </a:xfrm>
+                    <a:prstGeom prst="rect"/>
+                  </pic:spPr>
+                </pic:pic>
+              </a:graphicData>
+            </a:graphic>
+          </wp:inline>
+        </w:drawing>
+      </w:r>
+    </w:p>
+    <w:p>
+      <w:pPr>
+        <w:spacing w:after="200"/>
+        <w:jc w:val="center"/>
+      </w:pPr>
+      <w:r>
+        <w:rPr>
+          <w:b w:val="0"/>
+          <w:i/>
+          <w:color w:val="555566"/>
+          <w:sz w:val="18"/>
+        </w:rPr>
+        <w:t>Слайд баннера на сайте: категория, заголовок и две кнопки — VIEW и ALL.</w:t>
+      </w:r>
+    </w:p>
+    <w:tbl>
+      <w:tblPr>
+        <w:tblStyle w:val="TableGrid"/>
+        <w:tblW w:type="auto" w:w="0"/>
+        <w:jc w:val="left"/>
+        <w:tblLook w:firstColumn="1" w:firstRow="1" w:lastColumn="0" w:lastRow="0" w:noHBand="0" w:noVBand="1" w:val="04A0"/>
+      </w:tblPr>
+      <w:tblGrid>
+        <w:gridCol w:w="2880"/>
+        <w:gridCol w:w="2880"/>
+        <w:gridCol w:w="2880"/>
+      </w:tblGrid>
+      <w:tr>
+        <w:tc>
+          <w:tcPr>
+            <w:tcW w:type="dxa" w:w="2160"/>
+            <w:shd w:val="clear" w:fill="0B2A4A"/>
+          </w:tcPr>
+          <w:p>
+            <w:r/>
+            <w:r>
+              <w:rPr>
+                <w:b/>
+                <w:color w:val="FFFFFF"/>
+              </w:rPr>
+              <w:t>Поле</w:t>
+            </w:r>
+          </w:p>
+        </w:tc>
+        <w:tc>
+          <w:tcPr>
+            <w:tcW w:type="dxa" w:w="6336"/>
+            <w:shd w:val="clear" w:fill="0B2A4A"/>
+          </w:tcPr>
+          <w:p>
+            <w:r/>
+            <w:r>
+              <w:rPr>
+                <w:b/>
+                <w:color w:val="FFFFFF"/>
+              </w:rPr>
+              <w:t>Что вписывать</w:t>
+            </w:r>
+          </w:p>
+        </w:tc>
+        <w:tc>
+          <w:tcPr>
+            <w:tcW w:type="dxa" w:w="1008"/>
+            <w:shd w:val="clear" w:fill="0B2A4A"/>
+          </w:tcPr>
+          <w:p>
+            <w:r/>
+            <w:r>
+              <w:rPr>
+                <w:b/>
+                <w:color w:val="FFFFFF"/>
+              </w:rPr>
+              <w:t>Обяз.</w:t>
+            </w:r>
+          </w:p>
+        </w:tc>
+      </w:tr>
+      <w:tr>
+        <w:tc>
+          <w:tcPr>
+            <w:tcW w:type="dxa" w:w="2160"/>
+          </w:tcPr>
+          <w:p>
+            <w:r/>
+            <w:r>
+              <w:rPr>
+                <w:b/>
+                <w:sz w:val="20"/>
+              </w:rPr>
+              <w:t>type</w:t>
+            </w:r>
+          </w:p>
+        </w:tc>
+        <w:tc>
+          <w:tcPr>
+            <w:tcW w:type="dxa" w:w="6336"/>
+          </w:tcPr>
+          <w:p>
+            <w:r/>
+            <w:r>
+              <w:rPr>
+                <w:sz w:val="20"/>
+              </w:rPr>
+              <w:t>Тип слайда: event, news или video. Определяет надписи кнопок и раздел, куда они ведут.</w:t>
+            </w:r>
+          </w:p>
+        </w:tc>
+        <w:tc>
+          <w:tcPr>
+            <w:tcW w:type="dxa" w:w="1008"/>
+          </w:tcPr>
+          <w:p>
+            <w:r/>
+            <w:r>
+              <w:rPr>
+                <w:b/>
+                <w:color w:val="C02B20"/>
+                <w:sz w:val="20"/>
+              </w:rPr>
+              <w:t>да</w:t>
+            </w:r>
+          </w:p>
+        </w:tc>
+      </w:tr>
+      <w:tr>
+        <w:tc>
+          <w:tcPr>
+            <w:tcW w:type="dxa" w:w="2160"/>
+            <w:shd w:val="clear" w:fill="F3F5F8"/>
+          </w:tcPr>
+          <w:p>
+            <w:r/>
+            <w:r>
+              <w:rPr>
+                <w:b/>
+                <w:sz w:val="20"/>
+              </w:rPr>
+              <w:t>title</w:t>
+            </w:r>
+          </w:p>
+        </w:tc>
+        <w:tc>
+          <w:tcPr>
+            <w:tcW w:type="dxa" w:w="6336"/>
+            <w:shd w:val="clear" w:fill="F3F5F8"/>
+          </w:tcPr>
+          <w:p>
+            <w:r/>
+            <w:r>
+              <w:rPr>
+                <w:sz w:val="20"/>
+              </w:rPr>
+              <w:t>Заголовок поверх кадра. Можно оставить пустым, если текст уже впечатан в картинку.</w:t>
+            </w:r>
+          </w:p>
+        </w:tc>
+        <w:tc>
+          <w:tcPr>
+            <w:tcW w:type="dxa" w:w="1008"/>
+            <w:shd w:val="clear" w:fill="F3F5F8"/>
+          </w:tcPr>
+          <w:p>
+            <w:r/>
+            <w:r>
+              <w:rPr>
+                <w:sz w:val="20"/>
+              </w:rPr>
+              <w:t>—</w:t>
+            </w:r>
+          </w:p>
+        </w:tc>
+      </w:tr>
+      <w:tr>
+        <w:tc>
+          <w:tcPr>
+            <w:tcW w:type="dxa" w:w="2160"/>
+          </w:tcPr>
+          <w:p>
+            <w:r/>
+            <w:r>
+              <w:rPr>
+                <w:b/>
+                <w:sz w:val="20"/>
+              </w:rPr>
+              <w:t>kicker</w:t>
+            </w:r>
+          </w:p>
+        </w:tc>
+        <w:tc>
+          <w:tcPr>
+            <w:tcW w:type="dxa" w:w="6336"/>
+          </w:tcPr>
+          <w:p>
+            <w:r/>
+            <w:r>
+              <w:rPr>
+                <w:sz w:val="20"/>
+              </w:rPr>
+              <w:t>Небольшая подпись над заголовком (например, UPCOMING EVENT).</w:t>
+            </w:r>
+          </w:p>
+        </w:tc>
+        <w:tc>
+          <w:tcPr>
+            <w:tcW w:type="dxa" w:w="1008"/>
+          </w:tcPr>
+          <w:p>
+            <w:r/>
+            <w:r>
+              <w:rPr>
+                <w:sz w:val="20"/>
+              </w:rPr>
+              <w:t>—</w:t>
+            </w:r>
+          </w:p>
+        </w:tc>
+      </w:tr>
+      <w:tr>
+        <w:tc>
+          <w:tcPr>
+            <w:tcW w:type="dxa" w:w="2160"/>
+            <w:shd w:val="clear" w:fill="F3F5F8"/>
+          </w:tcPr>
+          <w:p>
+            <w:r/>
+            <w:r>
+              <w:rPr>
+                <w:b/>
+                <w:sz w:val="20"/>
+              </w:rPr>
+              <w:t>subtitle</w:t>
+            </w:r>
+          </w:p>
+        </w:tc>
+        <w:tc>
+          <w:tcPr>
+            <w:tcW w:type="dxa" w:w="6336"/>
+            <w:shd w:val="clear" w:fill="F3F5F8"/>
+          </w:tcPr>
+          <w:p>
+            <w:r/>
+            <w:r>
+              <w:rPr>
+                <w:sz w:val="20"/>
+              </w:rPr>
+              <w:t>Строка под заголовком (место или короткое описание).</w:t>
+            </w:r>
+          </w:p>
+        </w:tc>
+        <w:tc>
+          <w:tcPr>
+            <w:tcW w:type="dxa" w:w="1008"/>
+            <w:shd w:val="clear" w:fill="F3F5F8"/>
+          </w:tcPr>
+          <w:p>
+            <w:r/>
+            <w:r>
+              <w:rPr>
+                <w:sz w:val="20"/>
+              </w:rPr>
+              <w:t>—</w:t>
+            </w:r>
+          </w:p>
+        </w:tc>
+      </w:tr>
+      <w:tr>
+        <w:tc>
+          <w:tcPr>
+            <w:tcW w:type="dxa" w:w="2160"/>
+          </w:tcPr>
+          <w:p>
+            <w:r/>
+            <w:r>
+              <w:rPr>
+                <w:b/>
+                <w:sz w:val="20"/>
+              </w:rPr>
+              <w:t>dateText</w:t>
+            </w:r>
+          </w:p>
+        </w:tc>
+        <w:tc>
+          <w:tcPr>
+            <w:tcW w:type="dxa" w:w="6336"/>
+          </w:tcPr>
+          <w:p>
+            <w:r/>
+            <w:r>
+              <w:rPr>
+                <w:sz w:val="20"/>
+              </w:rPr>
+              <w:t>Строка с датой.</w:t>
+            </w:r>
+          </w:p>
+        </w:tc>
+        <w:tc>
+          <w:tcPr>
+            <w:tcW w:type="dxa" w:w="1008"/>
+          </w:tcPr>
+          <w:p>
+            <w:r/>
+            <w:r>
+              <w:rPr>
+                <w:sz w:val="20"/>
+              </w:rPr>
+              <w:t>—</w:t>
+            </w:r>
+          </w:p>
+        </w:tc>
+      </w:tr>
+      <w:tr>
+        <w:tc>
+          <w:tcPr>
+            <w:tcW w:type="dxa" w:w="2160"/>
+            <w:shd w:val="clear" w:fill="F3F5F8"/>
+          </w:tcPr>
+          <w:p>
+            <w:r/>
+            <w:r>
+              <w:rPr>
+                <w:b/>
+                <w:sz w:val="20"/>
+              </w:rPr>
+              <w:t>image</w:t>
+            </w:r>
+          </w:p>
+        </w:tc>
+        <w:tc>
+          <w:tcPr>
+            <w:tcW w:type="dxa" w:w="6336"/>
+            <w:shd w:val="clear" w:fill="F3F5F8"/>
+          </w:tcPr>
+          <w:p>
+            <w:r/>
+            <w:r>
+              <w:rPr>
+                <w:sz w:val="20"/>
+              </w:rPr>
+              <w:t>Фоновая картинка слайда.</w:t>
+            </w:r>
+          </w:p>
+        </w:tc>
+        <w:tc>
+          <w:tcPr>
+            <w:tcW w:type="dxa" w:w="1008"/>
+            <w:shd w:val="clear" w:fill="F3F5F8"/>
+          </w:tcPr>
+          <w:p>
+            <w:r/>
+            <w:r>
+              <w:rPr>
+                <w:sz w:val="20"/>
+              </w:rPr>
+              <w:t>—</w:t>
+            </w:r>
+          </w:p>
+        </w:tc>
+      </w:tr>
+      <w:tr>
+        <w:tc>
+          <w:tcPr>
+            <w:tcW w:type="dxa" w:w="2160"/>
+          </w:tcPr>
+          <w:p>
+            <w:r/>
+            <w:r>
+              <w:rPr>
+                <w:b/>
+                <w:sz w:val="20"/>
+              </w:rPr>
+              <w:t>link</w:t>
+            </w:r>
+          </w:p>
+        </w:tc>
+        <w:tc>
+          <w:tcPr>
+            <w:tcW w:type="dxa" w:w="6336"/>
+          </w:tcPr>
+          <w:p>
+            <w:r/>
+            <w:r>
+              <w:rPr>
+                <w:sz w:val="20"/>
+              </w:rPr>
+              <w:t>Адрес конкретного элемента для кнопки VIEW (например, /events/… или /media/…).</w:t>
+            </w:r>
+          </w:p>
+        </w:tc>
+        <w:tc>
+          <w:tcPr>
+            <w:tcW w:type="dxa" w:w="1008"/>
+          </w:tcPr>
+          <w:p>
+            <w:r/>
+            <w:r>
+              <w:rPr>
+                <w:sz w:val="20"/>
+              </w:rPr>
+              <w:t>—</w:t>
+            </w:r>
+          </w:p>
+        </w:tc>
+      </w:tr>
+      <w:tr>
+        <w:tc>
+          <w:tcPr>
+            <w:tcW w:type="dxa" w:w="2160"/>
+            <w:shd w:val="clear" w:fill="F3F5F8"/>
+          </w:tcPr>
+          <w:p>
+            <w:r/>
+            <w:r>
+              <w:rPr>
+                <w:b/>
+                <w:sz w:val="20"/>
+              </w:rPr>
+              <w:t>order</w:t>
+            </w:r>
+          </w:p>
+        </w:tc>
+        <w:tc>
+          <w:tcPr>
+            <w:tcW w:type="dxa" w:w="6336"/>
+            <w:shd w:val="clear" w:fill="F3F5F8"/>
+          </w:tcPr>
+          <w:p>
+            <w:r/>
+            <w:r>
+              <w:rPr>
+                <w:sz w:val="20"/>
+              </w:rPr>
+              <w:t>Порядок слайдов (меньше — раньше).</w:t>
+            </w:r>
+          </w:p>
+        </w:tc>
+        <w:tc>
+          <w:tcPr>
+            <w:tcW w:type="dxa" w:w="1008"/>
+            <w:shd w:val="clear" w:fill="F3F5F8"/>
+          </w:tcPr>
+          <w:p>
+            <w:r/>
+            <w:r>
+              <w:rPr>
+                <w:sz w:val="20"/>
+              </w:rPr>
+              <w:t>—</w:t>
+            </w:r>
+          </w:p>
+        </w:tc>
+      </w:tr>
+    </w:tbl>
+    <w:p>
+      <w:pPr>
+        <w:spacing w:after="80"/>
+      </w:pPr>
+    </w:p>
+    <w:p>
+      <w:pPr>
+        <w:pStyle w:val="ListBullet"/>
+        <w:spacing w:after="40"/>
+      </w:pPr>
+      <w:r>
+        <w:rPr>
+          <w:b/>
+        </w:rPr>
+        <w:t xml:space="preserve">Кнопка VIEW </w:t>
+      </w:r>
+      <w:r>
+        <w:t>— ведёт на конкретный элемент из поля link (VIEW EVENT / VIEW NEWS / VIEW VIDEO — по типу слайда).</w:t>
+      </w:r>
+    </w:p>
+    <w:p>
+      <w:pPr>
+        <w:pStyle w:val="ListBullet"/>
+        <w:spacing w:after="40"/>
+      </w:pPr>
+      <w:r>
+        <w:rPr>
+          <w:b/>
+        </w:rPr>
+        <w:t xml:space="preserve">Кнопка ALL </w:t>
+      </w:r>
+      <w:r>
+        <w:t>— ведёт на список раздела (ALL EVENTS / ALL NEWS / ALL VIDEOS).</w:t>
+      </w:r>
+    </w:p>
+    <w:p>
+      <w:pPr>
+        <w:pStyle w:val="ListBullet"/>
+        <w:spacing w:after="40"/>
+      </w:pPr>
+      <w:r>
+        <w:rPr>
+          <w:b/>
+        </w:rPr>
+        <w:t xml:space="preserve">Без текста — без затемнения </w:t>
+      </w:r>
+      <w:r>
+        <w:t>— если у слайда не заполнены ни заголовок, ни подписи, кадр показывается целиком, без тёмного слоя (удобно для готовых баннеров с впечатанным текстом).</w:t>
+      </w:r>
+    </w:p>
+    <w:p>
+      <w:pPr>
+        <w:spacing w:after="120"/>
+      </w:pPr>
+      <w:r>
+        <w:rPr>
+          <w:b/>
+          <w:color w:val="0A7E8C"/>
+        </w:rPr>
+        <w:t xml:space="preserve">Если слайдов нет: </w:t>
+      </w:r>
+      <w:r>
+        <w:t>баннер автоматически показывает данные из коллекции Championship (запасной вариант ниже).</w:t>
+      </w:r>
+    </w:p>
+    <w:p>
+      <w:pPr>
+        <w:pStyle w:val="Heading2"/>
+        <w:spacing w:before="200" w:after="40"/>
+      </w:pPr>
+      <w:r>
+        <w:rPr>
+          <w:color w:val="1D4E89"/>
+          <w:sz w:val="27"/>
+        </w:rPr>
+        <w:t>Championship — запасной баннер главной</w:t>
       </w:r>
     </w:p>
     <w:tbl>
@@ -14805,7 +15819,25 @@
         <w:rPr>
           <w:sz w:val="21"/>
         </w:rPr>
-        <w:t>W.EUROPE · SCANDINAVIA · C.EUROPE · E.EUROPE · S.EUROPE · CAUCASUS</w:t>
+        <w:t>W.EUROPE · SCANDINAVIA · C.EUROPE · E.EUROPE · S.EUROPE</w:t>
+      </w:r>
+    </w:p>
+    <w:p>
+      <w:pPr>
+        <w:spacing w:after="60"/>
+      </w:pPr>
+      <w:r>
+        <w:rPr>
+          <w:b/>
+          <w:color w:val="0B2A4A"/>
+        </w:rPr>
+        <w:t xml:space="preserve">Hero Slide · type: </w:t>
+      </w:r>
+      <w:r>
+        <w:rPr>
+          <w:sz w:val="21"/>
+        </w:rPr>
+        <w:t>event · news · video</w:t>
       </w:r>
     </w:p>
     <w:p>

</xml_diff>

<commit_message>
docs: expand Result Detail — individual vs team results, externalId, shots/shotDetail
Detailed how-to for a single-participant result (isTeam off, shots=series sums,
shotDetail=per-shot) and a team result (isTeam on, athleteName=team name,
shots=member list shown in MEMBERS column); explains externalId (dedup key on
SIUS re-import, optional for manual entry) and the no-draft/publish behaviour.

Co-Authored-By: Claude Opus 4.8 <noreply@anthropic.com>
</commit_message>
<xml_diff>
--- a/public/ESC-Strapi-Instrukciya.docx
+++ b/public/ESC-Strapi-Instrukciya.docx
@@ -4486,7 +4486,35 @@
           <w:i w:val="0"/>
           <w:sz w:val="22"/>
         </w:rPr>
-        <w:t>Строки таблиц результатов по дисциплинам. Как правило, заполняются автоматически при импорте из системы хронометража SIUS, а не вручную.</w:t>
+        <w:t>Строки таблиц результатов по дисциплинам (вкладка RESULTS на странице события). Как правило, они создаются автоматически при импорте из системы хронометража SIUS. Заполнять вручную требуется редко, но это возможно — ниже подробно, как для одного участника и как для команды.</w:t>
+      </w:r>
+    </w:p>
+    <w:p>
+      <w:pPr>
+        <w:spacing w:after="120"/>
+      </w:pPr>
+      <w:r>
+        <w:rPr>
+          <w:b/>
+          <w:color w:val="0A7E8C"/>
+        </w:rPr>
+        <w:t xml:space="preserve">Без публикации: </w:t>
+      </w:r>
+      <w:r>
+        <w:t>у этой коллекции нет черновиков — строка появляется на сайте сразу после Save. Кнопки Publish здесь нет.</w:t>
+      </w:r>
+    </w:p>
+    <w:p>
+      <w:pPr>
+        <w:spacing w:after="120"/>
+      </w:pPr>
+      <w:r>
+        <w:rPr>
+          <w:b w:val="0"/>
+          <w:i w:val="0"/>
+          <w:sz w:val="22"/>
+        </w:rPr>
+        <w:t>Все поля коллекции:</w:t>
       </w:r>
     </w:p>
     <w:tbl>
@@ -4563,7 +4591,7 @@
                 <w:b/>
                 <w:sz w:val="20"/>
               </w:rPr>
-              <w:t>position</w:t>
+              <w:t>eventSlug</w:t>
             </w:r>
           </w:p>
         </w:tc>
@@ -4577,13 +4605,61 @@
               <w:rPr>
                 <w:sz w:val="20"/>
               </w:rPr>
-              <w:t>Место (число).</w:t>
+              <w:t>Адрес (slug) события, к которому относится строка — по нему результат попадает в нужное событие.</w:t>
             </w:r>
           </w:p>
         </w:tc>
         <w:tc>
           <w:tcPr>
             <w:tcW w:type="dxa" w:w="1008"/>
+          </w:tcPr>
+          <w:p>
+            <w:r/>
+            <w:r>
+              <w:rPr>
+                <w:sz w:val="20"/>
+              </w:rPr>
+              <w:t>—</w:t>
+            </w:r>
+          </w:p>
+        </w:tc>
+      </w:tr>
+      <w:tr>
+        <w:tc>
+          <w:tcPr>
+            <w:tcW w:type="dxa" w:w="2160"/>
+            <w:shd w:val="clear" w:fill="F3F5F8"/>
+          </w:tcPr>
+          <w:p>
+            <w:r/>
+            <w:r>
+              <w:rPr>
+                <w:b/>
+                <w:sz w:val="20"/>
+              </w:rPr>
+              <w:t>discipline</w:t>
+            </w:r>
+          </w:p>
+        </w:tc>
+        <w:tc>
+          <w:tcPr>
+            <w:tcW w:type="dxa" w:w="6336"/>
+            <w:shd w:val="clear" w:fill="F3F5F8"/>
+          </w:tcPr>
+          <w:p>
+            <w:r/>
+            <w:r>
+              <w:rPr>
+                <w:sz w:val="20"/>
+              </w:rPr>
+              <w:t>Дисциплина ЗАГЛАВНЫМИ буквами: 10M AIR RIFLE, 10M AIR PISTOL, TRAP и т. д.</w:t>
+            </w:r>
+          </w:p>
+        </w:tc>
+        <w:tc>
+          <w:tcPr>
+            <w:tcW w:type="dxa" w:w="1008"/>
+            <w:shd w:val="clear" w:fill="F3F5F8"/>
           </w:tcPr>
           <w:p>
             <w:r/>
@@ -4602,6 +4678,53 @@
         <w:tc>
           <w:tcPr>
             <w:tcW w:type="dxa" w:w="2160"/>
+          </w:tcPr>
+          <w:p>
+            <w:r/>
+            <w:r>
+              <w:rPr>
+                <w:b/>
+                <w:sz w:val="20"/>
+              </w:rPr>
+              <w:t>category</w:t>
+            </w:r>
+          </w:p>
+        </w:tc>
+        <w:tc>
+          <w:tcPr>
+            <w:tcW w:type="dxa" w:w="6336"/>
+          </w:tcPr>
+          <w:p>
+            <w:r/>
+            <w:r>
+              <w:rPr>
+                <w:sz w:val="20"/>
+              </w:rPr>
+              <w:t>ALL, MEN или WOMEN.</w:t>
+            </w:r>
+          </w:p>
+        </w:tc>
+        <w:tc>
+          <w:tcPr>
+            <w:tcW w:type="dxa" w:w="1008"/>
+          </w:tcPr>
+          <w:p>
+            <w:r/>
+            <w:r>
+              <w:rPr>
+                <w:b/>
+                <w:color w:val="C02B20"/>
+                <w:sz w:val="20"/>
+              </w:rPr>
+              <w:t>да</w:t>
+            </w:r>
+          </w:p>
+        </w:tc>
+      </w:tr>
+      <w:tr>
+        <w:tc>
+          <w:tcPr>
+            <w:tcW w:type="dxa" w:w="2160"/>
             <w:shd w:val="clear" w:fill="F3F5F8"/>
           </w:tcPr>
           <w:p>
@@ -4611,7 +4734,7 @@
                 <w:b/>
                 <w:sz w:val="20"/>
               </w:rPr>
-              <w:t>athleteName</w:t>
+              <w:t>position</w:t>
             </w:r>
           </w:p>
         </w:tc>
@@ -4626,7 +4749,7 @@
               <w:rPr>
                 <w:sz w:val="20"/>
               </w:rPr>
-              <w:t>Имя спортсмена или название команды.</w:t>
+              <w:t>Место (число).</w:t>
             </w:r>
           </w:p>
         </w:tc>
@@ -4660,7 +4783,7 @@
                 <w:b/>
                 <w:sz w:val="20"/>
               </w:rPr>
-              <w:t>federationCode</w:t>
+              <w:t>athleteName</w:t>
             </w:r>
           </w:p>
         </w:tc>
@@ -4674,7 +4797,7 @@
               <w:rPr>
                 <w:sz w:val="20"/>
               </w:rPr>
-              <w:t>Трёхбуквенный код страны.</w:t>
+              <w:t>Одиночный результат — имя спортсмена; командный — название команды.</w:t>
             </w:r>
           </w:p>
         </w:tc>
@@ -4708,7 +4831,7 @@
                 <w:b/>
                 <w:sz w:val="20"/>
               </w:rPr>
-              <w:t>total</w:t>
+              <w:t>federationCode</w:t>
             </w:r>
           </w:p>
         </w:tc>
@@ -4723,7 +4846,7 @@
               <w:rPr>
                 <w:sz w:val="20"/>
               </w:rPr>
-              <w:t>Итоговый результат (текст).</w:t>
+              <w:t>Трёхбуквенный код страны (флаг подгрузится сам).</w:t>
             </w:r>
           </w:p>
         </w:tc>
@@ -4757,7 +4880,7 @@
                 <w:b/>
                 <w:sz w:val="20"/>
               </w:rPr>
-              <w:t>discipline</w:t>
+              <w:t>total</w:t>
             </w:r>
           </w:p>
         </w:tc>
@@ -4771,7 +4894,7 @@
               <w:rPr>
                 <w:sz w:val="20"/>
               </w:rPr>
-              <w:t>Дисциплина ЗАГЛАВНЫМИ буквами, например 10M AIR RIFLE.</w:t>
+              <w:t>Итоговый результат как текст: 583, 631.6.</w:t>
             </w:r>
           </w:p>
         </w:tc>
@@ -4805,7 +4928,7 @@
                 <w:b/>
                 <w:sz w:val="20"/>
               </w:rPr>
-              <w:t>category</w:t>
+              <w:t>inner10s</w:t>
             </w:r>
           </w:p>
         </w:tc>
@@ -4820,7 +4943,7 @@
               <w:rPr>
                 <w:sz w:val="20"/>
               </w:rPr>
-              <w:t>ALL, MEN или WOMEN.</w:t>
+              <w:t>Внутренние десятки (число текстом). Необязательно.</w:t>
             </w:r>
           </w:p>
         </w:tc>
@@ -4833,11 +4956,9 @@
             <w:r/>
             <w:r>
               <w:rPr>
-                <w:b/>
-                <w:color w:val="C02B20"/>
-                <w:sz w:val="20"/>
-              </w:rPr>
-              <w:t>да</w:t>
+                <w:sz w:val="20"/>
+              </w:rPr>
+              <w:t>—</w:t>
             </w:r>
           </w:p>
         </w:tc>
@@ -4854,7 +4975,7 @@
                 <w:b/>
                 <w:sz w:val="20"/>
               </w:rPr>
-              <w:t>eventSlug</w:t>
+              <w:t>isTeam</w:t>
             </w:r>
           </w:p>
         </w:tc>
@@ -4868,7 +4989,7 @@
               <w:rPr>
                 <w:sz w:val="20"/>
               </w:rPr>
-              <w:t>Адрес (slug) события, к которому относится результат.</w:t>
+              <w:t>Переключатель: включён — командный результат, выключен — одиночный.</w:t>
             </w:r>
           </w:p>
         </w:tc>
@@ -4900,7 +5021,7 @@
                 <w:b/>
                 <w:sz w:val="20"/>
               </w:rPr>
-              <w:t>inner10s</w:t>
+              <w:t>subDiscipline</w:t>
             </w:r>
           </w:p>
         </w:tc>
@@ -4915,7 +5036,7 @@
               <w:rPr>
                 <w:sz w:val="20"/>
               </w:rPr>
-              <w:t>Внутренние десятки (текст).</w:t>
+              <w:t>Уточнение зачёта/стадии, например «10m AIR RIFLE MIXED TEAM — Qualification».</w:t>
             </w:r>
           </w:p>
         </w:tc>
@@ -4947,7 +5068,7 @@
                 <w:b/>
                 <w:sz w:val="20"/>
               </w:rPr>
-              <w:t>subDiscipline</w:t>
+              <w:t>shots</w:t>
             </w:r>
           </w:p>
         </w:tc>
@@ -4961,7 +5082,7 @@
               <w:rPr>
                 <w:sz w:val="20"/>
               </w:rPr>
-              <w:t>Уточнение зачёта или стадии.</w:t>
+              <w:t>JSON. Одиночный — суммы серий; командный — состав (имена участников). См. ниже.</w:t>
             </w:r>
           </w:p>
         </w:tc>
@@ -4993,7 +5114,7 @@
                 <w:b/>
                 <w:sz w:val="20"/>
               </w:rPr>
-              <w:t>isTeam</w:t>
+              <w:t>shotDetail</w:t>
             </w:r>
           </w:p>
         </w:tc>
@@ -5008,7 +5129,7 @@
               <w:rPr>
                 <w:sz w:val="20"/>
               </w:rPr>
-              <w:t>Переключатель: командный результат.</w:t>
+              <w:t>JSON. По-выстрельно для одиночного результата (раскрывается по клику). У команд — пусто.</w:t>
             </w:r>
           </w:p>
         </w:tc>
@@ -5054,7 +5175,7 @@
               <w:rPr>
                 <w:sz w:val="20"/>
               </w:rPr>
-              <w:t>Служебный идентификатор импорта. Не трогают.</w:t>
+              <w:t>Служебный идентификатор (см. ниже). При импорте — автоматически; вручную можно оставить пустым.</w:t>
             </w:r>
           </w:p>
         </w:tc>
@@ -5086,7 +5207,7 @@
                 <w:b/>
                 <w:sz w:val="20"/>
               </w:rPr>
-              <w:t>shots</w:t>
+              <w:t>flag</w:t>
             </w:r>
           </w:p>
         </w:tc>
@@ -5101,100 +5222,7 @@
               <w:rPr>
                 <w:sz w:val="20"/>
               </w:rPr>
-              <w:t>Служебные данные по сериям (JSON). Заполняются импортом.</w:t>
-            </w:r>
-          </w:p>
-        </w:tc>
-        <w:tc>
-          <w:tcPr>
-            <w:tcW w:type="dxa" w:w="1008"/>
-            <w:shd w:val="clear" w:fill="F3F5F8"/>
-          </w:tcPr>
-          <w:p>
-            <w:r/>
-            <w:r>
-              <w:rPr>
-                <w:sz w:val="20"/>
-              </w:rPr>
-              <w:t>—</w:t>
-            </w:r>
-          </w:p>
-        </w:tc>
-      </w:tr>
-      <w:tr>
-        <w:tc>
-          <w:tcPr>
-            <w:tcW w:type="dxa" w:w="2160"/>
-          </w:tcPr>
-          <w:p>
-            <w:r/>
-            <w:r>
-              <w:rPr>
-                <w:b/>
-                <w:sz w:val="20"/>
-              </w:rPr>
-              <w:t>shotDetail</w:t>
-            </w:r>
-          </w:p>
-        </w:tc>
-        <w:tc>
-          <w:tcPr>
-            <w:tcW w:type="dxa" w:w="6336"/>
-          </w:tcPr>
-          <w:p>
-            <w:r/>
-            <w:r>
-              <w:rPr>
-                <w:sz w:val="20"/>
-              </w:rPr>
-              <w:t>Служебные данные по выстрелам (JSON). Заполняются импортом.</w:t>
-            </w:r>
-          </w:p>
-        </w:tc>
-        <w:tc>
-          <w:tcPr>
-            <w:tcW w:type="dxa" w:w="1008"/>
-          </w:tcPr>
-          <w:p>
-            <w:r/>
-            <w:r>
-              <w:rPr>
-                <w:sz w:val="20"/>
-              </w:rPr>
-              <w:t>—</w:t>
-            </w:r>
-          </w:p>
-        </w:tc>
-      </w:tr>
-      <w:tr>
-        <w:tc>
-          <w:tcPr>
-            <w:tcW w:type="dxa" w:w="2160"/>
-            <w:shd w:val="clear" w:fill="F3F5F8"/>
-          </w:tcPr>
-          <w:p>
-            <w:r/>
-            <w:r>
-              <w:rPr>
-                <w:b/>
-                <w:sz w:val="20"/>
-              </w:rPr>
-              <w:t>flag</w:t>
-            </w:r>
-          </w:p>
-        </w:tc>
-        <w:tc>
-          <w:tcPr>
-            <w:tcW w:type="dxa" w:w="6336"/>
-            <w:shd w:val="clear" w:fill="F3F5F8"/>
-          </w:tcPr>
-          <w:p>
-            <w:r/>
-            <w:r>
-              <w:rPr>
-                <w:sz w:val="20"/>
-              </w:rPr>
-              <w:t>Запасной флаг (обычно не нужен — флаг берётся по коду страны).</w:t>
+              <w:t>Запасной флаг (обычно не нужен).</w:t>
             </w:r>
           </w:p>
         </w:tc>
@@ -5219,6 +5247,1185 @@
       <w:pPr>
         <w:spacing w:after="80"/>
       </w:pPr>
+    </w:p>
+    <w:p>
+      <w:pPr>
+        <w:spacing w:after="120"/>
+      </w:pPr>
+      <w:r>
+        <w:rPr>
+          <w:b/>
+          <w:color w:val="0A7E8C"/>
+        </w:rPr>
+        <w:t xml:space="preserve">eventSlug: </w:t>
+      </w:r>
+      <w:r>
+        <w:t>формально необязателен, но без него строка ни к какому событию не привяжется — заполняйте всегда.</w:t>
+      </w:r>
+    </w:p>
+    <w:p>
+      <w:pPr>
+        <w:pStyle w:val="Heading3"/>
+        <w:spacing w:before="160" w:after="20"/>
+      </w:pPr>
+      <w:r>
+        <w:rPr>
+          <w:b/>
+          <w:color w:val="2A2A44"/>
+          <w:sz w:val="23"/>
+        </w:rPr>
+        <w:t>Как создать результат одного участника</w:t>
+      </w:r>
+    </w:p>
+    <w:p>
+      <w:pPr>
+        <w:spacing w:after="120"/>
+      </w:pPr>
+      <w:r>
+        <w:rPr>
+          <w:b w:val="0"/>
+          <w:i w:val="0"/>
+          <w:sz w:val="22"/>
+        </w:rPr>
+        <w:t>Переключатель isTeam ВЫКЛЮЧЕН. Заполните место, имя, страну и результат:</w:t>
+      </w:r>
+    </w:p>
+    <w:tbl>
+      <w:tblPr>
+        <w:tblStyle w:val="TableGrid"/>
+        <w:tblW w:type="auto" w:w="0"/>
+        <w:jc w:val="left"/>
+        <w:tblLook w:firstColumn="1" w:firstRow="1" w:lastColumn="0" w:lastRow="0" w:noHBand="0" w:noVBand="1" w:val="04A0"/>
+      </w:tblPr>
+      <w:tblGrid>
+        <w:gridCol w:w="2880"/>
+        <w:gridCol w:w="2880"/>
+        <w:gridCol w:w="2880"/>
+      </w:tblGrid>
+      <w:tr>
+        <w:tc>
+          <w:tcPr>
+            <w:tcW w:type="dxa" w:w="2160"/>
+            <w:shd w:val="clear" w:fill="0B2A4A"/>
+          </w:tcPr>
+          <w:p>
+            <w:r/>
+            <w:r>
+              <w:rPr>
+                <w:b/>
+                <w:color w:val="FFFFFF"/>
+              </w:rPr>
+              <w:t>Поле</w:t>
+            </w:r>
+          </w:p>
+        </w:tc>
+        <w:tc>
+          <w:tcPr>
+            <w:tcW w:type="dxa" w:w="6336"/>
+            <w:shd w:val="clear" w:fill="0B2A4A"/>
+          </w:tcPr>
+          <w:p>
+            <w:r/>
+            <w:r>
+              <w:rPr>
+                <w:b/>
+                <w:color w:val="FFFFFF"/>
+              </w:rPr>
+              <w:t>Что вписывать</w:t>
+            </w:r>
+          </w:p>
+        </w:tc>
+        <w:tc>
+          <w:tcPr>
+            <w:tcW w:type="dxa" w:w="1008"/>
+            <w:shd w:val="clear" w:fill="0B2A4A"/>
+          </w:tcPr>
+          <w:p>
+            <w:r/>
+            <w:r>
+              <w:rPr>
+                <w:b/>
+                <w:color w:val="FFFFFF"/>
+              </w:rPr>
+              <w:t>Обяз.</w:t>
+            </w:r>
+          </w:p>
+        </w:tc>
+      </w:tr>
+      <w:tr>
+        <w:tc>
+          <w:tcPr>
+            <w:tcW w:type="dxa" w:w="2160"/>
+          </w:tcPr>
+          <w:p>
+            <w:r/>
+            <w:r>
+              <w:rPr>
+                <w:b/>
+                <w:sz w:val="20"/>
+              </w:rPr>
+              <w:t>isTeam</w:t>
+            </w:r>
+          </w:p>
+        </w:tc>
+        <w:tc>
+          <w:tcPr>
+            <w:tcW w:type="dxa" w:w="6336"/>
+          </w:tcPr>
+          <w:p>
+            <w:r/>
+            <w:r>
+              <w:rPr>
+                <w:sz w:val="20"/>
+              </w:rPr>
+              <w:t>выключен</w:t>
+            </w:r>
+          </w:p>
+        </w:tc>
+        <w:tc>
+          <w:tcPr>
+            <w:tcW w:type="dxa" w:w="1008"/>
+          </w:tcPr>
+          <w:p>
+            <w:r/>
+            <w:r>
+              <w:rPr>
+                <w:sz w:val="20"/>
+              </w:rPr>
+              <w:t>—</w:t>
+            </w:r>
+          </w:p>
+        </w:tc>
+      </w:tr>
+      <w:tr>
+        <w:tc>
+          <w:tcPr>
+            <w:tcW w:type="dxa" w:w="2160"/>
+            <w:shd w:val="clear" w:fill="F3F5F8"/>
+          </w:tcPr>
+          <w:p>
+            <w:r/>
+            <w:r>
+              <w:rPr>
+                <w:b/>
+                <w:sz w:val="20"/>
+              </w:rPr>
+              <w:t>position</w:t>
+            </w:r>
+          </w:p>
+        </w:tc>
+        <w:tc>
+          <w:tcPr>
+            <w:tcW w:type="dxa" w:w="6336"/>
+            <w:shd w:val="clear" w:fill="F3F5F8"/>
+          </w:tcPr>
+          <w:p>
+            <w:r/>
+            <w:r>
+              <w:rPr>
+                <w:sz w:val="20"/>
+              </w:rPr>
+              <w:t>1</w:t>
+            </w:r>
+          </w:p>
+        </w:tc>
+        <w:tc>
+          <w:tcPr>
+            <w:tcW w:type="dxa" w:w="1008"/>
+            <w:shd w:val="clear" w:fill="F3F5F8"/>
+          </w:tcPr>
+          <w:p>
+            <w:r/>
+            <w:r>
+              <w:rPr>
+                <w:b/>
+                <w:color w:val="C02B20"/>
+                <w:sz w:val="20"/>
+              </w:rPr>
+              <w:t>да</w:t>
+            </w:r>
+          </w:p>
+        </w:tc>
+      </w:tr>
+      <w:tr>
+        <w:tc>
+          <w:tcPr>
+            <w:tcW w:type="dxa" w:w="2160"/>
+          </w:tcPr>
+          <w:p>
+            <w:r/>
+            <w:r>
+              <w:rPr>
+                <w:b/>
+                <w:sz w:val="20"/>
+              </w:rPr>
+              <w:t>athleteName</w:t>
+            </w:r>
+          </w:p>
+        </w:tc>
+        <w:tc>
+          <w:tcPr>
+            <w:tcW w:type="dxa" w:w="6336"/>
+          </w:tcPr>
+          <w:p>
+            <w:r/>
+            <w:r>
+              <w:rPr>
+                <w:sz w:val="20"/>
+              </w:rPr>
+              <w:t>STRAUTMANIS Lauris</w:t>
+            </w:r>
+          </w:p>
+        </w:tc>
+        <w:tc>
+          <w:tcPr>
+            <w:tcW w:type="dxa" w:w="1008"/>
+          </w:tcPr>
+          <w:p>
+            <w:r/>
+            <w:r>
+              <w:rPr>
+                <w:b/>
+                <w:color w:val="C02B20"/>
+                <w:sz w:val="20"/>
+              </w:rPr>
+              <w:t>да</w:t>
+            </w:r>
+          </w:p>
+        </w:tc>
+      </w:tr>
+      <w:tr>
+        <w:tc>
+          <w:tcPr>
+            <w:tcW w:type="dxa" w:w="2160"/>
+            <w:shd w:val="clear" w:fill="F3F5F8"/>
+          </w:tcPr>
+          <w:p>
+            <w:r/>
+            <w:r>
+              <w:rPr>
+                <w:b/>
+                <w:sz w:val="20"/>
+              </w:rPr>
+              <w:t>federationCode</w:t>
+            </w:r>
+          </w:p>
+        </w:tc>
+        <w:tc>
+          <w:tcPr>
+            <w:tcW w:type="dxa" w:w="6336"/>
+            <w:shd w:val="clear" w:fill="F3F5F8"/>
+          </w:tcPr>
+          <w:p>
+            <w:r/>
+            <w:r>
+              <w:rPr>
+                <w:sz w:val="20"/>
+              </w:rPr>
+              <w:t>LAT</w:t>
+            </w:r>
+          </w:p>
+        </w:tc>
+        <w:tc>
+          <w:tcPr>
+            <w:tcW w:type="dxa" w:w="1008"/>
+            <w:shd w:val="clear" w:fill="F3F5F8"/>
+          </w:tcPr>
+          <w:p>
+            <w:r/>
+            <w:r>
+              <w:rPr>
+                <w:b/>
+                <w:color w:val="C02B20"/>
+                <w:sz w:val="20"/>
+              </w:rPr>
+              <w:t>да</w:t>
+            </w:r>
+          </w:p>
+        </w:tc>
+      </w:tr>
+      <w:tr>
+        <w:tc>
+          <w:tcPr>
+            <w:tcW w:type="dxa" w:w="2160"/>
+          </w:tcPr>
+          <w:p>
+            <w:r/>
+            <w:r>
+              <w:rPr>
+                <w:b/>
+                <w:sz w:val="20"/>
+              </w:rPr>
+              <w:t>total</w:t>
+            </w:r>
+          </w:p>
+        </w:tc>
+        <w:tc>
+          <w:tcPr>
+            <w:tcW w:type="dxa" w:w="6336"/>
+          </w:tcPr>
+          <w:p>
+            <w:r/>
+            <w:r>
+              <w:rPr>
+                <w:sz w:val="20"/>
+              </w:rPr>
+              <w:t>583</w:t>
+            </w:r>
+          </w:p>
+        </w:tc>
+        <w:tc>
+          <w:tcPr>
+            <w:tcW w:type="dxa" w:w="1008"/>
+          </w:tcPr>
+          <w:p>
+            <w:r/>
+            <w:r>
+              <w:rPr>
+                <w:b/>
+                <w:color w:val="C02B20"/>
+                <w:sz w:val="20"/>
+              </w:rPr>
+              <w:t>да</w:t>
+            </w:r>
+          </w:p>
+        </w:tc>
+      </w:tr>
+      <w:tr>
+        <w:tc>
+          <w:tcPr>
+            <w:tcW w:type="dxa" w:w="2160"/>
+            <w:shd w:val="clear" w:fill="F3F5F8"/>
+          </w:tcPr>
+          <w:p>
+            <w:r/>
+            <w:r>
+              <w:rPr>
+                <w:b/>
+                <w:sz w:val="20"/>
+              </w:rPr>
+              <w:t>inner10s</w:t>
+            </w:r>
+          </w:p>
+        </w:tc>
+        <w:tc>
+          <w:tcPr>
+            <w:tcW w:type="dxa" w:w="6336"/>
+            <w:shd w:val="clear" w:fill="F3F5F8"/>
+          </w:tcPr>
+          <w:p>
+            <w:r/>
+            <w:r>
+              <w:rPr>
+                <w:sz w:val="20"/>
+              </w:rPr>
+              <w:t>24</w:t>
+            </w:r>
+          </w:p>
+        </w:tc>
+        <w:tc>
+          <w:tcPr>
+            <w:tcW w:type="dxa" w:w="1008"/>
+            <w:shd w:val="clear" w:fill="F3F5F8"/>
+          </w:tcPr>
+          <w:p>
+            <w:r/>
+            <w:r>
+              <w:rPr>
+                <w:sz w:val="20"/>
+              </w:rPr>
+              <w:t>—</w:t>
+            </w:r>
+          </w:p>
+        </w:tc>
+      </w:tr>
+      <w:tr>
+        <w:tc>
+          <w:tcPr>
+            <w:tcW w:type="dxa" w:w="2160"/>
+          </w:tcPr>
+          <w:p>
+            <w:r/>
+            <w:r>
+              <w:rPr>
+                <w:b/>
+                <w:sz w:val="20"/>
+              </w:rPr>
+              <w:t>discipline</w:t>
+            </w:r>
+          </w:p>
+        </w:tc>
+        <w:tc>
+          <w:tcPr>
+            <w:tcW w:type="dxa" w:w="6336"/>
+          </w:tcPr>
+          <w:p>
+            <w:r/>
+            <w:r>
+              <w:rPr>
+                <w:sz w:val="20"/>
+              </w:rPr>
+              <w:t>10M AIR PISTOL</w:t>
+            </w:r>
+          </w:p>
+        </w:tc>
+        <w:tc>
+          <w:tcPr>
+            <w:tcW w:type="dxa" w:w="1008"/>
+          </w:tcPr>
+          <w:p>
+            <w:r/>
+            <w:r>
+              <w:rPr>
+                <w:b/>
+                <w:color w:val="C02B20"/>
+                <w:sz w:val="20"/>
+              </w:rPr>
+              <w:t>да</w:t>
+            </w:r>
+          </w:p>
+        </w:tc>
+      </w:tr>
+      <w:tr>
+        <w:tc>
+          <w:tcPr>
+            <w:tcW w:type="dxa" w:w="2160"/>
+            <w:shd w:val="clear" w:fill="F3F5F8"/>
+          </w:tcPr>
+          <w:p>
+            <w:r/>
+            <w:r>
+              <w:rPr>
+                <w:b/>
+                <w:sz w:val="20"/>
+              </w:rPr>
+              <w:t>category</w:t>
+            </w:r>
+          </w:p>
+        </w:tc>
+        <w:tc>
+          <w:tcPr>
+            <w:tcW w:type="dxa" w:w="6336"/>
+            <w:shd w:val="clear" w:fill="F3F5F8"/>
+          </w:tcPr>
+          <w:p>
+            <w:r/>
+            <w:r>
+              <w:rPr>
+                <w:sz w:val="20"/>
+              </w:rPr>
+              <w:t>MEN</w:t>
+            </w:r>
+          </w:p>
+        </w:tc>
+        <w:tc>
+          <w:tcPr>
+            <w:tcW w:type="dxa" w:w="1008"/>
+            <w:shd w:val="clear" w:fill="F3F5F8"/>
+          </w:tcPr>
+          <w:p>
+            <w:r/>
+            <w:r>
+              <w:rPr>
+                <w:b/>
+                <w:color w:val="C02B20"/>
+                <w:sz w:val="20"/>
+              </w:rPr>
+              <w:t>да</w:t>
+            </w:r>
+          </w:p>
+        </w:tc>
+      </w:tr>
+      <w:tr>
+        <w:tc>
+          <w:tcPr>
+            <w:tcW w:type="dxa" w:w="2160"/>
+          </w:tcPr>
+          <w:p>
+            <w:r/>
+            <w:r>
+              <w:rPr>
+                <w:b/>
+                <w:sz w:val="20"/>
+              </w:rPr>
+              <w:t>eventSlug</w:t>
+            </w:r>
+          </w:p>
+        </w:tc>
+        <w:tc>
+          <w:tcPr>
+            <w:tcW w:type="dxa" w:w="6336"/>
+          </w:tcPr>
+          <w:p>
+            <w:r/>
+            <w:r>
+              <w:rPr>
+                <w:sz w:val="20"/>
+              </w:rPr>
+              <w:t>адрес события</w:t>
+            </w:r>
+          </w:p>
+        </w:tc>
+        <w:tc>
+          <w:tcPr>
+            <w:tcW w:type="dxa" w:w="1008"/>
+          </w:tcPr>
+          <w:p>
+            <w:r/>
+            <w:r>
+              <w:rPr>
+                <w:sz w:val="20"/>
+              </w:rPr>
+              <w:t>—</w:t>
+            </w:r>
+          </w:p>
+        </w:tc>
+      </w:tr>
+    </w:tbl>
+    <w:p>
+      <w:pPr>
+        <w:spacing w:after="80"/>
+      </w:pPr>
+    </w:p>
+    <w:p>
+      <w:pPr>
+        <w:pStyle w:val="ListBullet"/>
+        <w:spacing w:after="40"/>
+      </w:pPr>
+      <w:r>
+        <w:rPr>
+          <w:b/>
+        </w:rPr>
+        <w:t xml:space="preserve">shots </w:t>
+      </w:r>
+      <w:r>
+        <w:t>— суммы серий списком строк: ["99","95","98","98","96","97"]. Показываются в строке результата.</w:t>
+      </w:r>
+    </w:p>
+    <w:p>
+      <w:pPr>
+        <w:pStyle w:val="ListBullet"/>
+        <w:spacing w:after="40"/>
+      </w:pPr>
+      <w:r>
+        <w:rPr>
+          <w:b/>
+        </w:rPr>
+        <w:t xml:space="preserve">shotDetail </w:t>
+      </w:r>
+      <w:r>
+        <w:t>— значения отдельных выстрелов: ["10x","9","10x","10", …]. Показываются, когда посетитель раскрывает строку по клику.</w:t>
+      </w:r>
+    </w:p>
+    <w:p>
+      <w:pPr>
+        <w:spacing w:after="120"/>
+      </w:pPr>
+      <w:r>
+        <w:rPr>
+          <w:b w:val="0"/>
+          <w:i w:val="0"/>
+          <w:color w:val="555566"/>
+          <w:sz w:val="22"/>
+        </w:rPr>
+        <w:t>Поля shots и shotDetail необязательны — без них строка всё равно отображается (просто не будет раскрытия по-выстрельно).</w:t>
+      </w:r>
+    </w:p>
+    <w:p>
+      <w:pPr>
+        <w:pStyle w:val="Heading3"/>
+        <w:spacing w:before="160" w:after="20"/>
+      </w:pPr>
+      <w:r>
+        <w:rPr>
+          <w:b/>
+          <w:color w:val="2A2A44"/>
+          <w:sz w:val="23"/>
+        </w:rPr>
+        <w:t>Как создать результат команды</w:t>
+      </w:r>
+    </w:p>
+    <w:p>
+      <w:pPr>
+        <w:spacing w:after="120"/>
+      </w:pPr>
+      <w:r>
+        <w:rPr>
+          <w:b w:val="0"/>
+          <w:i w:val="0"/>
+          <w:sz w:val="22"/>
+        </w:rPr>
+        <w:t>Переключатель isTeam ВКЛЮЧЁН. В athleteName пишется НАЗВАНИЕ КОМАНДЫ, а состав — в поле shots:</w:t>
+      </w:r>
+    </w:p>
+    <w:tbl>
+      <w:tblPr>
+        <w:tblStyle w:val="TableGrid"/>
+        <w:tblW w:type="auto" w:w="0"/>
+        <w:jc w:val="left"/>
+        <w:tblLook w:firstColumn="1" w:firstRow="1" w:lastColumn="0" w:lastRow="0" w:noHBand="0" w:noVBand="1" w:val="04A0"/>
+      </w:tblPr>
+      <w:tblGrid>
+        <w:gridCol w:w="2880"/>
+        <w:gridCol w:w="2880"/>
+        <w:gridCol w:w="2880"/>
+      </w:tblGrid>
+      <w:tr>
+        <w:tc>
+          <w:tcPr>
+            <w:tcW w:type="dxa" w:w="2160"/>
+            <w:shd w:val="clear" w:fill="0B2A4A"/>
+          </w:tcPr>
+          <w:p>
+            <w:r/>
+            <w:r>
+              <w:rPr>
+                <w:b/>
+                <w:color w:val="FFFFFF"/>
+              </w:rPr>
+              <w:t>Поле</w:t>
+            </w:r>
+          </w:p>
+        </w:tc>
+        <w:tc>
+          <w:tcPr>
+            <w:tcW w:type="dxa" w:w="6336"/>
+            <w:shd w:val="clear" w:fill="0B2A4A"/>
+          </w:tcPr>
+          <w:p>
+            <w:r/>
+            <w:r>
+              <w:rPr>
+                <w:b/>
+                <w:color w:val="FFFFFF"/>
+              </w:rPr>
+              <w:t>Что вписывать</w:t>
+            </w:r>
+          </w:p>
+        </w:tc>
+        <w:tc>
+          <w:tcPr>
+            <w:tcW w:type="dxa" w:w="1008"/>
+            <w:shd w:val="clear" w:fill="0B2A4A"/>
+          </w:tcPr>
+          <w:p>
+            <w:r/>
+            <w:r>
+              <w:rPr>
+                <w:b/>
+                <w:color w:val="FFFFFF"/>
+              </w:rPr>
+              <w:t>Обяз.</w:t>
+            </w:r>
+          </w:p>
+        </w:tc>
+      </w:tr>
+      <w:tr>
+        <w:tc>
+          <w:tcPr>
+            <w:tcW w:type="dxa" w:w="2160"/>
+          </w:tcPr>
+          <w:p>
+            <w:r/>
+            <w:r>
+              <w:rPr>
+                <w:b/>
+                <w:sz w:val="20"/>
+              </w:rPr>
+              <w:t>isTeam</w:t>
+            </w:r>
+          </w:p>
+        </w:tc>
+        <w:tc>
+          <w:tcPr>
+            <w:tcW w:type="dxa" w:w="6336"/>
+          </w:tcPr>
+          <w:p>
+            <w:r/>
+            <w:r>
+              <w:rPr>
+                <w:sz w:val="20"/>
+              </w:rPr>
+              <w:t>включён</w:t>
+            </w:r>
+          </w:p>
+        </w:tc>
+        <w:tc>
+          <w:tcPr>
+            <w:tcW w:type="dxa" w:w="1008"/>
+          </w:tcPr>
+          <w:p>
+            <w:r/>
+            <w:r>
+              <w:rPr>
+                <w:sz w:val="20"/>
+              </w:rPr>
+              <w:t>—</w:t>
+            </w:r>
+          </w:p>
+        </w:tc>
+      </w:tr>
+      <w:tr>
+        <w:tc>
+          <w:tcPr>
+            <w:tcW w:type="dxa" w:w="2160"/>
+            <w:shd w:val="clear" w:fill="F3F5F8"/>
+          </w:tcPr>
+          <w:p>
+            <w:r/>
+            <w:r>
+              <w:rPr>
+                <w:b/>
+                <w:sz w:val="20"/>
+              </w:rPr>
+              <w:t>position</w:t>
+            </w:r>
+          </w:p>
+        </w:tc>
+        <w:tc>
+          <w:tcPr>
+            <w:tcW w:type="dxa" w:w="6336"/>
+            <w:shd w:val="clear" w:fill="F3F5F8"/>
+          </w:tcPr>
+          <w:p>
+            <w:r/>
+            <w:r>
+              <w:rPr>
+                <w:sz w:val="20"/>
+              </w:rPr>
+              <w:t>1</w:t>
+            </w:r>
+          </w:p>
+        </w:tc>
+        <w:tc>
+          <w:tcPr>
+            <w:tcW w:type="dxa" w:w="1008"/>
+            <w:shd w:val="clear" w:fill="F3F5F8"/>
+          </w:tcPr>
+          <w:p>
+            <w:r/>
+            <w:r>
+              <w:rPr>
+                <w:b/>
+                <w:color w:val="C02B20"/>
+                <w:sz w:val="20"/>
+              </w:rPr>
+              <w:t>да</w:t>
+            </w:r>
+          </w:p>
+        </w:tc>
+      </w:tr>
+      <w:tr>
+        <w:tc>
+          <w:tcPr>
+            <w:tcW w:type="dxa" w:w="2160"/>
+          </w:tcPr>
+          <w:p>
+            <w:r/>
+            <w:r>
+              <w:rPr>
+                <w:b/>
+                <w:sz w:val="20"/>
+              </w:rPr>
+              <w:t>athleteName</w:t>
+            </w:r>
+          </w:p>
+        </w:tc>
+        <w:tc>
+          <w:tcPr>
+            <w:tcW w:type="dxa" w:w="6336"/>
+          </w:tcPr>
+          <w:p>
+            <w:r/>
+            <w:r>
+              <w:rPr>
+                <w:sz w:val="20"/>
+              </w:rPr>
+              <w:t>Hungary 2  (название команды)</w:t>
+            </w:r>
+          </w:p>
+        </w:tc>
+        <w:tc>
+          <w:tcPr>
+            <w:tcW w:type="dxa" w:w="1008"/>
+          </w:tcPr>
+          <w:p>
+            <w:r/>
+            <w:r>
+              <w:rPr>
+                <w:b/>
+                <w:color w:val="C02B20"/>
+                <w:sz w:val="20"/>
+              </w:rPr>
+              <w:t>да</w:t>
+            </w:r>
+          </w:p>
+        </w:tc>
+      </w:tr>
+      <w:tr>
+        <w:tc>
+          <w:tcPr>
+            <w:tcW w:type="dxa" w:w="2160"/>
+            <w:shd w:val="clear" w:fill="F3F5F8"/>
+          </w:tcPr>
+          <w:p>
+            <w:r/>
+            <w:r>
+              <w:rPr>
+                <w:b/>
+                <w:sz w:val="20"/>
+              </w:rPr>
+              <w:t>federationCode</w:t>
+            </w:r>
+          </w:p>
+        </w:tc>
+        <w:tc>
+          <w:tcPr>
+            <w:tcW w:type="dxa" w:w="6336"/>
+            <w:shd w:val="clear" w:fill="F3F5F8"/>
+          </w:tcPr>
+          <w:p>
+            <w:r/>
+            <w:r>
+              <w:rPr>
+                <w:sz w:val="20"/>
+              </w:rPr>
+              <w:t>HUN</w:t>
+            </w:r>
+          </w:p>
+        </w:tc>
+        <w:tc>
+          <w:tcPr>
+            <w:tcW w:type="dxa" w:w="1008"/>
+            <w:shd w:val="clear" w:fill="F3F5F8"/>
+          </w:tcPr>
+          <w:p>
+            <w:r/>
+            <w:r>
+              <w:rPr>
+                <w:b/>
+                <w:color w:val="C02B20"/>
+                <w:sz w:val="20"/>
+              </w:rPr>
+              <w:t>да</w:t>
+            </w:r>
+          </w:p>
+        </w:tc>
+      </w:tr>
+      <w:tr>
+        <w:tc>
+          <w:tcPr>
+            <w:tcW w:type="dxa" w:w="2160"/>
+          </w:tcPr>
+          <w:p>
+            <w:r/>
+            <w:r>
+              <w:rPr>
+                <w:b/>
+                <w:sz w:val="20"/>
+              </w:rPr>
+              <w:t>total</w:t>
+            </w:r>
+          </w:p>
+        </w:tc>
+        <w:tc>
+          <w:tcPr>
+            <w:tcW w:type="dxa" w:w="6336"/>
+          </w:tcPr>
+          <w:p>
+            <w:r/>
+            <w:r>
+              <w:rPr>
+                <w:sz w:val="20"/>
+              </w:rPr>
+              <w:t>631.6</w:t>
+            </w:r>
+          </w:p>
+        </w:tc>
+        <w:tc>
+          <w:tcPr>
+            <w:tcW w:type="dxa" w:w="1008"/>
+          </w:tcPr>
+          <w:p>
+            <w:r/>
+            <w:r>
+              <w:rPr>
+                <w:b/>
+                <w:color w:val="C02B20"/>
+                <w:sz w:val="20"/>
+              </w:rPr>
+              <w:t>да</w:t>
+            </w:r>
+          </w:p>
+        </w:tc>
+      </w:tr>
+      <w:tr>
+        <w:tc>
+          <w:tcPr>
+            <w:tcW w:type="dxa" w:w="2160"/>
+            <w:shd w:val="clear" w:fill="F3F5F8"/>
+          </w:tcPr>
+          <w:p>
+            <w:r/>
+            <w:r>
+              <w:rPr>
+                <w:b/>
+                <w:sz w:val="20"/>
+              </w:rPr>
+              <w:t>discipline</w:t>
+            </w:r>
+          </w:p>
+        </w:tc>
+        <w:tc>
+          <w:tcPr>
+            <w:tcW w:type="dxa" w:w="6336"/>
+            <w:shd w:val="clear" w:fill="F3F5F8"/>
+          </w:tcPr>
+          <w:p>
+            <w:r/>
+            <w:r>
+              <w:rPr>
+                <w:sz w:val="20"/>
+              </w:rPr>
+              <w:t>10M AIR RIFLE</w:t>
+            </w:r>
+          </w:p>
+        </w:tc>
+        <w:tc>
+          <w:tcPr>
+            <w:tcW w:type="dxa" w:w="1008"/>
+            <w:shd w:val="clear" w:fill="F3F5F8"/>
+          </w:tcPr>
+          <w:p>
+            <w:r/>
+            <w:r>
+              <w:rPr>
+                <w:b/>
+                <w:color w:val="C02B20"/>
+                <w:sz w:val="20"/>
+              </w:rPr>
+              <w:t>да</w:t>
+            </w:r>
+          </w:p>
+        </w:tc>
+      </w:tr>
+      <w:tr>
+        <w:tc>
+          <w:tcPr>
+            <w:tcW w:type="dxa" w:w="2160"/>
+          </w:tcPr>
+          <w:p>
+            <w:r/>
+            <w:r>
+              <w:rPr>
+                <w:b/>
+                <w:sz w:val="20"/>
+              </w:rPr>
+              <w:t>subDiscipline</w:t>
+            </w:r>
+          </w:p>
+        </w:tc>
+        <w:tc>
+          <w:tcPr>
+            <w:tcW w:type="dxa" w:w="6336"/>
+          </w:tcPr>
+          <w:p>
+            <w:r/>
+            <w:r>
+              <w:rPr>
+                <w:sz w:val="20"/>
+              </w:rPr>
+              <w:t>10m AIR RIFLE MIXED TEAM — Qualification</w:t>
+            </w:r>
+          </w:p>
+        </w:tc>
+        <w:tc>
+          <w:tcPr>
+            <w:tcW w:type="dxa" w:w="1008"/>
+          </w:tcPr>
+          <w:p>
+            <w:r/>
+            <w:r>
+              <w:rPr>
+                <w:sz w:val="20"/>
+              </w:rPr>
+              <w:t>—</w:t>
+            </w:r>
+          </w:p>
+        </w:tc>
+      </w:tr>
+      <w:tr>
+        <w:tc>
+          <w:tcPr>
+            <w:tcW w:type="dxa" w:w="2160"/>
+            <w:shd w:val="clear" w:fill="F3F5F8"/>
+          </w:tcPr>
+          <w:p>
+            <w:r/>
+            <w:r>
+              <w:rPr>
+                <w:b/>
+                <w:sz w:val="20"/>
+              </w:rPr>
+              <w:t>category</w:t>
+            </w:r>
+          </w:p>
+        </w:tc>
+        <w:tc>
+          <w:tcPr>
+            <w:tcW w:type="dxa" w:w="6336"/>
+            <w:shd w:val="clear" w:fill="F3F5F8"/>
+          </w:tcPr>
+          <w:p>
+            <w:r/>
+            <w:r>
+              <w:rPr>
+                <w:sz w:val="20"/>
+              </w:rPr>
+              <w:t>ALL</w:t>
+            </w:r>
+          </w:p>
+        </w:tc>
+        <w:tc>
+          <w:tcPr>
+            <w:tcW w:type="dxa" w:w="1008"/>
+            <w:shd w:val="clear" w:fill="F3F5F8"/>
+          </w:tcPr>
+          <w:p>
+            <w:r/>
+            <w:r>
+              <w:rPr>
+                <w:b/>
+                <w:color w:val="C02B20"/>
+                <w:sz w:val="20"/>
+              </w:rPr>
+              <w:t>да</w:t>
+            </w:r>
+          </w:p>
+        </w:tc>
+      </w:tr>
+      <w:tr>
+        <w:tc>
+          <w:tcPr>
+            <w:tcW w:type="dxa" w:w="2160"/>
+          </w:tcPr>
+          <w:p>
+            <w:r/>
+            <w:r>
+              <w:rPr>
+                <w:b/>
+                <w:sz w:val="20"/>
+              </w:rPr>
+              <w:t>shots</w:t>
+            </w:r>
+          </w:p>
+        </w:tc>
+        <w:tc>
+          <w:tcPr>
+            <w:tcW w:type="dxa" w:w="6336"/>
+          </w:tcPr>
+          <w:p>
+            <w:r/>
+            <w:r>
+              <w:rPr>
+                <w:sz w:val="20"/>
+              </w:rPr>
+              <w:t>["MESZAROS Eszter","PEKLER Zalan"]  — имена участников</w:t>
+            </w:r>
+          </w:p>
+        </w:tc>
+        <w:tc>
+          <w:tcPr>
+            <w:tcW w:type="dxa" w:w="1008"/>
+          </w:tcPr>
+          <w:p>
+            <w:r/>
+            <w:r>
+              <w:rPr>
+                <w:sz w:val="20"/>
+              </w:rPr>
+              <w:t>—</w:t>
+            </w:r>
+          </w:p>
+        </w:tc>
+      </w:tr>
+    </w:tbl>
+    <w:p>
+      <w:pPr>
+        <w:spacing w:after="80"/>
+      </w:pPr>
+    </w:p>
+    <w:p>
+      <w:pPr>
+        <w:spacing w:after="120"/>
+      </w:pPr>
+      <w:r>
+        <w:rPr>
+          <w:b/>
+          <w:color w:val="0A7E8C"/>
+        </w:rPr>
+        <w:t xml:space="preserve">Ключевое отличие команды: </w:t>
+      </w:r>
+      <w:r>
+        <w:t>у командной строки поле shots — это СОСТАВ (список имён участников), и на сайте он показывается в колонке «MEMBERS». Поле shotDetail у команд оставляют пустым.</w:t>
+      </w:r>
+    </w:p>
+    <w:p>
+      <w:pPr>
+        <w:pStyle w:val="Heading3"/>
+        <w:spacing w:before="160" w:after="20"/>
+      </w:pPr>
+      <w:r>
+        <w:rPr>
+          <w:b/>
+          <w:color w:val="2A2A44"/>
+          <w:sz w:val="23"/>
+        </w:rPr>
+        <w:t>Зачем нужен externalId</w:t>
+      </w:r>
+    </w:p>
+    <w:p>
+      <w:pPr>
+        <w:spacing w:after="120"/>
+      </w:pPr>
+      <w:r>
+        <w:rPr>
+          <w:b w:val="0"/>
+          <w:i w:val="0"/>
+          <w:sz w:val="22"/>
+        </w:rPr>
+        <w:t>Это служебный уникальный идентификатор строки. При импорте из SIUS каждой строке присваивается автоматический ключ (вида «sius:…:Individual:…» для одиночных и «…:TeamOfIndividuals:…» для командных). Он нужен, чтобы при повторном импорте система ОБНОВЛЯЛА уже существующую строку, а не создавала дубликат. На сайте externalId не отображается.</w:t>
+      </w:r>
+    </w:p>
+    <w:p>
+      <w:pPr>
+        <w:pStyle w:val="ListBullet"/>
+        <w:spacing w:after="40"/>
+      </w:pPr>
+      <w:r>
+        <w:rPr>
+          <w:b/>
+        </w:rPr>
+        <w:t xml:space="preserve">При ручном вводе </w:t>
+      </w:r>
+      <w:r>
+        <w:t>— поле можно оставить пустым.</w:t>
+      </w:r>
+    </w:p>
+    <w:p>
+      <w:pPr>
+        <w:pStyle w:val="ListBullet"/>
+        <w:spacing w:after="40"/>
+      </w:pPr>
+      <w:r>
+        <w:rPr>
+          <w:b/>
+        </w:rPr>
+        <w:t xml:space="preserve">Если вводите вручную и хотите защититься от дублей </w:t>
+      </w:r>
+      <w:r>
+        <w:t>— впишите любое своё уникальное значение (например, «событие-дисциплина-место»); повторное сохранение с тем же externalId обновит строку, а не добавит вторую.</w:t>
+      </w:r>
     </w:p>
     <w:p>
       <w:pPr>

</xml_diff>